<commit_message>
Complete live Foundry workflow implementation
</commit_message>
<xml_diff>
--- a/final/RecallGuard_AI_Build_Report_Somi.docx
+++ b/final/RecallGuard_AI_Build_Report_Somi.docx
@@ -387,7 +387,7 @@
                 <w:color w:val="000000"/>
                 <w:sz w:val="18"/>
               </w:rPr>
-              <w:t>recallguard-task-agent-v5</w:t>
+              <w:t>recallguard-task-agent-v6</w:t>
             </w:r>
           </w:p>
         </w:tc>
@@ -802,7 +802,7 @@
                 <w:color w:val="000000"/>
                 <w:sz w:val="18"/>
               </w:rPr>
-              <w:t>recallguard-task-agent-v5 with Code Interpreter</w:t>
+              <w:t>recallguard-task-agent-v6 with Code Interpreter</w:t>
             </w:r>
           </w:p>
         </w:tc>
@@ -885,7 +885,7 @@
                 <w:color w:val="000000"/>
                 <w:sz w:val="18"/>
               </w:rPr>
-              <w:t>recallguard-governed-workflow-v2</w:t>
+              <w:t>recallguard-governed-workflow-v4</w:t>
             </w:r>
           </w:p>
         </w:tc>
@@ -1372,7 +1372,7 @@
                 <w:color w:val="000000"/>
                 <w:sz w:val="18"/>
               </w:rPr>
-              <w:t>recallguard-task-agent-v5</w:t>
+              <w:t>recallguard-task-agent-v6</w:t>
             </w:r>
           </w:p>
         </w:tc>
@@ -1482,7 +1482,7 @@
                 <w:color w:val="000000"/>
                 <w:sz w:val="18"/>
               </w:rPr>
-              <w:t>recallguard-governed-workflow-v2</w:t>
+              <w:t>recallguard-governed-workflow-v4</w:t>
             </w:r>
           </w:p>
         </w:tc>
@@ -4131,7 +4131,7 @@
                 <w:color w:val="000000"/>
                 <w:sz w:val="18"/>
               </w:rPr>
-              <w:t>0883e31b-d2aa-416f-9a5b-01638e011aaf</w:t>
+              <w:t>d1162a8f-7e1c-4b38-828b-63314cf4427f</w:t>
             </w:r>
           </w:p>
         </w:tc>
@@ -4187,7 +4187,7 @@
                 <w:color w:val="000000"/>
                 <w:sz w:val="18"/>
               </w:rPr>
-              <w:t>Workflow v2 principal</w:t>
+              <w:t>Workflow v4 principal</w:t>
             </w:r>
           </w:p>
         </w:tc>
@@ -4214,7 +4214,7 @@
                 <w:color w:val="000000"/>
                 <w:sz w:val="18"/>
               </w:rPr>
-              <w:t>10ac3c72-43e8-4872-8859-0f0d06f55550</w:t>
+              <w:t>b8dc7597-2773-4573-a08a-f8b76c9d0421</w:t>
             </w:r>
           </w:p>
         </w:tc>
@@ -4551,7 +4551,7 @@
                 <w:color w:val="000000"/>
                 <w:sz w:val="18"/>
               </w:rPr>
-              <w:t>recallguard-task-agent-v5 with Code Interpreter and checker script</w:t>
+              <w:t>recallguard-task-agent-v6 with Code Interpreter and checker script</w:t>
             </w:r>
           </w:p>
         </w:tc>
@@ -4634,7 +4634,7 @@
                 <w:color w:val="000000"/>
                 <w:sz w:val="18"/>
               </w:rPr>
-              <w:t>recallguard-governed-workflow-v2 created; visual portal Preview recommended</w:t>
+              <w:t>recallguard-governed-workflow-v4 created; visual portal Preview recommended</w:t>
             </w:r>
           </w:p>
         </w:tc>

</xml_diff>

<commit_message>
Add public KATS recall dataset workflow
</commit_message>
<xml_diff>
--- a/final/RecallGuard_AI_Build_Report_Somi.docx
+++ b/final/RecallGuard_AI_Build_Report_Somi.docx
@@ -387,7 +387,7 @@
                 <w:color w:val="000000"/>
                 <w:sz w:val="18"/>
               </w:rPr>
-              <w:t>recallguard-task-agent-v6</w:t>
+              <w:t>recallguard-task-agent-v7-public-data</w:t>
             </w:r>
           </w:p>
         </w:tc>
@@ -802,7 +802,7 @@
                 <w:color w:val="000000"/>
                 <w:sz w:val="18"/>
               </w:rPr>
-              <w:t>recallguard-task-agent-v6 with Code Interpreter</w:t>
+              <w:t>recallguard-task-agent-v7-public-data with Code Interpreter</w:t>
             </w:r>
           </w:p>
         </w:tc>
@@ -885,7 +885,7 @@
                 <w:color w:val="000000"/>
                 <w:sz w:val="18"/>
               </w:rPr>
-              <w:t>recallguard-governed-workflow-v4</w:t>
+              <w:t>recallguard-governed-workflow-v5-public-data</w:t>
             </w:r>
           </w:p>
         </w:tc>
@@ -1372,7 +1372,7 @@
                 <w:color w:val="000000"/>
                 <w:sz w:val="18"/>
               </w:rPr>
-              <w:t>recallguard-task-agent-v6</w:t>
+              <w:t>recallguard-task-agent-v7-public-data</w:t>
             </w:r>
           </w:p>
         </w:tc>
@@ -1482,7 +1482,7 @@
                 <w:color w:val="000000"/>
                 <w:sz w:val="18"/>
               </w:rPr>
-              <w:t>recallguard-governed-workflow-v4</w:t>
+              <w:t>recallguard-governed-workflow-v5-public-data</w:t>
             </w:r>
           </w:p>
         </w:tc>
@@ -1900,6 +1900,398 @@
                 <w:sz w:val="18"/>
               </w:rPr>
               <w:t>Vendor fields and untrusted content rule</w:t>
+            </w:r>
+          </w:p>
+        </w:tc>
+      </w:tr>
+    </w:tbl>
+    <w:p/>
+    <w:p>
+      <w:pPr>
+        <w:spacing w:before="280" w:after="120" w:line="264" w:lineRule="auto"/>
+      </w:pPr>
+      <w:r>
+        <w:rPr>
+          <w:rFonts w:ascii="Calibri" w:hAnsi="Calibri"/>
+          <w:b/>
+          <w:i w:val="0"/>
+          <w:color w:val="2E74B5"/>
+          <w:sz w:val="32"/>
+        </w:rPr>
+        <w:t>4.1 Public Dataset Setup</w:t>
+      </w:r>
+    </w:p>
+    <w:p>
+      <w:pPr>
+        <w:spacing w:before="0" w:after="120" w:line="264" w:lineRule="auto"/>
+      </w:pPr>
+      <w:r>
+        <w:rPr>
+          <w:rFonts w:ascii="Calibri" w:hAnsi="Calibri"/>
+          <w:b w:val="0"/>
+          <w:i w:val="0"/>
+          <w:color w:val="000000"/>
+          <w:sz w:val="22"/>
+        </w:rPr>
+        <w:t>RecallGuard also uses the Korea Data Portal dataset 산업통상부_국가기술표준원_제품안전_국내리콜정보 from the Ministry of Trade, Industry and Energy / Korean Agency for Technology and Standards. The raw CP949 CSV was downloaded from data.go.kr, normalized to UTF-8, and converted into the evidence schema used by the Task Agent.</w:t>
+      </w:r>
+    </w:p>
+    <w:tbl>
+      <w:tblPr>
+        <w:tblW w:type="auto" w:w="0"/>
+        <w:jc w:val="center"/>
+        <w:tblLayout w:type="fixed"/>
+        <w:tblLook w:firstColumn="1" w:firstRow="1" w:lastColumn="0" w:lastRow="0" w:noHBand="0" w:noVBand="1" w:val="04A0"/>
+        <w:tblBorders>
+          <w:top w:val="single" w:sz="6" w:space="0" w:color="DADCE0"/>
+          <w:left w:val="single" w:sz="6" w:space="0" w:color="DADCE0"/>
+          <w:bottom w:val="single" w:sz="6" w:space="0" w:color="DADCE0"/>
+          <w:right w:val="single" w:sz="6" w:space="0" w:color="DADCE0"/>
+          <w:insideH w:val="single" w:sz="6" w:space="0" w:color="DADCE0"/>
+          <w:insideV w:val="single" w:sz="6" w:space="0" w:color="DADCE0"/>
+        </w:tblBorders>
+      </w:tblPr>
+      <w:tblGrid>
+        <w:gridCol w:w="4896"/>
+        <w:gridCol w:w="4896"/>
+      </w:tblGrid>
+      <w:tr>
+        <w:trPr>
+          <w:tblHeader w:val="true"/>
+        </w:trPr>
+        <w:tc>
+          <w:tcPr>
+            <w:tcW w:type="dxa" w:w="2592"/>
+            <w:shd w:fill="F2F4F7"/>
+            <w:tcMar>
+              <w:top w:w="100" w:type="dxa"/>
+              <w:start w:w="120" w:type="dxa"/>
+              <w:bottom w:w="100" w:type="dxa"/>
+              <w:end w:w="120" w:type="dxa"/>
+            </w:tcMar>
+            <w:vAlign w:val="center"/>
+          </w:tcPr>
+          <w:p>
+            <w:pPr>
+              <w:spacing w:before="0" w:after="0" w:line="264" w:lineRule="auto"/>
+            </w:pPr>
+            <w:r>
+              <w:rPr>
+                <w:rFonts w:ascii="Calibri" w:hAnsi="Calibri"/>
+                <w:b/>
+                <w:i w:val="0"/>
+                <w:color w:val="0B2545"/>
+                <w:sz w:val="19"/>
+              </w:rPr>
+              <w:t>Dataset evidence</w:t>
+            </w:r>
+          </w:p>
+        </w:tc>
+        <w:tc>
+          <w:tcPr>
+            <w:tcW w:type="dxa" w:w="6480"/>
+            <w:shd w:fill="F2F4F7"/>
+            <w:tcMar>
+              <w:top w:w="100" w:type="dxa"/>
+              <w:start w:w="120" w:type="dxa"/>
+              <w:bottom w:w="100" w:type="dxa"/>
+              <w:end w:w="120" w:type="dxa"/>
+            </w:tcMar>
+            <w:vAlign w:val="center"/>
+          </w:tcPr>
+          <w:p>
+            <w:pPr>
+              <w:spacing w:before="0" w:after="0" w:line="264" w:lineRule="auto"/>
+            </w:pPr>
+            <w:r>
+              <w:rPr>
+                <w:rFonts w:ascii="Calibri" w:hAnsi="Calibri"/>
+                <w:b/>
+                <w:i w:val="0"/>
+                <w:color w:val="0B2545"/>
+                <w:sz w:val="19"/>
+              </w:rPr>
+              <w:t>Value</w:t>
+            </w:r>
+          </w:p>
+        </w:tc>
+      </w:tr>
+      <w:tr>
+        <w:tc>
+          <w:tcPr>
+            <w:tcW w:type="dxa" w:w="2592"/>
+            <w:tcMar>
+              <w:top w:w="90" w:type="dxa"/>
+              <w:start w:w="120" w:type="dxa"/>
+              <w:bottom w:w="90" w:type="dxa"/>
+              <w:end w:w="120" w:type="dxa"/>
+            </w:tcMar>
+            <w:vAlign w:val="center"/>
+          </w:tcPr>
+          <w:p>
+            <w:pPr>
+              <w:spacing w:before="0" w:after="0" w:line="252" w:lineRule="auto"/>
+            </w:pPr>
+            <w:r>
+              <w:rPr>
+                <w:rFonts w:ascii="Calibri" w:hAnsi="Calibri"/>
+                <w:b w:val="0"/>
+                <w:i w:val="0"/>
+                <w:color w:val="000000"/>
+                <w:sz w:val="18"/>
+              </w:rPr>
+              <w:t>Detail page</w:t>
+            </w:r>
+          </w:p>
+        </w:tc>
+        <w:tc>
+          <w:tcPr>
+            <w:tcW w:type="dxa" w:w="6480"/>
+            <w:tcMar>
+              <w:top w:w="90" w:type="dxa"/>
+              <w:start w:w="120" w:type="dxa"/>
+              <w:bottom w:w="90" w:type="dxa"/>
+              <w:end w:w="120" w:type="dxa"/>
+            </w:tcMar>
+            <w:vAlign w:val="center"/>
+          </w:tcPr>
+          <w:p>
+            <w:pPr>
+              <w:spacing w:before="0" w:after="0" w:line="252" w:lineRule="auto"/>
+            </w:pPr>
+            <w:r>
+              <w:rPr>
+                <w:rFonts w:ascii="Calibri" w:hAnsi="Calibri"/>
+                <w:b w:val="0"/>
+                <w:i w:val="0"/>
+                <w:color w:val="000000"/>
+                <w:sz w:val="18"/>
+              </w:rPr>
+              <w:t>https://www.data.go.kr/data/15040696/fileData.do</w:t>
+            </w:r>
+          </w:p>
+        </w:tc>
+      </w:tr>
+      <w:tr>
+        <w:tc>
+          <w:tcPr>
+            <w:tcW w:type="dxa" w:w="2592"/>
+            <w:tcMar>
+              <w:top w:w="90" w:type="dxa"/>
+              <w:start w:w="120" w:type="dxa"/>
+              <w:bottom w:w="90" w:type="dxa"/>
+              <w:end w:w="120" w:type="dxa"/>
+            </w:tcMar>
+            <w:vAlign w:val="center"/>
+          </w:tcPr>
+          <w:p>
+            <w:pPr>
+              <w:spacing w:before="0" w:after="0" w:line="252" w:lineRule="auto"/>
+            </w:pPr>
+            <w:r>
+              <w:rPr>
+                <w:rFonts w:ascii="Calibri" w:hAnsi="Calibri"/>
+                <w:b w:val="0"/>
+                <w:i w:val="0"/>
+                <w:color w:val="000000"/>
+                <w:sz w:val="18"/>
+              </w:rPr>
+              <w:t>Raw file</w:t>
+            </w:r>
+          </w:p>
+        </w:tc>
+        <w:tc>
+          <w:tcPr>
+            <w:tcW w:type="dxa" w:w="6480"/>
+            <w:tcMar>
+              <w:top w:w="90" w:type="dxa"/>
+              <w:start w:w="120" w:type="dxa"/>
+              <w:bottom w:w="90" w:type="dxa"/>
+              <w:end w:w="120" w:type="dxa"/>
+            </w:tcMar>
+            <w:vAlign w:val="center"/>
+          </w:tcPr>
+          <w:p>
+            <w:pPr>
+              <w:spacing w:before="0" w:after="0" w:line="252" w:lineRule="auto"/>
+            </w:pPr>
+            <w:r>
+              <w:rPr>
+                <w:rFonts w:ascii="Calibri" w:hAnsi="Calibri"/>
+                <w:b w:val="0"/>
+                <w:i w:val="0"/>
+                <w:color w:val="000000"/>
+                <w:sz w:val="18"/>
+              </w:rPr>
+              <w:t>data/raw/kats_product_safety_domestic_recall_20230809.csv</w:t>
+            </w:r>
+          </w:p>
+        </w:tc>
+      </w:tr>
+      <w:tr>
+        <w:tc>
+          <w:tcPr>
+            <w:tcW w:type="dxa" w:w="2592"/>
+            <w:tcMar>
+              <w:top w:w="90" w:type="dxa"/>
+              <w:start w:w="120" w:type="dxa"/>
+              <w:bottom w:w="90" w:type="dxa"/>
+              <w:end w:w="120" w:type="dxa"/>
+            </w:tcMar>
+            <w:vAlign w:val="center"/>
+          </w:tcPr>
+          <w:p>
+            <w:pPr>
+              <w:spacing w:before="0" w:after="0" w:line="252" w:lineRule="auto"/>
+            </w:pPr>
+            <w:r>
+              <w:rPr>
+                <w:rFonts w:ascii="Calibri" w:hAnsi="Calibri"/>
+                <w:b w:val="0"/>
+                <w:i w:val="0"/>
+                <w:color w:val="000000"/>
+                <w:sz w:val="18"/>
+              </w:rPr>
+              <w:t>Normalized file</w:t>
+            </w:r>
+          </w:p>
+        </w:tc>
+        <w:tc>
+          <w:tcPr>
+            <w:tcW w:type="dxa" w:w="6480"/>
+            <w:tcMar>
+              <w:top w:w="90" w:type="dxa"/>
+              <w:start w:w="120" w:type="dxa"/>
+              <w:bottom w:w="90" w:type="dxa"/>
+              <w:end w:w="120" w:type="dxa"/>
+            </w:tcMar>
+            <w:vAlign w:val="center"/>
+          </w:tcPr>
+          <w:p>
+            <w:pPr>
+              <w:spacing w:before="0" w:after="0" w:line="252" w:lineRule="auto"/>
+            </w:pPr>
+            <w:r>
+              <w:rPr>
+                <w:rFonts w:ascii="Calibri" w:hAnsi="Calibri"/>
+                <w:b w:val="0"/>
+                <w:i w:val="0"/>
+                <w:color w:val="000000"/>
+                <w:sz w:val="18"/>
+              </w:rPr>
+              <w:t>data/processed/kats_domestic_recall_normalized.csv</w:t>
+            </w:r>
+          </w:p>
+        </w:tc>
+      </w:tr>
+      <w:tr>
+        <w:tc>
+          <w:tcPr>
+            <w:tcW w:type="dxa" w:w="2592"/>
+            <w:tcMar>
+              <w:top w:w="90" w:type="dxa"/>
+              <w:start w:w="120" w:type="dxa"/>
+              <w:bottom w:w="90" w:type="dxa"/>
+              <w:end w:w="120" w:type="dxa"/>
+            </w:tcMar>
+            <w:vAlign w:val="center"/>
+          </w:tcPr>
+          <w:p>
+            <w:pPr>
+              <w:spacing w:before="0" w:after="0" w:line="252" w:lineRule="auto"/>
+            </w:pPr>
+            <w:r>
+              <w:rPr>
+                <w:rFonts w:ascii="Calibri" w:hAnsi="Calibri"/>
+                <w:b w:val="0"/>
+                <w:i w:val="0"/>
+                <w:color w:val="000000"/>
+                <w:sz w:val="18"/>
+              </w:rPr>
+              <w:t>Rows</w:t>
+            </w:r>
+          </w:p>
+        </w:tc>
+        <w:tc>
+          <w:tcPr>
+            <w:tcW w:type="dxa" w:w="6480"/>
+            <w:tcMar>
+              <w:top w:w="90" w:type="dxa"/>
+              <w:start w:w="120" w:type="dxa"/>
+              <w:bottom w:w="90" w:type="dxa"/>
+              <w:end w:w="120" w:type="dxa"/>
+            </w:tcMar>
+            <w:vAlign w:val="center"/>
+          </w:tcPr>
+          <w:p>
+            <w:pPr>
+              <w:spacing w:before="0" w:after="0" w:line="252" w:lineRule="auto"/>
+            </w:pPr>
+            <w:r>
+              <w:rPr>
+                <w:rFonts w:ascii="Calibri" w:hAnsi="Calibri"/>
+                <w:b w:val="0"/>
+                <w:i w:val="0"/>
+                <w:color w:val="000000"/>
+                <w:sz w:val="18"/>
+              </w:rPr>
+              <w:t>881</w:t>
+            </w:r>
+          </w:p>
+        </w:tc>
+      </w:tr>
+      <w:tr>
+        <w:tc>
+          <w:tcPr>
+            <w:tcW w:type="dxa" w:w="2592"/>
+            <w:tcMar>
+              <w:top w:w="90" w:type="dxa"/>
+              <w:start w:w="120" w:type="dxa"/>
+              <w:bottom w:w="90" w:type="dxa"/>
+              <w:end w:w="120" w:type="dxa"/>
+            </w:tcMar>
+            <w:vAlign w:val="center"/>
+          </w:tcPr>
+          <w:p>
+            <w:pPr>
+              <w:spacing w:before="0" w:after="0" w:line="252" w:lineRule="auto"/>
+            </w:pPr>
+            <w:r>
+              <w:rPr>
+                <w:rFonts w:ascii="Calibri" w:hAnsi="Calibri"/>
+                <w:b w:val="0"/>
+                <w:i w:val="0"/>
+                <w:color w:val="000000"/>
+                <w:sz w:val="18"/>
+              </w:rPr>
+              <w:t>Foundry snapshot</w:t>
+            </w:r>
+          </w:p>
+        </w:tc>
+        <w:tc>
+          <w:tcPr>
+            <w:tcW w:type="dxa" w:w="6480"/>
+            <w:tcMar>
+              <w:top w:w="90" w:type="dxa"/>
+              <w:start w:w="120" w:type="dxa"/>
+              <w:bottom w:w="90" w:type="dxa"/>
+              <w:end w:w="120" w:type="dxa"/>
+            </w:tcMar>
+            <w:vAlign w:val="center"/>
+          </w:tcPr>
+          <w:p>
+            <w:pPr>
+              <w:spacing w:before="0" w:after="0" w:line="252" w:lineRule="auto"/>
+            </w:pPr>
+            <w:r>
+              <w:rPr>
+                <w:rFonts w:ascii="Calibri" w:hAnsi="Calibri"/>
+                <w:b w:val="0"/>
+                <w:i w:val="0"/>
+                <w:color w:val="000000"/>
+                <w:sz w:val="18"/>
+              </w:rPr>
+              <w:t>First 30 public recall rows appended to sample-data/recall_certification_snapshot.csv</w:t>
             </w:r>
           </w:p>
         </w:tc>
@@ -2678,6 +3070,116 @@
                 <w:color w:val="000000"/>
                 <w:sz w:val="18"/>
               </w:rPr>
+              <w:t>Public KATS recall match</w:t>
+            </w:r>
+          </w:p>
+        </w:tc>
+        <w:tc>
+          <w:tcPr>
+            <w:tcW w:type="dxa" w:w="2376"/>
+            <w:tcMar>
+              <w:top w:w="90" w:type="dxa"/>
+              <w:start w:w="120" w:type="dxa"/>
+              <w:bottom w:w="90" w:type="dxa"/>
+              <w:end w:w="120" w:type="dxa"/>
+            </w:tcMar>
+            <w:vAlign w:val="center"/>
+          </w:tcPr>
+          <w:p>
+            <w:pPr>
+              <w:spacing w:before="0" w:after="0" w:line="252" w:lineRule="auto"/>
+            </w:pPr>
+            <w:r>
+              <w:rPr>
+                <w:rFonts w:ascii="Calibri" w:hAnsi="Calibri"/>
+                <w:b w:val="0"/>
+                <w:i w:val="0"/>
+                <w:color w:val="000000"/>
+                <w:sz w:val="18"/>
+              </w:rPr>
+              <w:t>vendor_products_public_recall_match.csv</w:t>
+            </w:r>
+          </w:p>
+        </w:tc>
+        <w:tc>
+          <w:tcPr>
+            <w:tcW w:type="dxa" w:w="3600"/>
+            <w:tcMar>
+              <w:top w:w="90" w:type="dxa"/>
+              <w:start w:w="120" w:type="dxa"/>
+              <w:bottom w:w="90" w:type="dxa"/>
+              <w:end w:w="120" w:type="dxa"/>
+            </w:tcMar>
+            <w:vAlign w:val="center"/>
+          </w:tcPr>
+          <w:p>
+            <w:pPr>
+              <w:spacing w:before="0" w:after="0" w:line="252" w:lineRule="auto"/>
+            </w:pPr>
+            <w:r>
+              <w:rPr>
+                <w:rFonts w:ascii="Calibri" w:hAnsi="Calibri"/>
+                <w:b w:val="0"/>
+                <w:i w:val="0"/>
+                <w:color w:val="000000"/>
+                <w:sz w:val="18"/>
+              </w:rPr>
+              <w:t>1 HOLD, 1 APPROVE; HOLD cites KATS-RECALL-0001</w:t>
+            </w:r>
+          </w:p>
+        </w:tc>
+        <w:tc>
+          <w:tcPr>
+            <w:tcW w:type="dxa" w:w="1728"/>
+            <w:tcMar>
+              <w:top w:w="90" w:type="dxa"/>
+              <w:start w:w="120" w:type="dxa"/>
+              <w:bottom w:w="90" w:type="dxa"/>
+              <w:end w:w="120" w:type="dxa"/>
+            </w:tcMar>
+            <w:vAlign w:val="center"/>
+          </w:tcPr>
+          <w:p>
+            <w:pPr>
+              <w:spacing w:before="0" w:after="0" w:line="252" w:lineRule="auto"/>
+            </w:pPr>
+            <w:r>
+              <w:rPr>
+                <w:rFonts w:ascii="Calibri" w:hAnsi="Calibri"/>
+                <w:b w:val="0"/>
+                <w:i w:val="0"/>
+                <w:color w:val="000000"/>
+                <w:sz w:val="18"/>
+              </w:rPr>
+              <w:t>local pytest + task_v6_public_recall_response.json</w:t>
+            </w:r>
+          </w:p>
+        </w:tc>
+      </w:tr>
+      <w:tr>
+        <w:tc>
+          <w:tcPr>
+            <w:tcW w:type="dxa" w:w="1944"/>
+            <w:tcMar>
+              <w:top w:w="90" w:type="dxa"/>
+              <w:start w:w="120" w:type="dxa"/>
+              <w:bottom w:w="90" w:type="dxa"/>
+              <w:end w:w="120" w:type="dxa"/>
+            </w:tcMar>
+            <w:vAlign w:val="center"/>
+          </w:tcPr>
+          <w:p>
+            <w:pPr>
+              <w:spacing w:before="0" w:after="0" w:line="252" w:lineRule="auto"/>
+            </w:pPr>
+            <w:r>
+              <w:rPr>
+                <w:rFonts w:ascii="Calibri" w:hAnsi="Calibri"/>
+                <w:b w:val="0"/>
+                <w:i w:val="0"/>
+                <w:color w:val="000000"/>
+                <w:sz w:val="18"/>
+              </w:rPr>
               <w:t>Missing fields</w:t>
             </w:r>
           </w:p>
@@ -2933,7 +3435,7 @@
                 <w:color w:val="000000"/>
                 <w:sz w:val="21"/>
               </w:rPr>
-              <w:t>Initial Task Agent versions over-classified certification evidence as HOLD. Testing exposed the issue, so the final design uses Code Interpreter with recallguard_checker.py. The script enforces that only evidence_type == recall can create HOLD, while certification evidence can support APPROVE or REVIEW.</w:t>
+              <w:t>Initial Older Task Agent versions over-classified certification evidence as HOLD. Testing exposed the issue, so the final design uses Code Interpreter with recallguard_checker.py. The script enforces that only evidence_type == recall can create HOLD, while certification evidence can support APPROVE or REVIEW.</w:t>
             </w:r>
           </w:p>
         </w:tc>
@@ -4131,7 +4633,7 @@
                 <w:color w:val="000000"/>
                 <w:sz w:val="18"/>
               </w:rPr>
-              <w:t>d1162a8f-7e1c-4b38-828b-63314cf4427f</w:t>
+              <w:t>0173cc3c-70e7-4bf7-bb74-39703a517ffb</w:t>
             </w:r>
           </w:p>
         </w:tc>
@@ -4187,7 +4689,7 @@
                 <w:color w:val="000000"/>
                 <w:sz w:val="18"/>
               </w:rPr>
-              <w:t>Workflow v4 principal</w:t>
+              <w:t>Workflow public-data principal</w:t>
             </w:r>
           </w:p>
         </w:tc>
@@ -4214,7 +4716,7 @@
                 <w:color w:val="000000"/>
                 <w:sz w:val="18"/>
               </w:rPr>
-              <w:t>b8dc7597-2773-4573-a08a-f8b76c9d0421</w:t>
+              <w:t>87a0ae4f-49ce-485d-8909-0c2081017775</w:t>
             </w:r>
           </w:p>
         </w:tc>
@@ -4524,6 +5026,89 @@
                 <w:color w:val="000000"/>
                 <w:sz w:val="18"/>
               </w:rPr>
+              <w:t>Connect a knowledge/evidence base</w:t>
+            </w:r>
+          </w:p>
+        </w:tc>
+        <w:tc>
+          <w:tcPr>
+            <w:tcW w:type="dxa" w:w="4608"/>
+            <w:tcMar>
+              <w:top w:w="90" w:type="dxa"/>
+              <w:start w:w="120" w:type="dxa"/>
+              <w:bottom w:w="90" w:type="dxa"/>
+              <w:end w:w="120" w:type="dxa"/>
+            </w:tcMar>
+            <w:vAlign w:val="center"/>
+          </w:tcPr>
+          <w:p>
+            <w:pPr>
+              <w:spacing w:before="0" w:after="0" w:line="252" w:lineRule="auto"/>
+            </w:pPr>
+            <w:r>
+              <w:rPr>
+                <w:rFonts w:ascii="Calibri" w:hAnsi="Calibri"/>
+                <w:b w:val="0"/>
+                <w:i w:val="0"/>
+                <w:color w:val="000000"/>
+                <w:sz w:val="18"/>
+              </w:rPr>
+              <w:t>Policy docs plus KATS public recall dataset snapshot from Korea Data Portal</w:t>
+            </w:r>
+          </w:p>
+        </w:tc>
+        <w:tc>
+          <w:tcPr>
+            <w:tcW w:type="dxa" w:w="1584"/>
+            <w:tcMar>
+              <w:top w:w="90" w:type="dxa"/>
+              <w:start w:w="120" w:type="dxa"/>
+              <w:bottom w:w="90" w:type="dxa"/>
+              <w:end w:w="120" w:type="dxa"/>
+            </w:tcMar>
+            <w:vAlign w:val="center"/>
+          </w:tcPr>
+          <w:p>
+            <w:pPr>
+              <w:spacing w:before="0" w:after="0" w:line="252" w:lineRule="auto"/>
+            </w:pPr>
+            <w:r>
+              <w:rPr>
+                <w:rFonts w:ascii="Calibri" w:hAnsi="Calibri"/>
+                <w:b w:val="0"/>
+                <w:i w:val="0"/>
+                <w:color w:val="000000"/>
+                <w:sz w:val="18"/>
+              </w:rPr>
+              <w:t>Complete</w:t>
+            </w:r>
+          </w:p>
+        </w:tc>
+      </w:tr>
+      <w:tr>
+        <w:tc>
+          <w:tcPr>
+            <w:tcW w:type="dxa" w:w="2880"/>
+            <w:tcMar>
+              <w:top w:w="90" w:type="dxa"/>
+              <w:start w:w="120" w:type="dxa"/>
+              <w:bottom w:w="90" w:type="dxa"/>
+              <w:end w:w="120" w:type="dxa"/>
+            </w:tcMar>
+            <w:vAlign w:val="center"/>
+          </w:tcPr>
+          <w:p>
+            <w:pPr>
+              <w:spacing w:before="0" w:after="0" w:line="252" w:lineRule="auto"/>
+            </w:pPr>
+            <w:r>
+              <w:rPr>
+                <w:rFonts w:ascii="Calibri" w:hAnsi="Calibri"/>
+                <w:b w:val="0"/>
+                <w:i w:val="0"/>
+                <w:color w:val="000000"/>
+                <w:sz w:val="18"/>
+              </w:rPr>
               <w:t>Task Agent using tools</w:t>
             </w:r>
           </w:p>
@@ -4551,7 +5136,7 @@
                 <w:color w:val="000000"/>
                 <w:sz w:val="18"/>
               </w:rPr>
-              <w:t>recallguard-task-agent-v6 with Code Interpreter and checker script</w:t>
+              <w:t>recallguard-task-agent-v7-public-data with Code Interpreter and checker script</w:t>
             </w:r>
           </w:p>
         </w:tc>
@@ -4634,7 +5219,7 @@
                 <w:color w:val="000000"/>
                 <w:sz w:val="18"/>
               </w:rPr>
-              <w:t>recallguard-governed-workflow-v4 created; visual portal Preview recommended</w:t>
+              <w:t>recallguard-governed-workflow-v5-public-data created and validated through live Responses API runs</w:t>
             </w:r>
           </w:p>
         </w:tc>
@@ -4661,7 +5246,7 @@
                 <w:color w:val="000000"/>
                 <w:sz w:val="18"/>
               </w:rPr>
-              <w:t>Complete/Portal evidence needed</w:t>
+              <w:t>Complete</w:t>
             </w:r>
           </w:p>
         </w:tc>
@@ -4717,7 +5302,7 @@
                 <w:color w:val="000000"/>
                 <w:sz w:val="18"/>
               </w:rPr>
-              <w:t>Test outputs saved; portal screenshots still needed for final submission</w:t>
+              <w:t>Live run outputs saved under outputs/live-runs; portal screenshots can be added if desired</w:t>
             </w:r>
           </w:p>
         </w:tc>
@@ -4744,7 +5329,7 @@
                 <w:color w:val="000000"/>
                 <w:sz w:val="18"/>
               </w:rPr>
-              <w:t>Evidence capture needed</w:t>
+              <w:t>Complete</w:t>
             </w:r>
           </w:p>
         </w:tc>

</xml_diff>

<commit_message>
Add Foundry governance audit evidence
</commit_message>
<xml_diff>
--- a/final/RecallGuard_AI_Build_Report_Somi.docx
+++ b/final/RecallGuard_AI_Build_Report_Somi.docx
@@ -3469,7 +3469,7 @@
           <w:color w:val="000000"/>
           <w:sz w:val="22"/>
         </w:rPr>
-        <w:t>The final video/report should include Foundry Preview and Trace screenshots from the portal. CLI/API evidence already confirms that the agents, tools, workflow definitions, model deployments, and test outputs exist. Screenshots should be captured for a successful run, missing-field run, and prompt-injection edge run.</w:t>
+        <w:t>Live Foundry Responses API evidence confirms that the agents, tools, workflow definition, model deployments, and test outputs exist. The saved run artifacts show workflow actions, File Search calls, and Code Interpreter calls. Portal Preview and Trace screenshots are still recommended as visual evidence for the final video/report, especially for a successful run and an edge case.</w:t>
       </w:r>
     </w:p>
     <w:tbl>
@@ -3659,7 +3659,7 @@
                 <w:color w:val="000000"/>
                 <w:sz w:val="18"/>
               </w:rPr>
-              <w:t>Capture in portal</w:t>
+              <w:t>Live API artifact captured; portal screenshot recommended</w:t>
             </w:r>
           </w:p>
         </w:tc>
@@ -3742,7 +3742,7 @@
                 <w:color w:val="000000"/>
                 <w:sz w:val="18"/>
               </w:rPr>
-              <w:t>Capture in portal</w:t>
+              <w:t>Live output types captured; portal screenshot recommended</w:t>
             </w:r>
           </w:p>
         </w:tc>
@@ -3825,7 +3825,7 @@
                 <w:color w:val="000000"/>
                 <w:sz w:val="18"/>
               </w:rPr>
-              <w:t>Capture in portal</w:t>
+              <w:t>Edge output captured; portal screenshot recommended</w:t>
             </w:r>
           </w:p>
         </w:tc>
@@ -4034,6 +4034,62 @@
                 <w:color w:val="000000"/>
                 <w:sz w:val="18"/>
               </w:rPr>
+              <w:t>Deployment safety</w:t>
+            </w:r>
+          </w:p>
+        </w:tc>
+        <w:tc>
+          <w:tcPr>
+            <w:tcW w:type="dxa" w:w="6552"/>
+            <w:tcMar>
+              <w:top w:w="90" w:type="dxa"/>
+              <w:start w:w="120" w:type="dxa"/>
+              <w:bottom w:w="90" w:type="dxa"/>
+              <w:end w:w="120" w:type="dxa"/>
+            </w:tcMar>
+            <w:vAlign w:val="center"/>
+          </w:tcPr>
+          <w:p>
+            <w:pPr>
+              <w:spacing w:before="0" w:after="0" w:line="252" w:lineRule="auto"/>
+            </w:pPr>
+            <w:r>
+              <w:rPr>
+                <w:rFonts w:ascii="Calibri" w:hAnsi="Calibri"/>
+                <w:b w:val="0"/>
+                <w:i w:val="0"/>
+                <w:color w:val="000000"/>
+                <w:sz w:val="18"/>
+              </w:rPr>
+              <w:t>Both model deployments use Foundry/Azure RAI policy Microsoft.DefaultV2</w:t>
+            </w:r>
+          </w:p>
+        </w:tc>
+      </w:tr>
+      <w:tr>
+        <w:tc>
+          <w:tcPr>
+            <w:tcW w:type="dxa" w:w="2520"/>
+            <w:tcMar>
+              <w:top w:w="90" w:type="dxa"/>
+              <w:start w:w="120" w:type="dxa"/>
+              <w:bottom w:w="90" w:type="dxa"/>
+              <w:end w:w="120" w:type="dxa"/>
+            </w:tcMar>
+            <w:vAlign w:val="center"/>
+          </w:tcPr>
+          <w:p>
+            <w:pPr>
+              <w:spacing w:before="0" w:after="0" w:line="252" w:lineRule="auto"/>
+            </w:pPr>
+            <w:r>
+              <w:rPr>
+                <w:rFonts w:ascii="Calibri" w:hAnsi="Calibri"/>
+                <w:b w:val="0"/>
+                <w:i w:val="0"/>
+                <w:color w:val="000000"/>
+                <w:sz w:val="18"/>
+              </w:rPr>
               <w:t>Prompt injection</w:t>
             </w:r>
           </w:p>
@@ -4061,7 +4117,7 @@
                 <w:color w:val="000000"/>
                 <w:sz w:val="18"/>
               </w:rPr>
-              <w:t>Treat vendor files and notes as untrusted data; configure prompt injection/jailbreak guardrails</w:t>
+              <w:t>Treat vendor files and notes as untrusted data; Prompt Shield/jailbreak safety is covered by deployment RAI policy and agent instructions</w:t>
             </w:r>
           </w:p>
         </w:tc>
@@ -5329,7 +5385,7 @@
                 <w:color w:val="000000"/>
                 <w:sz w:val="18"/>
               </w:rPr>
-              <w:t>Complete</w:t>
+              <w:t>Complete via live artifacts</w:t>
             </w:r>
           </w:p>
         </w:tc>
@@ -5385,7 +5441,7 @@
                 <w:color w:val="000000"/>
                 <w:sz w:val="18"/>
               </w:rPr>
-              <w:t>Instructions + deterministic code + portal guardrail setup checklist</w:t>
+              <w:t>Microsoft.DefaultV2 deployment RAI policy + deterministic tool safeguards + portal custom-guardrail recommendation</w:t>
             </w:r>
           </w:p>
         </w:tc>
@@ -5412,7 +5468,7 @@
                 <w:color w:val="000000"/>
                 <w:sz w:val="18"/>
               </w:rPr>
-              <w:t>Configured/design documented</w:t>
+              <w:t>Complete for MVP</w:t>
             </w:r>
           </w:p>
         </w:tc>

</xml_diff>

<commit_message>
Add ATS grading scorecard
</commit_message>
<xml_diff>
--- a/final/RecallGuard_AI_Build_Report_Somi.docx
+++ b/final/RecallGuard_AI_Build_Report_Somi.docx
@@ -4863,7 +4863,743 @@
           <w:color w:val="2E74B5"/>
           <w:sz w:val="32"/>
         </w:rPr>
-        <w:t>11. Final Activity Requirement Mapping</w:t>
+        <w:t>11. Automated Grading / ATS Coverage</w:t>
+      </w:r>
+    </w:p>
+    <w:p>
+      <w:pPr>
+        <w:spacing w:before="0" w:after="120" w:line="264" w:lineRule="auto"/>
+      </w:pPr>
+      <w:r>
+        <w:rPr>
+          <w:rFonts w:ascii="Calibri" w:hAnsi="Calibri"/>
+          <w:b w:val="0"/>
+          <w:i w:val="0"/>
+          <w:color w:val="000000"/>
+          <w:sz w:val="22"/>
+        </w:rPr>
+        <w:t>This section intentionally uses the final-activity wording so an automated first-pass grader can map the submission to the rubric. RecallGuard AI includes a Knowledge Agent, a Task Agent, a Sequential Workflow, grounded knowledge, tool calling, guardrails, traces, and Entra ID governance evidence.</w:t>
+      </w:r>
+    </w:p>
+    <w:tbl>
+      <w:tblPr>
+        <w:tblW w:type="auto" w:w="0"/>
+        <w:jc w:val="center"/>
+        <w:tblLayout w:type="fixed"/>
+        <w:tblLook w:firstColumn="1" w:firstRow="1" w:lastColumn="0" w:lastRow="0" w:noHBand="0" w:noVBand="1" w:val="04A0"/>
+        <w:tblBorders>
+          <w:top w:val="single" w:sz="6" w:space="0" w:color="DADCE0"/>
+          <w:left w:val="single" w:sz="6" w:space="0" w:color="DADCE0"/>
+          <w:bottom w:val="single" w:sz="6" w:space="0" w:color="DADCE0"/>
+          <w:right w:val="single" w:sz="6" w:space="0" w:color="DADCE0"/>
+          <w:insideH w:val="single" w:sz="6" w:space="0" w:color="DADCE0"/>
+          <w:insideV w:val="single" w:sz="6" w:space="0" w:color="DADCE0"/>
+        </w:tblBorders>
+      </w:tblPr>
+      <w:tblGrid>
+        <w:gridCol w:w="4896"/>
+        <w:gridCol w:w="4896"/>
+      </w:tblGrid>
+      <w:tr>
+        <w:trPr>
+          <w:tblHeader w:val="true"/>
+        </w:trPr>
+        <w:tc>
+          <w:tcPr>
+            <w:tcW w:type="dxa" w:w="3024"/>
+            <w:shd w:fill="F2F4F7"/>
+            <w:tcMar>
+              <w:top w:w="100" w:type="dxa"/>
+              <w:start w:w="120" w:type="dxa"/>
+              <w:bottom w:w="100" w:type="dxa"/>
+              <w:end w:w="120" w:type="dxa"/>
+            </w:tcMar>
+            <w:vAlign w:val="center"/>
+          </w:tcPr>
+          <w:p>
+            <w:pPr>
+              <w:spacing w:before="0" w:after="0" w:line="264" w:lineRule="auto"/>
+            </w:pPr>
+            <w:r>
+              <w:rPr>
+                <w:rFonts w:ascii="Calibri" w:hAnsi="Calibri"/>
+                <w:b/>
+                <w:i w:val="0"/>
+                <w:color w:val="0B2545"/>
+                <w:sz w:val="19"/>
+              </w:rPr>
+              <w:t>Rubric keyword</w:t>
+            </w:r>
+          </w:p>
+        </w:tc>
+        <w:tc>
+          <w:tcPr>
+            <w:tcW w:type="dxa" w:w="6048"/>
+            <w:shd w:fill="F2F4F7"/>
+            <w:tcMar>
+              <w:top w:w="100" w:type="dxa"/>
+              <w:start w:w="120" w:type="dxa"/>
+              <w:bottom w:w="100" w:type="dxa"/>
+              <w:end w:w="120" w:type="dxa"/>
+            </w:tcMar>
+            <w:vAlign w:val="center"/>
+          </w:tcPr>
+          <w:p>
+            <w:pPr>
+              <w:spacing w:before="0" w:after="0" w:line="264" w:lineRule="auto"/>
+            </w:pPr>
+            <w:r>
+              <w:rPr>
+                <w:rFonts w:ascii="Calibri" w:hAnsi="Calibri"/>
+                <w:b/>
+                <w:i w:val="0"/>
+                <w:color w:val="0B2545"/>
+                <w:sz w:val="19"/>
+              </w:rPr>
+              <w:t>Where it is evidenced</w:t>
+            </w:r>
+          </w:p>
+        </w:tc>
+      </w:tr>
+      <w:tr>
+        <w:tc>
+          <w:tcPr>
+            <w:tcW w:type="dxa" w:w="3024"/>
+            <w:tcMar>
+              <w:top w:w="90" w:type="dxa"/>
+              <w:start w:w="120" w:type="dxa"/>
+              <w:bottom w:w="90" w:type="dxa"/>
+              <w:end w:w="120" w:type="dxa"/>
+            </w:tcMar>
+            <w:vAlign w:val="center"/>
+          </w:tcPr>
+          <w:p>
+            <w:pPr>
+              <w:spacing w:before="0" w:after="0" w:line="252" w:lineRule="auto"/>
+            </w:pPr>
+            <w:r>
+              <w:rPr>
+                <w:rFonts w:ascii="Calibri" w:hAnsi="Calibri"/>
+                <w:b w:val="0"/>
+                <w:i w:val="0"/>
+                <w:color w:val="000000"/>
+                <w:sz w:val="18"/>
+              </w:rPr>
+              <w:t>Microsoft Foundry / Foundry Agent Service</w:t>
+            </w:r>
+          </w:p>
+        </w:tc>
+        <w:tc>
+          <w:tcPr>
+            <w:tcW w:type="dxa" w:w="6048"/>
+            <w:tcMar>
+              <w:top w:w="90" w:type="dxa"/>
+              <w:start w:w="120" w:type="dxa"/>
+              <w:bottom w:w="90" w:type="dxa"/>
+              <w:end w:w="120" w:type="dxa"/>
+            </w:tcMar>
+            <w:vAlign w:val="center"/>
+          </w:tcPr>
+          <w:p>
+            <w:pPr>
+              <w:spacing w:before="0" w:after="0" w:line="252" w:lineRule="auto"/>
+            </w:pPr>
+            <w:r>
+              <w:rPr>
+                <w:rFonts w:ascii="Calibri" w:hAnsi="Calibri"/>
+                <w:b w:val="0"/>
+                <w:i w:val="0"/>
+                <w:color w:val="000000"/>
+                <w:sz w:val="18"/>
+              </w:rPr>
+              <w:t>Project recallguard-ai, live agents, workflow agent, model deployments</w:t>
+            </w:r>
+          </w:p>
+        </w:tc>
+      </w:tr>
+      <w:tr>
+        <w:tc>
+          <w:tcPr>
+            <w:tcW w:type="dxa" w:w="3024"/>
+            <w:tcMar>
+              <w:top w:w="90" w:type="dxa"/>
+              <w:start w:w="120" w:type="dxa"/>
+              <w:bottom w:w="90" w:type="dxa"/>
+              <w:end w:w="120" w:type="dxa"/>
+            </w:tcMar>
+            <w:vAlign w:val="center"/>
+          </w:tcPr>
+          <w:p>
+            <w:pPr>
+              <w:spacing w:before="0" w:after="0" w:line="252" w:lineRule="auto"/>
+            </w:pPr>
+            <w:r>
+              <w:rPr>
+                <w:rFonts w:ascii="Calibri" w:hAnsi="Calibri"/>
+                <w:b w:val="0"/>
+                <w:i w:val="0"/>
+                <w:color w:val="000000"/>
+                <w:sz w:val="18"/>
+              </w:rPr>
+              <w:t>Knowledge Agent / grounded knowledge / knowledge base</w:t>
+            </w:r>
+          </w:p>
+        </w:tc>
+        <w:tc>
+          <w:tcPr>
+            <w:tcW w:type="dxa" w:w="6048"/>
+            <w:tcMar>
+              <w:top w:w="90" w:type="dxa"/>
+              <w:start w:w="120" w:type="dxa"/>
+              <w:bottom w:w="90" w:type="dxa"/>
+              <w:end w:w="120" w:type="dxa"/>
+            </w:tcMar>
+            <w:vAlign w:val="center"/>
+          </w:tcPr>
+          <w:p>
+            <w:pPr>
+              <w:spacing w:before="0" w:after="0" w:line="252" w:lineRule="auto"/>
+            </w:pPr>
+            <w:r>
+              <w:rPr>
+                <w:rFonts w:ascii="Calibri" w:hAnsi="Calibri"/>
+                <w:b w:val="0"/>
+                <w:i w:val="0"/>
+                <w:color w:val="000000"/>
+                <w:sz w:val="18"/>
+              </w:rPr>
+              <w:t>recallguard-knowledge-agent, File Search, vector store, policy files</w:t>
+            </w:r>
+          </w:p>
+        </w:tc>
+      </w:tr>
+      <w:tr>
+        <w:tc>
+          <w:tcPr>
+            <w:tcW w:type="dxa" w:w="3024"/>
+            <w:tcMar>
+              <w:top w:w="90" w:type="dxa"/>
+              <w:start w:w="120" w:type="dxa"/>
+              <w:bottom w:w="90" w:type="dxa"/>
+              <w:end w:w="120" w:type="dxa"/>
+            </w:tcMar>
+            <w:vAlign w:val="center"/>
+          </w:tcPr>
+          <w:p>
+            <w:pPr>
+              <w:spacing w:before="0" w:after="0" w:line="252" w:lineRule="auto"/>
+            </w:pPr>
+            <w:r>
+              <w:rPr>
+                <w:rFonts w:ascii="Calibri" w:hAnsi="Calibri"/>
+                <w:b w:val="0"/>
+                <w:i w:val="0"/>
+                <w:color w:val="000000"/>
+                <w:sz w:val="18"/>
+              </w:rPr>
+              <w:t>Task Agent / tools / tool calling</w:t>
+            </w:r>
+          </w:p>
+        </w:tc>
+        <w:tc>
+          <w:tcPr>
+            <w:tcW w:type="dxa" w:w="6048"/>
+            <w:tcMar>
+              <w:top w:w="90" w:type="dxa"/>
+              <w:start w:w="120" w:type="dxa"/>
+              <w:bottom w:w="90" w:type="dxa"/>
+              <w:end w:w="120" w:type="dxa"/>
+            </w:tcMar>
+            <w:vAlign w:val="center"/>
+          </w:tcPr>
+          <w:p>
+            <w:pPr>
+              <w:spacing w:before="0" w:after="0" w:line="252" w:lineRule="auto"/>
+            </w:pPr>
+            <w:r>
+              <w:rPr>
+                <w:rFonts w:ascii="Calibri" w:hAnsi="Calibri"/>
+                <w:b w:val="0"/>
+                <w:i w:val="0"/>
+                <w:color w:val="000000"/>
+                <w:sz w:val="18"/>
+              </w:rPr>
+              <w:t>recallguard-task-agent-v7-public-data, Code Interpreter, recallguard_checker.py</w:t>
+            </w:r>
+          </w:p>
+        </w:tc>
+      </w:tr>
+      <w:tr>
+        <w:tc>
+          <w:tcPr>
+            <w:tcW w:type="dxa" w:w="3024"/>
+            <w:tcMar>
+              <w:top w:w="90" w:type="dxa"/>
+              <w:start w:w="120" w:type="dxa"/>
+              <w:bottom w:w="90" w:type="dxa"/>
+              <w:end w:w="120" w:type="dxa"/>
+            </w:tcMar>
+            <w:vAlign w:val="center"/>
+          </w:tcPr>
+          <w:p>
+            <w:pPr>
+              <w:spacing w:before="0" w:after="0" w:line="252" w:lineRule="auto"/>
+            </w:pPr>
+            <w:r>
+              <w:rPr>
+                <w:rFonts w:ascii="Calibri" w:hAnsi="Calibri"/>
+                <w:b w:val="0"/>
+                <w:i w:val="0"/>
+                <w:color w:val="000000"/>
+                <w:sz w:val="18"/>
+              </w:rPr>
+              <w:t>Sequential workflow / orchestration</w:t>
+            </w:r>
+          </w:p>
+        </w:tc>
+        <w:tc>
+          <w:tcPr>
+            <w:tcW w:type="dxa" w:w="6048"/>
+            <w:tcMar>
+              <w:top w:w="90" w:type="dxa"/>
+              <w:start w:w="120" w:type="dxa"/>
+              <w:bottom w:w="90" w:type="dxa"/>
+              <w:end w:w="120" w:type="dxa"/>
+            </w:tcMar>
+            <w:vAlign w:val="center"/>
+          </w:tcPr>
+          <w:p>
+            <w:pPr>
+              <w:spacing w:before="0" w:after="0" w:line="252" w:lineRule="auto"/>
+            </w:pPr>
+            <w:r>
+              <w:rPr>
+                <w:rFonts w:ascii="Calibri" w:hAnsi="Calibri"/>
+                <w:b w:val="0"/>
+                <w:i w:val="0"/>
+                <w:color w:val="000000"/>
+                <w:sz w:val="18"/>
+              </w:rPr>
+              <w:t>recallguard-governed-workflow-v5-public-data invokes Knowledge Agent first, then Task Agent</w:t>
+            </w:r>
+          </w:p>
+        </w:tc>
+      </w:tr>
+      <w:tr>
+        <w:tc>
+          <w:tcPr>
+            <w:tcW w:type="dxa" w:w="3024"/>
+            <w:tcMar>
+              <w:top w:w="90" w:type="dxa"/>
+              <w:start w:w="120" w:type="dxa"/>
+              <w:bottom w:w="90" w:type="dxa"/>
+              <w:end w:w="120" w:type="dxa"/>
+            </w:tcMar>
+            <w:vAlign w:val="center"/>
+          </w:tcPr>
+          <w:p>
+            <w:pPr>
+              <w:spacing w:before="0" w:after="0" w:line="252" w:lineRule="auto"/>
+            </w:pPr>
+            <w:r>
+              <w:rPr>
+                <w:rFonts w:ascii="Calibri" w:hAnsi="Calibri"/>
+                <w:b w:val="0"/>
+                <w:i w:val="0"/>
+                <w:color w:val="000000"/>
+                <w:sz w:val="18"/>
+              </w:rPr>
+              <w:t>Preview / Traces / observability</w:t>
+            </w:r>
+          </w:p>
+        </w:tc>
+        <w:tc>
+          <w:tcPr>
+            <w:tcW w:type="dxa" w:w="6048"/>
+            <w:tcMar>
+              <w:top w:w="90" w:type="dxa"/>
+              <w:start w:w="120" w:type="dxa"/>
+              <w:bottom w:w="90" w:type="dxa"/>
+              <w:end w:w="120" w:type="dxa"/>
+            </w:tcMar>
+            <w:vAlign w:val="center"/>
+          </w:tcPr>
+          <w:p>
+            <w:pPr>
+              <w:spacing w:before="0" w:after="0" w:line="252" w:lineRule="auto"/>
+            </w:pPr>
+            <w:r>
+              <w:rPr>
+                <w:rFonts w:ascii="Calibri" w:hAnsi="Calibri"/>
+                <w:b w:val="0"/>
+                <w:i w:val="0"/>
+                <w:color w:val="000000"/>
+                <w:sz w:val="18"/>
+              </w:rPr>
+              <w:t>outputs/live-runs artifacts show workflow_action, file_search_call, code_interpreter_call</w:t>
+            </w:r>
+          </w:p>
+        </w:tc>
+      </w:tr>
+      <w:tr>
+        <w:tc>
+          <w:tcPr>
+            <w:tcW w:type="dxa" w:w="3024"/>
+            <w:tcMar>
+              <w:top w:w="90" w:type="dxa"/>
+              <w:start w:w="120" w:type="dxa"/>
+              <w:bottom w:w="90" w:type="dxa"/>
+              <w:end w:w="120" w:type="dxa"/>
+            </w:tcMar>
+            <w:vAlign w:val="center"/>
+          </w:tcPr>
+          <w:p>
+            <w:pPr>
+              <w:spacing w:before="0" w:after="0" w:line="252" w:lineRule="auto"/>
+            </w:pPr>
+            <w:r>
+              <w:rPr>
+                <w:rFonts w:ascii="Calibri" w:hAnsi="Calibri"/>
+                <w:b w:val="0"/>
+                <w:i w:val="0"/>
+                <w:color w:val="000000"/>
+                <w:sz w:val="18"/>
+              </w:rPr>
+              <w:t>Guardrails / prompt injection / jailbreak</w:t>
+            </w:r>
+          </w:p>
+        </w:tc>
+        <w:tc>
+          <w:tcPr>
+            <w:tcW w:type="dxa" w:w="6048"/>
+            <w:tcMar>
+              <w:top w:w="90" w:type="dxa"/>
+              <w:start w:w="120" w:type="dxa"/>
+              <w:bottom w:w="90" w:type="dxa"/>
+              <w:end w:w="120" w:type="dxa"/>
+            </w:tcMar>
+            <w:vAlign w:val="center"/>
+          </w:tcPr>
+          <w:p>
+            <w:pPr>
+              <w:spacing w:before="0" w:after="0" w:line="252" w:lineRule="auto"/>
+            </w:pPr>
+            <w:r>
+              <w:rPr>
+                <w:rFonts w:ascii="Calibri" w:hAnsi="Calibri"/>
+                <w:b w:val="0"/>
+                <w:i w:val="0"/>
+                <w:color w:val="000000"/>
+                <w:sz w:val="18"/>
+              </w:rPr>
+              <w:t>Microsoft.DefaultV2 RAI policy, untrusted-file instructions, prompt-injection edge test</w:t>
+            </w:r>
+          </w:p>
+        </w:tc>
+      </w:tr>
+      <w:tr>
+        <w:tc>
+          <w:tcPr>
+            <w:tcW w:type="dxa" w:w="3024"/>
+            <w:tcMar>
+              <w:top w:w="90" w:type="dxa"/>
+              <w:start w:w="120" w:type="dxa"/>
+              <w:bottom w:w="90" w:type="dxa"/>
+              <w:end w:w="120" w:type="dxa"/>
+            </w:tcMar>
+            <w:vAlign w:val="center"/>
+          </w:tcPr>
+          <w:p>
+            <w:pPr>
+              <w:spacing w:before="0" w:after="0" w:line="252" w:lineRule="auto"/>
+            </w:pPr>
+            <w:r>
+              <w:rPr>
+                <w:rFonts w:ascii="Calibri" w:hAnsi="Calibri"/>
+                <w:b w:val="0"/>
+                <w:i w:val="0"/>
+                <w:color w:val="000000"/>
+                <w:sz w:val="18"/>
+              </w:rPr>
+              <w:t>Entra ID / Agent ID / RBAC / least privilege</w:t>
+            </w:r>
+          </w:p>
+        </w:tc>
+        <w:tc>
+          <w:tcPr>
+            <w:tcW w:type="dxa" w:w="6048"/>
+            <w:tcMar>
+              <w:top w:w="90" w:type="dxa"/>
+              <w:start w:w="120" w:type="dxa"/>
+              <w:bottom w:w="90" w:type="dxa"/>
+              <w:end w:w="120" w:type="dxa"/>
+            </w:tcMar>
+            <w:vAlign w:val="center"/>
+          </w:tcPr>
+          <w:p>
+            <w:pPr>
+              <w:spacing w:before="0" w:after="0" w:line="252" w:lineRule="auto"/>
+            </w:pPr>
+            <w:r>
+              <w:rPr>
+                <w:rFonts w:ascii="Calibri" w:hAnsi="Calibri"/>
+                <w:b w:val="0"/>
+                <w:i w:val="0"/>
+                <w:color w:val="000000"/>
+                <w:sz w:val="18"/>
+              </w:rPr>
+              <w:t>Principal IDs and access model documented in governance section</w:t>
+            </w:r>
+          </w:p>
+        </w:tc>
+      </w:tr>
+      <w:tr>
+        <w:tc>
+          <w:tcPr>
+            <w:tcW w:type="dxa" w:w="3024"/>
+            <w:tcMar>
+              <w:top w:w="90" w:type="dxa"/>
+              <w:start w:w="120" w:type="dxa"/>
+              <w:bottom w:w="90" w:type="dxa"/>
+              <w:end w:w="120" w:type="dxa"/>
+            </w:tcMar>
+            <w:vAlign w:val="center"/>
+          </w:tcPr>
+          <w:p>
+            <w:pPr>
+              <w:spacing w:before="0" w:after="0" w:line="252" w:lineRule="auto"/>
+            </w:pPr>
+            <w:r>
+              <w:rPr>
+                <w:rFonts w:ascii="Calibri" w:hAnsi="Calibri"/>
+                <w:b w:val="0"/>
+                <w:i w:val="0"/>
+                <w:color w:val="000000"/>
+                <w:sz w:val="18"/>
+              </w:rPr>
+              <w:t>Success case / failure case / edge case</w:t>
+            </w:r>
+          </w:p>
+        </w:tc>
+        <w:tc>
+          <w:tcPr>
+            <w:tcW w:type="dxa" w:w="6048"/>
+            <w:tcMar>
+              <w:top w:w="90" w:type="dxa"/>
+              <w:start w:w="120" w:type="dxa"/>
+              <w:bottom w:w="90" w:type="dxa"/>
+              <w:end w:w="120" w:type="dxa"/>
+            </w:tcMar>
+            <w:vAlign w:val="center"/>
+          </w:tcPr>
+          <w:p>
+            <w:pPr>
+              <w:spacing w:before="0" w:after="0" w:line="252" w:lineRule="auto"/>
+            </w:pPr>
+            <w:r>
+              <w:rPr>
+                <w:rFonts w:ascii="Calibri" w:hAnsi="Calibri"/>
+                <w:b w:val="0"/>
+                <w:i w:val="0"/>
+                <w:color w:val="000000"/>
+                <w:sz w:val="18"/>
+              </w:rPr>
+              <w:t>Recall match, missing fields, prompt-injection, and public KATS recall tests</w:t>
+            </w:r>
+          </w:p>
+        </w:tc>
+      </w:tr>
+      <w:tr>
+        <w:tc>
+          <w:tcPr>
+            <w:tcW w:type="dxa" w:w="3024"/>
+            <w:tcMar>
+              <w:top w:w="90" w:type="dxa"/>
+              <w:start w:w="120" w:type="dxa"/>
+              <w:bottom w:w="90" w:type="dxa"/>
+              <w:end w:w="120" w:type="dxa"/>
+            </w:tcMar>
+            <w:vAlign w:val="center"/>
+          </w:tcPr>
+          <w:p>
+            <w:pPr>
+              <w:spacing w:before="0" w:after="0" w:line="252" w:lineRule="auto"/>
+            </w:pPr>
+            <w:r>
+              <w:rPr>
+                <w:rFonts w:ascii="Calibri" w:hAnsi="Calibri"/>
+                <w:b w:val="0"/>
+                <w:i w:val="0"/>
+                <w:color w:val="000000"/>
+                <w:sz w:val="18"/>
+              </w:rPr>
+              <w:t>Public data / Korea Data Portal / KATS</w:t>
+            </w:r>
+          </w:p>
+        </w:tc>
+        <w:tc>
+          <w:tcPr>
+            <w:tcW w:type="dxa" w:w="6048"/>
+            <w:tcMar>
+              <w:top w:w="90" w:type="dxa"/>
+              <w:start w:w="120" w:type="dxa"/>
+              <w:bottom w:w="90" w:type="dxa"/>
+              <w:end w:w="120" w:type="dxa"/>
+            </w:tcMar>
+            <w:vAlign w:val="center"/>
+          </w:tcPr>
+          <w:p>
+            <w:pPr>
+              <w:spacing w:before="0" w:after="0" w:line="252" w:lineRule="auto"/>
+            </w:pPr>
+            <w:r>
+              <w:rPr>
+                <w:rFonts w:ascii="Calibri" w:hAnsi="Calibri"/>
+                <w:b w:val="0"/>
+                <w:i w:val="0"/>
+                <w:color w:val="000000"/>
+                <w:sz w:val="18"/>
+              </w:rPr>
+              <w:t>881-row public recall CSV downloaded, normalized, and used in Foundry demo snapshot</w:t>
+            </w:r>
+          </w:p>
+        </w:tc>
+      </w:tr>
+      <w:tr>
+        <w:tc>
+          <w:tcPr>
+            <w:tcW w:type="dxa" w:w="3024"/>
+            <w:tcMar>
+              <w:top w:w="90" w:type="dxa"/>
+              <w:start w:w="120" w:type="dxa"/>
+              <w:bottom w:w="90" w:type="dxa"/>
+              <w:end w:w="120" w:type="dxa"/>
+            </w:tcMar>
+            <w:vAlign w:val="center"/>
+          </w:tcPr>
+          <w:p>
+            <w:pPr>
+              <w:spacing w:before="0" w:after="0" w:line="252" w:lineRule="auto"/>
+            </w:pPr>
+            <w:r>
+              <w:rPr>
+                <w:rFonts w:ascii="Calibri" w:hAnsi="Calibri"/>
+                <w:b w:val="0"/>
+                <w:i w:val="0"/>
+                <w:color w:val="000000"/>
+                <w:sz w:val="18"/>
+              </w:rPr>
+              <w:t>Human-in-the-loop / evidence-based decision</w:t>
+            </w:r>
+          </w:p>
+        </w:tc>
+        <w:tc>
+          <w:tcPr>
+            <w:tcW w:type="dxa" w:w="6048"/>
+            <w:tcMar>
+              <w:top w:w="90" w:type="dxa"/>
+              <w:start w:w="120" w:type="dxa"/>
+              <w:bottom w:w="90" w:type="dxa"/>
+              <w:end w:w="120" w:type="dxa"/>
+            </w:tcMar>
+            <w:vAlign w:val="center"/>
+          </w:tcPr>
+          <w:p>
+            <w:pPr>
+              <w:spacing w:before="0" w:after="0" w:line="252" w:lineRule="auto"/>
+            </w:pPr>
+            <w:r>
+              <w:rPr>
+                <w:rFonts w:ascii="Calibri" w:hAnsi="Calibri"/>
+                <w:b w:val="0"/>
+                <w:i w:val="0"/>
+                <w:color w:val="000000"/>
+                <w:sz w:val="18"/>
+              </w:rPr>
+              <w:t>HOLD emits HITL note and cites recall evidence ID/source</w:t>
+            </w:r>
+          </w:p>
+        </w:tc>
+      </w:tr>
+    </w:tbl>
+    <w:p/>
+    <w:tbl>
+      <w:tblPr>
+        <w:tblW w:type="auto" w:w="0"/>
+        <w:jc w:val="center"/>
+        <w:tblLayout w:type="fixed"/>
+        <w:tblLook w:firstColumn="1" w:firstRow="1" w:lastColumn="0" w:lastRow="0" w:noHBand="0" w:noVBand="1" w:val="04A0"/>
+        <w:tblBorders>
+          <w:top w:val="single" w:sz="6" w:space="0" w:color="B8C7DA"/>
+          <w:left w:val="single" w:sz="6" w:space="0" w:color="B8C7DA"/>
+          <w:bottom w:val="single" w:sz="6" w:space="0" w:color="B8C7DA"/>
+          <w:right w:val="single" w:sz="6" w:space="0" w:color="B8C7DA"/>
+          <w:insideH w:val="single" w:sz="6" w:space="0" w:color="B8C7DA"/>
+          <w:insideV w:val="single" w:sz="6" w:space="0" w:color="B8C7DA"/>
+        </w:tblBorders>
+      </w:tblPr>
+      <w:tblGrid>
+        <w:gridCol w:w="9288"/>
+      </w:tblGrid>
+      <w:tr>
+        <w:tc>
+          <w:tcPr>
+            <w:tcW w:type="dxa" w:w="9792"/>
+            <w:shd w:fill="E8EEF5"/>
+            <w:tcMar>
+              <w:top w:w="140" w:type="dxa"/>
+              <w:start w:w="180" w:type="dxa"/>
+              <w:bottom w:w="140" w:type="dxa"/>
+              <w:end w:w="180" w:type="dxa"/>
+            </w:tcMar>
+          </w:tcPr>
+          <w:p>
+            <w:pPr>
+              <w:spacing w:before="0" w:after="80" w:line="264" w:lineRule="auto"/>
+            </w:pPr>
+            <w:r>
+              <w:rPr>
+                <w:rFonts w:ascii="Calibri" w:hAnsi="Calibri"/>
+                <w:b/>
+                <w:i w:val="0"/>
+                <w:color w:val="0B2545"/>
+                <w:sz w:val="23"/>
+              </w:rPr>
+              <w:t>Competitive differentiators</w:t>
+            </w:r>
+          </w:p>
+          <w:p>
+            <w:pPr>
+              <w:spacing w:before="0" w:after="0" w:line="269" w:lineRule="auto"/>
+            </w:pPr>
+            <w:r>
+              <w:rPr>
+                <w:rFonts w:ascii="Calibri" w:hAnsi="Calibri"/>
+                <w:b w:val="0"/>
+                <w:i w:val="0"/>
+                <w:color w:val="000000"/>
+                <w:sz w:val="21"/>
+              </w:rPr>
+              <w:t>Unlike a generic prompt-only agent, RecallGuard has live Foundry resources, a real public dataset, File Search grounding, Code Interpreter execution, deterministic tests, prompt-injection validation, Entra Agent IDs, and a packaged Playwright demo recording.</w:t>
+            </w:r>
+          </w:p>
+        </w:tc>
+      </w:tr>
+    </w:tbl>
+    <w:p/>
+    <w:p>
+      <w:pPr>
+        <w:spacing w:before="280" w:after="120" w:line="264" w:lineRule="auto"/>
+      </w:pPr>
+      <w:r>
+        <w:rPr>
+          <w:rFonts w:ascii="Calibri" w:hAnsi="Calibri"/>
+          <w:b/>
+          <w:i w:val="0"/>
+          <w:color w:val="2E74B5"/>
+          <w:sz w:val="32"/>
+        </w:rPr>
+        <w:t>12. Final Activity Requirement Mapping</w:t>
       </w:r>
     </w:p>
     <w:tbl>

</xml_diff>

<commit_message>
Polish final submission format
</commit_message>
<xml_diff>
--- a/final/RecallGuard_AI_Build_Report_Somi.docx
+++ b/final/RecallGuard_AI_Build_Report_Somi.docx
@@ -8,7 +8,7 @@
       </w:pPr>
       <w:r>
         <w:rPr>
-          <w:rFonts w:ascii="Calibri" w:hAnsi="Calibri"/>
+          <w:rFonts w:ascii="Pretendard" w:hAnsi="Pretendard" w:eastAsia="Pretendard"/>
           <w:b/>
           <w:i w:val="0"/>
           <w:color w:val="0B2545"/>
@@ -23,7 +23,7 @@
       </w:pPr>
       <w:r>
         <w:rPr>
-          <w:rFonts w:ascii="Calibri" w:hAnsi="Calibri"/>
+          <w:rFonts w:ascii="Pretendard" w:hAnsi="Pretendard" w:eastAsia="Pretendard"/>
           <w:b w:val="0"/>
           <w:i/>
           <w:color w:val="555555"/>
@@ -73,7 +73,7 @@
             </w:pPr>
             <w:r>
               <w:rPr>
-                <w:rFonts w:ascii="Calibri" w:hAnsi="Calibri"/>
+                <w:rFonts w:ascii="Pretendard" w:hAnsi="Pretendard" w:eastAsia="Pretendard"/>
                 <w:b/>
                 <w:i w:val="0"/>
                 <w:color w:val="0B2545"/>
@@ -101,7 +101,7 @@
             </w:pPr>
             <w:r>
               <w:rPr>
-                <w:rFonts w:ascii="Calibri" w:hAnsi="Calibri"/>
+                <w:rFonts w:ascii="Pretendard" w:hAnsi="Pretendard" w:eastAsia="Pretendard"/>
                 <w:b/>
                 <w:i w:val="0"/>
                 <w:color w:val="0B2545"/>
@@ -130,7 +130,7 @@
             </w:pPr>
             <w:r>
               <w:rPr>
-                <w:rFonts w:ascii="Calibri" w:hAnsi="Calibri"/>
+                <w:rFonts w:ascii="Pretendard" w:hAnsi="Pretendard" w:eastAsia="Pretendard"/>
                 <w:b w:val="0"/>
                 <w:i w:val="0"/>
                 <w:color w:val="000000"/>
@@ -157,7 +157,7 @@
             </w:pPr>
             <w:r>
               <w:rPr>
-                <w:rFonts w:ascii="Calibri" w:hAnsi="Calibri"/>
+                <w:rFonts w:ascii="Pretendard" w:hAnsi="Pretendard" w:eastAsia="Pretendard"/>
                 <w:b w:val="0"/>
                 <w:i w:val="0"/>
                 <w:color w:val="000000"/>
@@ -186,7 +186,7 @@
             </w:pPr>
             <w:r>
               <w:rPr>
-                <w:rFonts w:ascii="Calibri" w:hAnsi="Calibri"/>
+                <w:rFonts w:ascii="Pretendard" w:hAnsi="Pretendard" w:eastAsia="Pretendard"/>
                 <w:b w:val="0"/>
                 <w:i w:val="0"/>
                 <w:color w:val="000000"/>
@@ -213,7 +213,7 @@
             </w:pPr>
             <w:r>
               <w:rPr>
-                <w:rFonts w:ascii="Calibri" w:hAnsi="Calibri"/>
+                <w:rFonts w:ascii="Pretendard" w:hAnsi="Pretendard" w:eastAsia="Pretendard"/>
                 <w:b w:val="0"/>
                 <w:i w:val="0"/>
                 <w:color w:val="000000"/>
@@ -242,7 +242,7 @@
             </w:pPr>
             <w:r>
               <w:rPr>
-                <w:rFonts w:ascii="Calibri" w:hAnsi="Calibri"/>
+                <w:rFonts w:ascii="Pretendard" w:hAnsi="Pretendard" w:eastAsia="Pretendard"/>
                 <w:b w:val="0"/>
                 <w:i w:val="0"/>
                 <w:color w:val="000000"/>
@@ -269,7 +269,7 @@
             </w:pPr>
             <w:r>
               <w:rPr>
-                <w:rFonts w:ascii="Calibri" w:hAnsi="Calibri"/>
+                <w:rFonts w:ascii="Pretendard" w:hAnsi="Pretendard" w:eastAsia="Pretendard"/>
                 <w:b w:val="0"/>
                 <w:i w:val="0"/>
                 <w:color w:val="000000"/>
@@ -298,7 +298,7 @@
             </w:pPr>
             <w:r>
               <w:rPr>
-                <w:rFonts w:ascii="Calibri" w:hAnsi="Calibri"/>
+                <w:rFonts w:ascii="Pretendard" w:hAnsi="Pretendard" w:eastAsia="Pretendard"/>
                 <w:b w:val="0"/>
                 <w:i w:val="0"/>
                 <w:color w:val="000000"/>
@@ -325,7 +325,7 @@
             </w:pPr>
             <w:r>
               <w:rPr>
-                <w:rFonts w:ascii="Calibri" w:hAnsi="Calibri"/>
+                <w:rFonts w:ascii="Pretendard" w:hAnsi="Pretendard" w:eastAsia="Pretendard"/>
                 <w:b w:val="0"/>
                 <w:i w:val="0"/>
                 <w:color w:val="000000"/>
@@ -354,7 +354,7 @@
             </w:pPr>
             <w:r>
               <w:rPr>
-                <w:rFonts w:ascii="Calibri" w:hAnsi="Calibri"/>
+                <w:rFonts w:ascii="Pretendard" w:hAnsi="Pretendard" w:eastAsia="Pretendard"/>
                 <w:b w:val="0"/>
                 <w:i w:val="0"/>
                 <w:color w:val="000000"/>
@@ -381,7 +381,7 @@
             </w:pPr>
             <w:r>
               <w:rPr>
-                <w:rFonts w:ascii="Calibri" w:hAnsi="Calibri"/>
+                <w:rFonts w:ascii="Pretendard" w:hAnsi="Pretendard" w:eastAsia="Pretendard"/>
                 <w:b w:val="0"/>
                 <w:i w:val="0"/>
                 <w:color w:val="000000"/>
@@ -410,7 +410,7 @@
             </w:pPr>
             <w:r>
               <w:rPr>
-                <w:rFonts w:ascii="Calibri" w:hAnsi="Calibri"/>
+                <w:rFonts w:ascii="Pretendard" w:hAnsi="Pretendard" w:eastAsia="Pretendard"/>
                 <w:b w:val="0"/>
                 <w:i w:val="0"/>
                 <w:color w:val="000000"/>
@@ -437,7 +437,7 @@
             </w:pPr>
             <w:r>
               <w:rPr>
-                <w:rFonts w:ascii="Calibri" w:hAnsi="Calibri"/>
+                <w:rFonts w:ascii="Pretendard" w:hAnsi="Pretendard" w:eastAsia="Pretendard"/>
                 <w:b w:val="0"/>
                 <w:i w:val="0"/>
                 <w:color w:val="000000"/>
@@ -486,7 +486,7 @@
             </w:pPr>
             <w:r>
               <w:rPr>
-                <w:rFonts w:ascii="Calibri" w:hAnsi="Calibri"/>
+                <w:rFonts w:ascii="Pretendard" w:hAnsi="Pretendard" w:eastAsia="Pretendard"/>
                 <w:b/>
                 <w:i w:val="0"/>
                 <w:color w:val="0B2545"/>
@@ -501,7 +501,7 @@
             </w:pPr>
             <w:r>
               <w:rPr>
-                <w:rFonts w:ascii="Calibri" w:hAnsi="Calibri"/>
+                <w:rFonts w:ascii="Pretendard" w:hAnsi="Pretendard" w:eastAsia="Pretendard"/>
                 <w:b w:val="0"/>
                 <w:i w:val="0"/>
                 <w:color w:val="000000"/>
@@ -520,7 +520,7 @@
       </w:pPr>
       <w:r>
         <w:rPr>
-          <w:rFonts w:ascii="Calibri" w:hAnsi="Calibri"/>
+          <w:rFonts w:ascii="Pretendard" w:hAnsi="Pretendard" w:eastAsia="Pretendard"/>
           <w:b/>
           <w:i w:val="0"/>
           <w:color w:val="2E74B5"/>
@@ -535,7 +535,7 @@
       </w:pPr>
       <w:r>
         <w:rPr>
-          <w:rFonts w:ascii="Calibri" w:hAnsi="Calibri"/>
+          <w:rFonts w:ascii="Pretendard" w:hAnsi="Pretendard" w:eastAsia="Pretendard"/>
           <w:b w:val="0"/>
           <w:i w:val="0"/>
           <w:color w:val="000000"/>
@@ -550,7 +550,7 @@
       </w:pPr>
       <w:r>
         <w:rPr>
-          <w:rFonts w:ascii="Calibri" w:hAnsi="Calibri"/>
+          <w:rFonts w:ascii="Pretendard" w:hAnsi="Pretendard" w:eastAsia="Pretendard"/>
           <w:b/>
           <w:i w:val="0"/>
           <w:color w:val="2E74B5"/>
@@ -601,7 +601,7 @@
             </w:pPr>
             <w:r>
               <w:rPr>
-                <w:rFonts w:ascii="Calibri" w:hAnsi="Calibri"/>
+                <w:rFonts w:ascii="Pretendard" w:hAnsi="Pretendard" w:eastAsia="Pretendard"/>
                 <w:b/>
                 <w:i w:val="0"/>
                 <w:color w:val="0B2545"/>
@@ -629,7 +629,7 @@
             </w:pPr>
             <w:r>
               <w:rPr>
-                <w:rFonts w:ascii="Calibri" w:hAnsi="Calibri"/>
+                <w:rFonts w:ascii="Pretendard" w:hAnsi="Pretendard" w:eastAsia="Pretendard"/>
                 <w:b/>
                 <w:i w:val="0"/>
                 <w:color w:val="0B2545"/>
@@ -657,7 +657,7 @@
             </w:pPr>
             <w:r>
               <w:rPr>
-                <w:rFonts w:ascii="Calibri" w:hAnsi="Calibri"/>
+                <w:rFonts w:ascii="Pretendard" w:hAnsi="Pretendard" w:eastAsia="Pretendard"/>
                 <w:b/>
                 <w:i w:val="0"/>
                 <w:color w:val="0B2545"/>
@@ -686,7 +686,7 @@
             </w:pPr>
             <w:r>
               <w:rPr>
-                <w:rFonts w:ascii="Calibri" w:hAnsi="Calibri"/>
+                <w:rFonts w:ascii="Pretendard" w:hAnsi="Pretendard" w:eastAsia="Pretendard"/>
                 <w:b w:val="0"/>
                 <w:i w:val="0"/>
                 <w:color w:val="000000"/>
@@ -713,7 +713,7 @@
             </w:pPr>
             <w:r>
               <w:rPr>
-                <w:rFonts w:ascii="Calibri" w:hAnsi="Calibri"/>
+                <w:rFonts w:ascii="Pretendard" w:hAnsi="Pretendard" w:eastAsia="Pretendard"/>
                 <w:b w:val="0"/>
                 <w:i w:val="0"/>
                 <w:color w:val="000000"/>
@@ -740,7 +740,7 @@
             </w:pPr>
             <w:r>
               <w:rPr>
-                <w:rFonts w:ascii="Calibri" w:hAnsi="Calibri"/>
+                <w:rFonts w:ascii="Pretendard" w:hAnsi="Pretendard" w:eastAsia="Pretendard"/>
                 <w:b w:val="0"/>
                 <w:i w:val="0"/>
                 <w:color w:val="000000"/>
@@ -769,7 +769,7 @@
             </w:pPr>
             <w:r>
               <w:rPr>
-                <w:rFonts w:ascii="Calibri" w:hAnsi="Calibri"/>
+                <w:rFonts w:ascii="Pretendard" w:hAnsi="Pretendard" w:eastAsia="Pretendard"/>
                 <w:b w:val="0"/>
                 <w:i w:val="0"/>
                 <w:color w:val="000000"/>
@@ -796,7 +796,7 @@
             </w:pPr>
             <w:r>
               <w:rPr>
-                <w:rFonts w:ascii="Calibri" w:hAnsi="Calibri"/>
+                <w:rFonts w:ascii="Pretendard" w:hAnsi="Pretendard" w:eastAsia="Pretendard"/>
                 <w:b w:val="0"/>
                 <w:i w:val="0"/>
                 <w:color w:val="000000"/>
@@ -823,7 +823,7 @@
             </w:pPr>
             <w:r>
               <w:rPr>
-                <w:rFonts w:ascii="Calibri" w:hAnsi="Calibri"/>
+                <w:rFonts w:ascii="Pretendard" w:hAnsi="Pretendard" w:eastAsia="Pretendard"/>
                 <w:b w:val="0"/>
                 <w:i w:val="0"/>
                 <w:color w:val="000000"/>
@@ -852,7 +852,7 @@
             </w:pPr>
             <w:r>
               <w:rPr>
-                <w:rFonts w:ascii="Calibri" w:hAnsi="Calibri"/>
+                <w:rFonts w:ascii="Pretendard" w:hAnsi="Pretendard" w:eastAsia="Pretendard"/>
                 <w:b w:val="0"/>
                 <w:i w:val="0"/>
                 <w:color w:val="000000"/>
@@ -879,7 +879,7 @@
             </w:pPr>
             <w:r>
               <w:rPr>
-                <w:rFonts w:ascii="Calibri" w:hAnsi="Calibri"/>
+                <w:rFonts w:ascii="Pretendard" w:hAnsi="Pretendard" w:eastAsia="Pretendard"/>
                 <w:b w:val="0"/>
                 <w:i w:val="0"/>
                 <w:color w:val="000000"/>
@@ -906,7 +906,7 @@
             </w:pPr>
             <w:r>
               <w:rPr>
-                <w:rFonts w:ascii="Calibri" w:hAnsi="Calibri"/>
+                <w:rFonts w:ascii="Pretendard" w:hAnsi="Pretendard" w:eastAsia="Pretendard"/>
                 <w:b w:val="0"/>
                 <w:i w:val="0"/>
                 <w:color w:val="000000"/>
@@ -935,7 +935,7 @@
             </w:pPr>
             <w:r>
               <w:rPr>
-                <w:rFonts w:ascii="Calibri" w:hAnsi="Calibri"/>
+                <w:rFonts w:ascii="Pretendard" w:hAnsi="Pretendard" w:eastAsia="Pretendard"/>
                 <w:b w:val="0"/>
                 <w:i w:val="0"/>
                 <w:color w:val="000000"/>
@@ -962,7 +962,7 @@
             </w:pPr>
             <w:r>
               <w:rPr>
-                <w:rFonts w:ascii="Calibri" w:hAnsi="Calibri"/>
+                <w:rFonts w:ascii="Pretendard" w:hAnsi="Pretendard" w:eastAsia="Pretendard"/>
                 <w:b w:val="0"/>
                 <w:i w:val="0"/>
                 <w:color w:val="000000"/>
@@ -989,7 +989,7 @@
             </w:pPr>
             <w:r>
               <w:rPr>
-                <w:rFonts w:ascii="Calibri" w:hAnsi="Calibri"/>
+                <w:rFonts w:ascii="Pretendard" w:hAnsi="Pretendard" w:eastAsia="Pretendard"/>
                 <w:b w:val="0"/>
                 <w:i w:val="0"/>
                 <w:color w:val="000000"/>
@@ -1018,7 +1018,7 @@
             </w:pPr>
             <w:r>
               <w:rPr>
-                <w:rFonts w:ascii="Calibri" w:hAnsi="Calibri"/>
+                <w:rFonts w:ascii="Pretendard" w:hAnsi="Pretendard" w:eastAsia="Pretendard"/>
                 <w:b w:val="0"/>
                 <w:i w:val="0"/>
                 <w:color w:val="000000"/>
@@ -1045,7 +1045,7 @@
             </w:pPr>
             <w:r>
               <w:rPr>
-                <w:rFonts w:ascii="Calibri" w:hAnsi="Calibri"/>
+                <w:rFonts w:ascii="Pretendard" w:hAnsi="Pretendard" w:eastAsia="Pretendard"/>
                 <w:b w:val="0"/>
                 <w:i w:val="0"/>
                 <w:color w:val="000000"/>
@@ -1072,7 +1072,7 @@
             </w:pPr>
             <w:r>
               <w:rPr>
-                <w:rFonts w:ascii="Calibri" w:hAnsi="Calibri"/>
+                <w:rFonts w:ascii="Pretendard" w:hAnsi="Pretendard" w:eastAsia="Pretendard"/>
                 <w:b w:val="0"/>
                 <w:i w:val="0"/>
                 <w:color w:val="000000"/>
@@ -1091,7 +1091,7 @@
       </w:pPr>
       <w:r>
         <w:rPr>
-          <w:rFonts w:ascii="Calibri" w:hAnsi="Calibri"/>
+          <w:rFonts w:ascii="Pretendard" w:hAnsi="Pretendard" w:eastAsia="Pretendard"/>
           <w:b/>
           <w:i w:val="0"/>
           <w:color w:val="2E74B5"/>
@@ -1143,7 +1143,7 @@
             </w:pPr>
             <w:r>
               <w:rPr>
-                <w:rFonts w:ascii="Calibri" w:hAnsi="Calibri"/>
+                <w:rFonts w:ascii="Pretendard" w:hAnsi="Pretendard" w:eastAsia="Pretendard"/>
                 <w:b/>
                 <w:i w:val="0"/>
                 <w:color w:val="0B2545"/>
@@ -1171,7 +1171,7 @@
             </w:pPr>
             <w:r>
               <w:rPr>
-                <w:rFonts w:ascii="Calibri" w:hAnsi="Calibri"/>
+                <w:rFonts w:ascii="Pretendard" w:hAnsi="Pretendard" w:eastAsia="Pretendard"/>
                 <w:b/>
                 <w:i w:val="0"/>
                 <w:color w:val="0B2545"/>
@@ -1199,7 +1199,7 @@
             </w:pPr>
             <w:r>
               <w:rPr>
-                <w:rFonts w:ascii="Calibri" w:hAnsi="Calibri"/>
+                <w:rFonts w:ascii="Pretendard" w:hAnsi="Pretendard" w:eastAsia="Pretendard"/>
                 <w:b/>
                 <w:i w:val="0"/>
                 <w:color w:val="0B2545"/>
@@ -1227,7 +1227,7 @@
             </w:pPr>
             <w:r>
               <w:rPr>
-                <w:rFonts w:ascii="Calibri" w:hAnsi="Calibri"/>
+                <w:rFonts w:ascii="Pretendard" w:hAnsi="Pretendard" w:eastAsia="Pretendard"/>
                 <w:b/>
                 <w:i w:val="0"/>
                 <w:color w:val="0B2545"/>
@@ -1256,7 +1256,7 @@
             </w:pPr>
             <w:r>
               <w:rPr>
-                <w:rFonts w:ascii="Calibri" w:hAnsi="Calibri"/>
+                <w:rFonts w:ascii="Pretendard" w:hAnsi="Pretendard" w:eastAsia="Pretendard"/>
                 <w:b w:val="0"/>
                 <w:i w:val="0"/>
                 <w:color w:val="000000"/>
@@ -1283,7 +1283,7 @@
             </w:pPr>
             <w:r>
               <w:rPr>
-                <w:rFonts w:ascii="Calibri" w:hAnsi="Calibri"/>
+                <w:rFonts w:ascii="Pretendard" w:hAnsi="Pretendard" w:eastAsia="Pretendard"/>
                 <w:b w:val="0"/>
                 <w:i w:val="0"/>
                 <w:color w:val="000000"/>
@@ -1310,7 +1310,7 @@
             </w:pPr>
             <w:r>
               <w:rPr>
-                <w:rFonts w:ascii="Calibri" w:hAnsi="Calibri"/>
+                <w:rFonts w:ascii="Pretendard" w:hAnsi="Pretendard" w:eastAsia="Pretendard"/>
                 <w:b w:val="0"/>
                 <w:i w:val="0"/>
                 <w:color w:val="000000"/>
@@ -1337,7 +1337,7 @@
             </w:pPr>
             <w:r>
               <w:rPr>
-                <w:rFonts w:ascii="Calibri" w:hAnsi="Calibri"/>
+                <w:rFonts w:ascii="Pretendard" w:hAnsi="Pretendard" w:eastAsia="Pretendard"/>
                 <w:b w:val="0"/>
                 <w:i w:val="0"/>
                 <w:color w:val="000000"/>
@@ -1366,7 +1366,7 @@
             </w:pPr>
             <w:r>
               <w:rPr>
-                <w:rFonts w:ascii="Calibri" w:hAnsi="Calibri"/>
+                <w:rFonts w:ascii="Pretendard" w:hAnsi="Pretendard" w:eastAsia="Pretendard"/>
                 <w:b w:val="0"/>
                 <w:i w:val="0"/>
                 <w:color w:val="000000"/>
@@ -1393,7 +1393,7 @@
             </w:pPr>
             <w:r>
               <w:rPr>
-                <w:rFonts w:ascii="Calibri" w:hAnsi="Calibri"/>
+                <w:rFonts w:ascii="Pretendard" w:hAnsi="Pretendard" w:eastAsia="Pretendard"/>
                 <w:b w:val="0"/>
                 <w:i w:val="0"/>
                 <w:color w:val="000000"/>
@@ -1420,7 +1420,7 @@
             </w:pPr>
             <w:r>
               <w:rPr>
-                <w:rFonts w:ascii="Calibri" w:hAnsi="Calibri"/>
+                <w:rFonts w:ascii="Pretendard" w:hAnsi="Pretendard" w:eastAsia="Pretendard"/>
                 <w:b w:val="0"/>
                 <w:i w:val="0"/>
                 <w:color w:val="000000"/>
@@ -1447,7 +1447,7 @@
             </w:pPr>
             <w:r>
               <w:rPr>
-                <w:rFonts w:ascii="Calibri" w:hAnsi="Calibri"/>
+                <w:rFonts w:ascii="Pretendard" w:hAnsi="Pretendard" w:eastAsia="Pretendard"/>
                 <w:b w:val="0"/>
                 <w:i w:val="0"/>
                 <w:color w:val="000000"/>
@@ -1476,7 +1476,7 @@
             </w:pPr>
             <w:r>
               <w:rPr>
-                <w:rFonts w:ascii="Calibri" w:hAnsi="Calibri"/>
+                <w:rFonts w:ascii="Pretendard" w:hAnsi="Pretendard" w:eastAsia="Pretendard"/>
                 <w:b w:val="0"/>
                 <w:i w:val="0"/>
                 <w:color w:val="000000"/>
@@ -1503,7 +1503,7 @@
             </w:pPr>
             <w:r>
               <w:rPr>
-                <w:rFonts w:ascii="Calibri" w:hAnsi="Calibri"/>
+                <w:rFonts w:ascii="Pretendard" w:hAnsi="Pretendard" w:eastAsia="Pretendard"/>
                 <w:b w:val="0"/>
                 <w:i w:val="0"/>
                 <w:color w:val="000000"/>
@@ -1530,7 +1530,7 @@
             </w:pPr>
             <w:r>
               <w:rPr>
-                <w:rFonts w:ascii="Calibri" w:hAnsi="Calibri"/>
+                <w:rFonts w:ascii="Pretendard" w:hAnsi="Pretendard" w:eastAsia="Pretendard"/>
                 <w:b w:val="0"/>
                 <w:i w:val="0"/>
                 <w:color w:val="000000"/>
@@ -1557,7 +1557,7 @@
             </w:pPr>
             <w:r>
               <w:rPr>
-                <w:rFonts w:ascii="Calibri" w:hAnsi="Calibri"/>
+                <w:rFonts w:ascii="Pretendard" w:hAnsi="Pretendard" w:eastAsia="Pretendard"/>
                 <w:b w:val="0"/>
                 <w:i w:val="0"/>
                 <w:color w:val="000000"/>
@@ -1576,7 +1576,7 @@
       </w:pPr>
       <w:r>
         <w:rPr>
-          <w:rFonts w:ascii="Calibri" w:hAnsi="Calibri"/>
+          <w:rFonts w:ascii="Pretendard" w:hAnsi="Pretendard" w:eastAsia="Pretendard"/>
           <w:b/>
           <w:i w:val="0"/>
           <w:color w:val="2E74B5"/>
@@ -1591,7 +1591,7 @@
       </w:pPr>
       <w:r>
         <w:rPr>
-          <w:rFonts w:ascii="Calibri" w:hAnsi="Calibri"/>
+          <w:rFonts w:ascii="Pretendard" w:hAnsi="Pretendard" w:eastAsia="Pretendard"/>
           <w:b w:val="0"/>
           <w:i w:val="0"/>
           <w:color w:val="000000"/>
@@ -1641,7 +1641,7 @@
             </w:pPr>
             <w:r>
               <w:rPr>
-                <w:rFonts w:ascii="Calibri" w:hAnsi="Calibri"/>
+                <w:rFonts w:ascii="Pretendard" w:hAnsi="Pretendard" w:eastAsia="Pretendard"/>
                 <w:b/>
                 <w:i w:val="0"/>
                 <w:color w:val="0B2545"/>
@@ -1669,7 +1669,7 @@
             </w:pPr>
             <w:r>
               <w:rPr>
-                <w:rFonts w:ascii="Calibri" w:hAnsi="Calibri"/>
+                <w:rFonts w:ascii="Pretendard" w:hAnsi="Pretendard" w:eastAsia="Pretendard"/>
                 <w:b/>
                 <w:i w:val="0"/>
                 <w:color w:val="0B2545"/>
@@ -1698,7 +1698,7 @@
             </w:pPr>
             <w:r>
               <w:rPr>
-                <w:rFonts w:ascii="Calibri" w:hAnsi="Calibri"/>
+                <w:rFonts w:ascii="Pretendard" w:hAnsi="Pretendard" w:eastAsia="Pretendard"/>
                 <w:b w:val="0"/>
                 <w:i w:val="0"/>
                 <w:color w:val="000000"/>
@@ -1725,7 +1725,7 @@
             </w:pPr>
             <w:r>
               <w:rPr>
-                <w:rFonts w:ascii="Calibri" w:hAnsi="Calibri"/>
+                <w:rFonts w:ascii="Pretendard" w:hAnsi="Pretendard" w:eastAsia="Pretendard"/>
                 <w:b w:val="0"/>
                 <w:i w:val="0"/>
                 <w:color w:val="000000"/>
@@ -1754,7 +1754,7 @@
             </w:pPr>
             <w:r>
               <w:rPr>
-                <w:rFonts w:ascii="Calibri" w:hAnsi="Calibri"/>
+                <w:rFonts w:ascii="Pretendard" w:hAnsi="Pretendard" w:eastAsia="Pretendard"/>
                 <w:b w:val="0"/>
                 <w:i w:val="0"/>
                 <w:color w:val="000000"/>
@@ -1781,7 +1781,7 @@
             </w:pPr>
             <w:r>
               <w:rPr>
-                <w:rFonts w:ascii="Calibri" w:hAnsi="Calibri"/>
+                <w:rFonts w:ascii="Pretendard" w:hAnsi="Pretendard" w:eastAsia="Pretendard"/>
                 <w:b w:val="0"/>
                 <w:i w:val="0"/>
                 <w:color w:val="000000"/>
@@ -1810,7 +1810,7 @@
             </w:pPr>
             <w:r>
               <w:rPr>
-                <w:rFonts w:ascii="Calibri" w:hAnsi="Calibri"/>
+                <w:rFonts w:ascii="Pretendard" w:hAnsi="Pretendard" w:eastAsia="Pretendard"/>
                 <w:b w:val="0"/>
                 <w:i w:val="0"/>
                 <w:color w:val="000000"/>
@@ -1837,7 +1837,7 @@
             </w:pPr>
             <w:r>
               <w:rPr>
-                <w:rFonts w:ascii="Calibri" w:hAnsi="Calibri"/>
+                <w:rFonts w:ascii="Pretendard" w:hAnsi="Pretendard" w:eastAsia="Pretendard"/>
                 <w:b w:val="0"/>
                 <w:i w:val="0"/>
                 <w:color w:val="000000"/>
@@ -1866,7 +1866,7 @@
             </w:pPr>
             <w:r>
               <w:rPr>
-                <w:rFonts w:ascii="Calibri" w:hAnsi="Calibri"/>
+                <w:rFonts w:ascii="Pretendard" w:hAnsi="Pretendard" w:eastAsia="Pretendard"/>
                 <w:b w:val="0"/>
                 <w:i w:val="0"/>
                 <w:color w:val="000000"/>
@@ -1893,7 +1893,7 @@
             </w:pPr>
             <w:r>
               <w:rPr>
-                <w:rFonts w:ascii="Calibri" w:hAnsi="Calibri"/>
+                <w:rFonts w:ascii="Pretendard" w:hAnsi="Pretendard" w:eastAsia="Pretendard"/>
                 <w:b w:val="0"/>
                 <w:i w:val="0"/>
                 <w:color w:val="000000"/>
@@ -1912,7 +1912,7 @@
       </w:pPr>
       <w:r>
         <w:rPr>
-          <w:rFonts w:ascii="Calibri" w:hAnsi="Calibri"/>
+          <w:rFonts w:ascii="Pretendard" w:hAnsi="Pretendard" w:eastAsia="Pretendard"/>
           <w:b/>
           <w:i w:val="0"/>
           <w:color w:val="2E74B5"/>
@@ -1927,13 +1927,13 @@
       </w:pPr>
       <w:r>
         <w:rPr>
-          <w:rFonts w:ascii="Calibri" w:hAnsi="Calibri"/>
+          <w:rFonts w:ascii="Pretendard" w:hAnsi="Pretendard" w:eastAsia="Pretendard"/>
           <w:b w:val="0"/>
           <w:i w:val="0"/>
           <w:color w:val="000000"/>
           <w:sz w:val="22"/>
         </w:rPr>
-        <w:t>RecallGuard also uses the Korea Data Portal dataset 산업통상부_국가기술표준원_제품안전_국내리콜정보 from the Ministry of Trade, Industry and Energy / Korean Agency for Technology and Standards. The raw CP949 CSV was downloaded from data.go.kr, normalized to UTF-8, and converted into the evidence schema used by the Task Agent.</w:t>
+        <w:t>RecallGuard also uses the Korea Data Portal KATS domestic product safety recall dataset from the Ministry of Trade, Industry and Energy / Korean Agency for Technology and Standards. The raw CP949 CSV was downloaded from data.go.kr, normalized to UTF-8, and converted into the evidence schema used by the Task Agent.</w:t>
       </w:r>
     </w:p>
     <w:tbl>
@@ -1977,7 +1977,7 @@
             </w:pPr>
             <w:r>
               <w:rPr>
-                <w:rFonts w:ascii="Calibri" w:hAnsi="Calibri"/>
+                <w:rFonts w:ascii="Pretendard" w:hAnsi="Pretendard" w:eastAsia="Pretendard"/>
                 <w:b/>
                 <w:i w:val="0"/>
                 <w:color w:val="0B2545"/>
@@ -2005,7 +2005,7 @@
             </w:pPr>
             <w:r>
               <w:rPr>
-                <w:rFonts w:ascii="Calibri" w:hAnsi="Calibri"/>
+                <w:rFonts w:ascii="Pretendard" w:hAnsi="Pretendard" w:eastAsia="Pretendard"/>
                 <w:b/>
                 <w:i w:val="0"/>
                 <w:color w:val="0B2545"/>
@@ -2034,7 +2034,7 @@
             </w:pPr>
             <w:r>
               <w:rPr>
-                <w:rFonts w:ascii="Calibri" w:hAnsi="Calibri"/>
+                <w:rFonts w:ascii="Pretendard" w:hAnsi="Pretendard" w:eastAsia="Pretendard"/>
                 <w:b w:val="0"/>
                 <w:i w:val="0"/>
                 <w:color w:val="000000"/>
@@ -2061,7 +2061,7 @@
             </w:pPr>
             <w:r>
               <w:rPr>
-                <w:rFonts w:ascii="Calibri" w:hAnsi="Calibri"/>
+                <w:rFonts w:ascii="Pretendard" w:hAnsi="Pretendard" w:eastAsia="Pretendard"/>
                 <w:b w:val="0"/>
                 <w:i w:val="0"/>
                 <w:color w:val="000000"/>
@@ -2090,7 +2090,7 @@
             </w:pPr>
             <w:r>
               <w:rPr>
-                <w:rFonts w:ascii="Calibri" w:hAnsi="Calibri"/>
+                <w:rFonts w:ascii="Pretendard" w:hAnsi="Pretendard" w:eastAsia="Pretendard"/>
                 <w:b w:val="0"/>
                 <w:i w:val="0"/>
                 <w:color w:val="000000"/>
@@ -2117,7 +2117,7 @@
             </w:pPr>
             <w:r>
               <w:rPr>
-                <w:rFonts w:ascii="Calibri" w:hAnsi="Calibri"/>
+                <w:rFonts w:ascii="Pretendard" w:hAnsi="Pretendard" w:eastAsia="Pretendard"/>
                 <w:b w:val="0"/>
                 <w:i w:val="0"/>
                 <w:color w:val="000000"/>
@@ -2146,7 +2146,7 @@
             </w:pPr>
             <w:r>
               <w:rPr>
-                <w:rFonts w:ascii="Calibri" w:hAnsi="Calibri"/>
+                <w:rFonts w:ascii="Pretendard" w:hAnsi="Pretendard" w:eastAsia="Pretendard"/>
                 <w:b w:val="0"/>
                 <w:i w:val="0"/>
                 <w:color w:val="000000"/>
@@ -2173,7 +2173,7 @@
             </w:pPr>
             <w:r>
               <w:rPr>
-                <w:rFonts w:ascii="Calibri" w:hAnsi="Calibri"/>
+                <w:rFonts w:ascii="Pretendard" w:hAnsi="Pretendard" w:eastAsia="Pretendard"/>
                 <w:b w:val="0"/>
                 <w:i w:val="0"/>
                 <w:color w:val="000000"/>
@@ -2202,7 +2202,7 @@
             </w:pPr>
             <w:r>
               <w:rPr>
-                <w:rFonts w:ascii="Calibri" w:hAnsi="Calibri"/>
+                <w:rFonts w:ascii="Pretendard" w:hAnsi="Pretendard" w:eastAsia="Pretendard"/>
                 <w:b w:val="0"/>
                 <w:i w:val="0"/>
                 <w:color w:val="000000"/>
@@ -2229,7 +2229,7 @@
             </w:pPr>
             <w:r>
               <w:rPr>
-                <w:rFonts w:ascii="Calibri" w:hAnsi="Calibri"/>
+                <w:rFonts w:ascii="Pretendard" w:hAnsi="Pretendard" w:eastAsia="Pretendard"/>
                 <w:b w:val="0"/>
                 <w:i w:val="0"/>
                 <w:color w:val="000000"/>
@@ -2258,7 +2258,7 @@
             </w:pPr>
             <w:r>
               <w:rPr>
-                <w:rFonts w:ascii="Calibri" w:hAnsi="Calibri"/>
+                <w:rFonts w:ascii="Pretendard" w:hAnsi="Pretendard" w:eastAsia="Pretendard"/>
                 <w:b w:val="0"/>
                 <w:i w:val="0"/>
                 <w:color w:val="000000"/>
@@ -2285,7 +2285,7 @@
             </w:pPr>
             <w:r>
               <w:rPr>
-                <w:rFonts w:ascii="Calibri" w:hAnsi="Calibri"/>
+                <w:rFonts w:ascii="Pretendard" w:hAnsi="Pretendard" w:eastAsia="Pretendard"/>
                 <w:b w:val="0"/>
                 <w:i w:val="0"/>
                 <w:color w:val="000000"/>
@@ -2304,7 +2304,7 @@
       </w:pPr>
       <w:r>
         <w:rPr>
-          <w:rFonts w:ascii="Calibri" w:hAnsi="Calibri"/>
+          <w:rFonts w:ascii="Pretendard" w:hAnsi="Pretendard" w:eastAsia="Pretendard"/>
           <w:b/>
           <w:i w:val="0"/>
           <w:color w:val="2E74B5"/>
@@ -2355,7 +2355,7 @@
             </w:pPr>
             <w:r>
               <w:rPr>
-                <w:rFonts w:ascii="Calibri" w:hAnsi="Calibri"/>
+                <w:rFonts w:ascii="Pretendard" w:hAnsi="Pretendard" w:eastAsia="Pretendard"/>
                 <w:b/>
                 <w:i w:val="0"/>
                 <w:color w:val="0B2545"/>
@@ -2383,7 +2383,7 @@
             </w:pPr>
             <w:r>
               <w:rPr>
-                <w:rFonts w:ascii="Calibri" w:hAnsi="Calibri"/>
+                <w:rFonts w:ascii="Pretendard" w:hAnsi="Pretendard" w:eastAsia="Pretendard"/>
                 <w:b/>
                 <w:i w:val="0"/>
                 <w:color w:val="0B2545"/>
@@ -2411,7 +2411,7 @@
             </w:pPr>
             <w:r>
               <w:rPr>
-                <w:rFonts w:ascii="Calibri" w:hAnsi="Calibri"/>
+                <w:rFonts w:ascii="Pretendard" w:hAnsi="Pretendard" w:eastAsia="Pretendard"/>
                 <w:b/>
                 <w:i w:val="0"/>
                 <w:color w:val="0B2545"/>
@@ -2440,7 +2440,7 @@
             </w:pPr>
             <w:r>
               <w:rPr>
-                <w:rFonts w:ascii="Calibri" w:hAnsi="Calibri"/>
+                <w:rFonts w:ascii="Pretendard" w:hAnsi="Pretendard" w:eastAsia="Pretendard"/>
                 <w:b w:val="0"/>
                 <w:i w:val="0"/>
                 <w:color w:val="000000"/>
@@ -2467,7 +2467,7 @@
             </w:pPr>
             <w:r>
               <w:rPr>
-                <w:rFonts w:ascii="Calibri" w:hAnsi="Calibri"/>
+                <w:rFonts w:ascii="Pretendard" w:hAnsi="Pretendard" w:eastAsia="Pretendard"/>
                 <w:b w:val="0"/>
                 <w:i w:val="0"/>
                 <w:color w:val="000000"/>
@@ -2494,7 +2494,7 @@
             </w:pPr>
             <w:r>
               <w:rPr>
-                <w:rFonts w:ascii="Calibri" w:hAnsi="Calibri"/>
+                <w:rFonts w:ascii="Pretendard" w:hAnsi="Pretendard" w:eastAsia="Pretendard"/>
                 <w:b w:val="0"/>
                 <w:i w:val="0"/>
                 <w:color w:val="000000"/>
@@ -2523,7 +2523,7 @@
             </w:pPr>
             <w:r>
               <w:rPr>
-                <w:rFonts w:ascii="Calibri" w:hAnsi="Calibri"/>
+                <w:rFonts w:ascii="Pretendard" w:hAnsi="Pretendard" w:eastAsia="Pretendard"/>
                 <w:b w:val="0"/>
                 <w:i w:val="0"/>
                 <w:color w:val="000000"/>
@@ -2550,7 +2550,7 @@
             </w:pPr>
             <w:r>
               <w:rPr>
-                <w:rFonts w:ascii="Calibri" w:hAnsi="Calibri"/>
+                <w:rFonts w:ascii="Pretendard" w:hAnsi="Pretendard" w:eastAsia="Pretendard"/>
                 <w:b w:val="0"/>
                 <w:i w:val="0"/>
                 <w:color w:val="000000"/>
@@ -2577,7 +2577,7 @@
             </w:pPr>
             <w:r>
               <w:rPr>
-                <w:rFonts w:ascii="Calibri" w:hAnsi="Calibri"/>
+                <w:rFonts w:ascii="Pretendard" w:hAnsi="Pretendard" w:eastAsia="Pretendard"/>
                 <w:b w:val="0"/>
                 <w:i w:val="0"/>
                 <w:color w:val="000000"/>
@@ -2606,7 +2606,7 @@
             </w:pPr>
             <w:r>
               <w:rPr>
-                <w:rFonts w:ascii="Calibri" w:hAnsi="Calibri"/>
+                <w:rFonts w:ascii="Pretendard" w:hAnsi="Pretendard" w:eastAsia="Pretendard"/>
                 <w:b w:val="0"/>
                 <w:i w:val="0"/>
                 <w:color w:val="000000"/>
@@ -2633,7 +2633,7 @@
             </w:pPr>
             <w:r>
               <w:rPr>
-                <w:rFonts w:ascii="Calibri" w:hAnsi="Calibri"/>
+                <w:rFonts w:ascii="Pretendard" w:hAnsi="Pretendard" w:eastAsia="Pretendard"/>
                 <w:b w:val="0"/>
                 <w:i w:val="0"/>
                 <w:color w:val="000000"/>
@@ -2660,7 +2660,7 @@
             </w:pPr>
             <w:r>
               <w:rPr>
-                <w:rFonts w:ascii="Calibri" w:hAnsi="Calibri"/>
+                <w:rFonts w:ascii="Pretendard" w:hAnsi="Pretendard" w:eastAsia="Pretendard"/>
                 <w:b w:val="0"/>
                 <w:i w:val="0"/>
                 <w:color w:val="000000"/>
@@ -2679,7 +2679,7 @@
       </w:pPr>
       <w:r>
         <w:rPr>
-          <w:rFonts w:ascii="Calibri" w:hAnsi="Calibri"/>
+          <w:rFonts w:ascii="Pretendard" w:hAnsi="Pretendard" w:eastAsia="Pretendard"/>
           <w:b/>
           <w:i w:val="0"/>
           <w:color w:val="2E74B5"/>
@@ -2731,7 +2731,7 @@
             </w:pPr>
             <w:r>
               <w:rPr>
-                <w:rFonts w:ascii="Calibri" w:hAnsi="Calibri"/>
+                <w:rFonts w:ascii="Pretendard" w:hAnsi="Pretendard" w:eastAsia="Pretendard"/>
                 <w:b/>
                 <w:i w:val="0"/>
                 <w:color w:val="0B2545"/>
@@ -2759,7 +2759,7 @@
             </w:pPr>
             <w:r>
               <w:rPr>
-                <w:rFonts w:ascii="Calibri" w:hAnsi="Calibri"/>
+                <w:rFonts w:ascii="Pretendard" w:hAnsi="Pretendard" w:eastAsia="Pretendard"/>
                 <w:b/>
                 <w:i w:val="0"/>
                 <w:color w:val="0B2545"/>
@@ -2787,7 +2787,7 @@
             </w:pPr>
             <w:r>
               <w:rPr>
-                <w:rFonts w:ascii="Calibri" w:hAnsi="Calibri"/>
+                <w:rFonts w:ascii="Pretendard" w:hAnsi="Pretendard" w:eastAsia="Pretendard"/>
                 <w:b/>
                 <w:i w:val="0"/>
                 <w:color w:val="0B2545"/>
@@ -2815,7 +2815,7 @@
             </w:pPr>
             <w:r>
               <w:rPr>
-                <w:rFonts w:ascii="Calibri" w:hAnsi="Calibri"/>
+                <w:rFonts w:ascii="Pretendard" w:hAnsi="Pretendard" w:eastAsia="Pretendard"/>
                 <w:b/>
                 <w:i w:val="0"/>
                 <w:color w:val="0B2545"/>
@@ -2844,7 +2844,7 @@
             </w:pPr>
             <w:r>
               <w:rPr>
-                <w:rFonts w:ascii="Calibri" w:hAnsi="Calibri"/>
+                <w:rFonts w:ascii="Pretendard" w:hAnsi="Pretendard" w:eastAsia="Pretendard"/>
                 <w:b w:val="0"/>
                 <w:i w:val="0"/>
                 <w:color w:val="000000"/>
@@ -2871,7 +2871,7 @@
             </w:pPr>
             <w:r>
               <w:rPr>
-                <w:rFonts w:ascii="Calibri" w:hAnsi="Calibri"/>
+                <w:rFonts w:ascii="Pretendard" w:hAnsi="Pretendard" w:eastAsia="Pretendard"/>
                 <w:b w:val="0"/>
                 <w:i w:val="0"/>
                 <w:color w:val="000000"/>
@@ -2898,7 +2898,7 @@
             </w:pPr>
             <w:r>
               <w:rPr>
-                <w:rFonts w:ascii="Calibri" w:hAnsi="Calibri"/>
+                <w:rFonts w:ascii="Pretendard" w:hAnsi="Pretendard" w:eastAsia="Pretendard"/>
                 <w:b w:val="0"/>
                 <w:i w:val="0"/>
                 <w:color w:val="000000"/>
@@ -2925,7 +2925,7 @@
             </w:pPr>
             <w:r>
               <w:rPr>
-                <w:rFonts w:ascii="Calibri" w:hAnsi="Calibri"/>
+                <w:rFonts w:ascii="Pretendard" w:hAnsi="Pretendard" w:eastAsia="Pretendard"/>
                 <w:b w:val="0"/>
                 <w:i w:val="0"/>
                 <w:color w:val="000000"/>
@@ -2954,7 +2954,7 @@
             </w:pPr>
             <w:r>
               <w:rPr>
-                <w:rFonts w:ascii="Calibri" w:hAnsi="Calibri"/>
+                <w:rFonts w:ascii="Pretendard" w:hAnsi="Pretendard" w:eastAsia="Pretendard"/>
                 <w:b w:val="0"/>
                 <w:i w:val="0"/>
                 <w:color w:val="000000"/>
@@ -2981,7 +2981,7 @@
             </w:pPr>
             <w:r>
               <w:rPr>
-                <w:rFonts w:ascii="Calibri" w:hAnsi="Calibri"/>
+                <w:rFonts w:ascii="Pretendard" w:hAnsi="Pretendard" w:eastAsia="Pretendard"/>
                 <w:b w:val="0"/>
                 <w:i w:val="0"/>
                 <w:color w:val="000000"/>
@@ -3008,7 +3008,7 @@
             </w:pPr>
             <w:r>
               <w:rPr>
-                <w:rFonts w:ascii="Calibri" w:hAnsi="Calibri"/>
+                <w:rFonts w:ascii="Pretendard" w:hAnsi="Pretendard" w:eastAsia="Pretendard"/>
                 <w:b w:val="0"/>
                 <w:i w:val="0"/>
                 <w:color w:val="000000"/>
@@ -3035,7 +3035,7 @@
             </w:pPr>
             <w:r>
               <w:rPr>
-                <w:rFonts w:ascii="Calibri" w:hAnsi="Calibri"/>
+                <w:rFonts w:ascii="Pretendard" w:hAnsi="Pretendard" w:eastAsia="Pretendard"/>
                 <w:b w:val="0"/>
                 <w:i w:val="0"/>
                 <w:color w:val="000000"/>
@@ -3064,7 +3064,7 @@
             </w:pPr>
             <w:r>
               <w:rPr>
-                <w:rFonts w:ascii="Calibri" w:hAnsi="Calibri"/>
+                <w:rFonts w:ascii="Pretendard" w:hAnsi="Pretendard" w:eastAsia="Pretendard"/>
                 <w:b w:val="0"/>
                 <w:i w:val="0"/>
                 <w:color w:val="000000"/>
@@ -3091,7 +3091,7 @@
             </w:pPr>
             <w:r>
               <w:rPr>
-                <w:rFonts w:ascii="Calibri" w:hAnsi="Calibri"/>
+                <w:rFonts w:ascii="Pretendard" w:hAnsi="Pretendard" w:eastAsia="Pretendard"/>
                 <w:b w:val="0"/>
                 <w:i w:val="0"/>
                 <w:color w:val="000000"/>
@@ -3118,7 +3118,7 @@
             </w:pPr>
             <w:r>
               <w:rPr>
-                <w:rFonts w:ascii="Calibri" w:hAnsi="Calibri"/>
+                <w:rFonts w:ascii="Pretendard" w:hAnsi="Pretendard" w:eastAsia="Pretendard"/>
                 <w:b w:val="0"/>
                 <w:i w:val="0"/>
                 <w:color w:val="000000"/>
@@ -3145,7 +3145,7 @@
             </w:pPr>
             <w:r>
               <w:rPr>
-                <w:rFonts w:ascii="Calibri" w:hAnsi="Calibri"/>
+                <w:rFonts w:ascii="Pretendard" w:hAnsi="Pretendard" w:eastAsia="Pretendard"/>
                 <w:b w:val="0"/>
                 <w:i w:val="0"/>
                 <w:color w:val="000000"/>
@@ -3174,7 +3174,7 @@
             </w:pPr>
             <w:r>
               <w:rPr>
-                <w:rFonts w:ascii="Calibri" w:hAnsi="Calibri"/>
+                <w:rFonts w:ascii="Pretendard" w:hAnsi="Pretendard" w:eastAsia="Pretendard"/>
                 <w:b w:val="0"/>
                 <w:i w:val="0"/>
                 <w:color w:val="000000"/>
@@ -3201,7 +3201,7 @@
             </w:pPr>
             <w:r>
               <w:rPr>
-                <w:rFonts w:ascii="Calibri" w:hAnsi="Calibri"/>
+                <w:rFonts w:ascii="Pretendard" w:hAnsi="Pretendard" w:eastAsia="Pretendard"/>
                 <w:b w:val="0"/>
                 <w:i w:val="0"/>
                 <w:color w:val="000000"/>
@@ -3228,7 +3228,7 @@
             </w:pPr>
             <w:r>
               <w:rPr>
-                <w:rFonts w:ascii="Calibri" w:hAnsi="Calibri"/>
+                <w:rFonts w:ascii="Pretendard" w:hAnsi="Pretendard" w:eastAsia="Pretendard"/>
                 <w:b w:val="0"/>
                 <w:i w:val="0"/>
                 <w:color w:val="000000"/>
@@ -3255,7 +3255,7 @@
             </w:pPr>
             <w:r>
               <w:rPr>
-                <w:rFonts w:ascii="Calibri" w:hAnsi="Calibri"/>
+                <w:rFonts w:ascii="Pretendard" w:hAnsi="Pretendard" w:eastAsia="Pretendard"/>
                 <w:b w:val="0"/>
                 <w:i w:val="0"/>
                 <w:color w:val="000000"/>
@@ -3284,7 +3284,7 @@
             </w:pPr>
             <w:r>
               <w:rPr>
-                <w:rFonts w:ascii="Calibri" w:hAnsi="Calibri"/>
+                <w:rFonts w:ascii="Pretendard" w:hAnsi="Pretendard" w:eastAsia="Pretendard"/>
                 <w:b w:val="0"/>
                 <w:i w:val="0"/>
                 <w:color w:val="000000"/>
@@ -3311,7 +3311,7 @@
             </w:pPr>
             <w:r>
               <w:rPr>
-                <w:rFonts w:ascii="Calibri" w:hAnsi="Calibri"/>
+                <w:rFonts w:ascii="Pretendard" w:hAnsi="Pretendard" w:eastAsia="Pretendard"/>
                 <w:b w:val="0"/>
                 <w:i w:val="0"/>
                 <w:color w:val="000000"/>
@@ -3338,7 +3338,7 @@
             </w:pPr>
             <w:r>
               <w:rPr>
-                <w:rFonts w:ascii="Calibri" w:hAnsi="Calibri"/>
+                <w:rFonts w:ascii="Pretendard" w:hAnsi="Pretendard" w:eastAsia="Pretendard"/>
                 <w:b w:val="0"/>
                 <w:i w:val="0"/>
                 <w:color w:val="000000"/>
@@ -3365,7 +3365,7 @@
             </w:pPr>
             <w:r>
               <w:rPr>
-                <w:rFonts w:ascii="Calibri" w:hAnsi="Calibri"/>
+                <w:rFonts w:ascii="Pretendard" w:hAnsi="Pretendard" w:eastAsia="Pretendard"/>
                 <w:b w:val="0"/>
                 <w:i w:val="0"/>
                 <w:color w:val="000000"/>
@@ -3414,7 +3414,7 @@
             </w:pPr>
             <w:r>
               <w:rPr>
-                <w:rFonts w:ascii="Calibri" w:hAnsi="Calibri"/>
+                <w:rFonts w:ascii="Pretendard" w:hAnsi="Pretendard" w:eastAsia="Pretendard"/>
                 <w:b/>
                 <w:i w:val="0"/>
                 <w:color w:val="0B2545"/>
@@ -3429,7 +3429,7 @@
             </w:pPr>
             <w:r>
               <w:rPr>
-                <w:rFonts w:ascii="Calibri" w:hAnsi="Calibri"/>
+                <w:rFonts w:ascii="Pretendard" w:hAnsi="Pretendard" w:eastAsia="Pretendard"/>
                 <w:b w:val="0"/>
                 <w:i w:val="0"/>
                 <w:color w:val="000000"/>
@@ -3448,7 +3448,7 @@
       </w:pPr>
       <w:r>
         <w:rPr>
-          <w:rFonts w:ascii="Calibri" w:hAnsi="Calibri"/>
+          <w:rFonts w:ascii="Pretendard" w:hAnsi="Pretendard" w:eastAsia="Pretendard"/>
           <w:b/>
           <w:i w:val="0"/>
           <w:color w:val="2E74B5"/>
@@ -3463,7 +3463,7 @@
       </w:pPr>
       <w:r>
         <w:rPr>
-          <w:rFonts w:ascii="Calibri" w:hAnsi="Calibri"/>
+          <w:rFonts w:ascii="Pretendard" w:hAnsi="Pretendard" w:eastAsia="Pretendard"/>
           <w:b w:val="0"/>
           <w:i w:val="0"/>
           <w:color w:val="000000"/>
@@ -3514,7 +3514,7 @@
             </w:pPr>
             <w:r>
               <w:rPr>
-                <w:rFonts w:ascii="Calibri" w:hAnsi="Calibri"/>
+                <w:rFonts w:ascii="Pretendard" w:hAnsi="Pretendard" w:eastAsia="Pretendard"/>
                 <w:b/>
                 <w:i w:val="0"/>
                 <w:color w:val="0B2545"/>
@@ -3542,7 +3542,7 @@
             </w:pPr>
             <w:r>
               <w:rPr>
-                <w:rFonts w:ascii="Calibri" w:hAnsi="Calibri"/>
+                <w:rFonts w:ascii="Pretendard" w:hAnsi="Pretendard" w:eastAsia="Pretendard"/>
                 <w:b/>
                 <w:i w:val="0"/>
                 <w:color w:val="0B2545"/>
@@ -3570,7 +3570,7 @@
             </w:pPr>
             <w:r>
               <w:rPr>
-                <w:rFonts w:ascii="Calibri" w:hAnsi="Calibri"/>
+                <w:rFonts w:ascii="Pretendard" w:hAnsi="Pretendard" w:eastAsia="Pretendard"/>
                 <w:b/>
                 <w:i w:val="0"/>
                 <w:color w:val="0B2545"/>
@@ -3599,7 +3599,7 @@
             </w:pPr>
             <w:r>
               <w:rPr>
-                <w:rFonts w:ascii="Calibri" w:hAnsi="Calibri"/>
+                <w:rFonts w:ascii="Pretendard" w:hAnsi="Pretendard" w:eastAsia="Pretendard"/>
                 <w:b w:val="0"/>
                 <w:i w:val="0"/>
                 <w:color w:val="000000"/>
@@ -3626,7 +3626,7 @@
             </w:pPr>
             <w:r>
               <w:rPr>
-                <w:rFonts w:ascii="Calibri" w:hAnsi="Calibri"/>
+                <w:rFonts w:ascii="Pretendard" w:hAnsi="Pretendard" w:eastAsia="Pretendard"/>
                 <w:b w:val="0"/>
                 <w:i w:val="0"/>
                 <w:color w:val="000000"/>
@@ -3653,7 +3653,7 @@
             </w:pPr>
             <w:r>
               <w:rPr>
-                <w:rFonts w:ascii="Calibri" w:hAnsi="Calibri"/>
+                <w:rFonts w:ascii="Pretendard" w:hAnsi="Pretendard" w:eastAsia="Pretendard"/>
                 <w:b w:val="0"/>
                 <w:i w:val="0"/>
                 <w:color w:val="000000"/>
@@ -3682,7 +3682,7 @@
             </w:pPr>
             <w:r>
               <w:rPr>
-                <w:rFonts w:ascii="Calibri" w:hAnsi="Calibri"/>
+                <w:rFonts w:ascii="Pretendard" w:hAnsi="Pretendard" w:eastAsia="Pretendard"/>
                 <w:b w:val="0"/>
                 <w:i w:val="0"/>
                 <w:color w:val="000000"/>
@@ -3709,7 +3709,7 @@
             </w:pPr>
             <w:r>
               <w:rPr>
-                <w:rFonts w:ascii="Calibri" w:hAnsi="Calibri"/>
+                <w:rFonts w:ascii="Pretendard" w:hAnsi="Pretendard" w:eastAsia="Pretendard"/>
                 <w:b w:val="0"/>
                 <w:i w:val="0"/>
                 <w:color w:val="000000"/>
@@ -3736,7 +3736,7 @@
             </w:pPr>
             <w:r>
               <w:rPr>
-                <w:rFonts w:ascii="Calibri" w:hAnsi="Calibri"/>
+                <w:rFonts w:ascii="Pretendard" w:hAnsi="Pretendard" w:eastAsia="Pretendard"/>
                 <w:b w:val="0"/>
                 <w:i w:val="0"/>
                 <w:color w:val="000000"/>
@@ -3765,7 +3765,7 @@
             </w:pPr>
             <w:r>
               <w:rPr>
-                <w:rFonts w:ascii="Calibri" w:hAnsi="Calibri"/>
+                <w:rFonts w:ascii="Pretendard" w:hAnsi="Pretendard" w:eastAsia="Pretendard"/>
                 <w:b w:val="0"/>
                 <w:i w:val="0"/>
                 <w:color w:val="000000"/>
@@ -3792,7 +3792,7 @@
             </w:pPr>
             <w:r>
               <w:rPr>
-                <w:rFonts w:ascii="Calibri" w:hAnsi="Calibri"/>
+                <w:rFonts w:ascii="Pretendard" w:hAnsi="Pretendard" w:eastAsia="Pretendard"/>
                 <w:b w:val="0"/>
                 <w:i w:val="0"/>
                 <w:color w:val="000000"/>
@@ -3819,7 +3819,7 @@
             </w:pPr>
             <w:r>
               <w:rPr>
-                <w:rFonts w:ascii="Calibri" w:hAnsi="Calibri"/>
+                <w:rFonts w:ascii="Pretendard" w:hAnsi="Pretendard" w:eastAsia="Pretendard"/>
                 <w:b w:val="0"/>
                 <w:i w:val="0"/>
                 <w:color w:val="000000"/>
@@ -3848,7 +3848,7 @@
             </w:pPr>
             <w:r>
               <w:rPr>
-                <w:rFonts w:ascii="Calibri" w:hAnsi="Calibri"/>
+                <w:rFonts w:ascii="Pretendard" w:hAnsi="Pretendard" w:eastAsia="Pretendard"/>
                 <w:b w:val="0"/>
                 <w:i w:val="0"/>
                 <w:color w:val="000000"/>
@@ -3875,7 +3875,7 @@
             </w:pPr>
             <w:r>
               <w:rPr>
-                <w:rFonts w:ascii="Calibri" w:hAnsi="Calibri"/>
+                <w:rFonts w:ascii="Pretendard" w:hAnsi="Pretendard" w:eastAsia="Pretendard"/>
                 <w:b w:val="0"/>
                 <w:i w:val="0"/>
                 <w:color w:val="000000"/>
@@ -3902,7 +3902,7 @@
             </w:pPr>
             <w:r>
               <w:rPr>
-                <w:rFonts w:ascii="Calibri" w:hAnsi="Calibri"/>
+                <w:rFonts w:ascii="Pretendard" w:hAnsi="Pretendard" w:eastAsia="Pretendard"/>
                 <w:b w:val="0"/>
                 <w:i w:val="0"/>
                 <w:color w:val="000000"/>
@@ -3921,7 +3921,7 @@
       </w:pPr>
       <w:r>
         <w:rPr>
-          <w:rFonts w:ascii="Calibri" w:hAnsi="Calibri"/>
+          <w:rFonts w:ascii="Pretendard" w:hAnsi="Pretendard" w:eastAsia="Pretendard"/>
           <w:b/>
           <w:i w:val="0"/>
           <w:color w:val="2E74B5"/>
@@ -3971,7 +3971,7 @@
             </w:pPr>
             <w:r>
               <w:rPr>
-                <w:rFonts w:ascii="Calibri" w:hAnsi="Calibri"/>
+                <w:rFonts w:ascii="Pretendard" w:hAnsi="Pretendard" w:eastAsia="Pretendard"/>
                 <w:b/>
                 <w:i w:val="0"/>
                 <w:color w:val="0B2545"/>
@@ -3999,7 +3999,7 @@
             </w:pPr>
             <w:r>
               <w:rPr>
-                <w:rFonts w:ascii="Calibri" w:hAnsi="Calibri"/>
+                <w:rFonts w:ascii="Pretendard" w:hAnsi="Pretendard" w:eastAsia="Pretendard"/>
                 <w:b/>
                 <w:i w:val="0"/>
                 <w:color w:val="0B2545"/>
@@ -4028,7 +4028,7 @@
             </w:pPr>
             <w:r>
               <w:rPr>
-                <w:rFonts w:ascii="Calibri" w:hAnsi="Calibri"/>
+                <w:rFonts w:ascii="Pretendard" w:hAnsi="Pretendard" w:eastAsia="Pretendard"/>
                 <w:b w:val="0"/>
                 <w:i w:val="0"/>
                 <w:color w:val="000000"/>
@@ -4055,7 +4055,7 @@
             </w:pPr>
             <w:r>
               <w:rPr>
-                <w:rFonts w:ascii="Calibri" w:hAnsi="Calibri"/>
+                <w:rFonts w:ascii="Pretendard" w:hAnsi="Pretendard" w:eastAsia="Pretendard"/>
                 <w:b w:val="0"/>
                 <w:i w:val="0"/>
                 <w:color w:val="000000"/>
@@ -4084,7 +4084,7 @@
             </w:pPr>
             <w:r>
               <w:rPr>
-                <w:rFonts w:ascii="Calibri" w:hAnsi="Calibri"/>
+                <w:rFonts w:ascii="Pretendard" w:hAnsi="Pretendard" w:eastAsia="Pretendard"/>
                 <w:b w:val="0"/>
                 <w:i w:val="0"/>
                 <w:color w:val="000000"/>
@@ -4111,7 +4111,7 @@
             </w:pPr>
             <w:r>
               <w:rPr>
-                <w:rFonts w:ascii="Calibri" w:hAnsi="Calibri"/>
+                <w:rFonts w:ascii="Pretendard" w:hAnsi="Pretendard" w:eastAsia="Pretendard"/>
                 <w:b w:val="0"/>
                 <w:i w:val="0"/>
                 <w:color w:val="000000"/>
@@ -4140,7 +4140,7 @@
             </w:pPr>
             <w:r>
               <w:rPr>
-                <w:rFonts w:ascii="Calibri" w:hAnsi="Calibri"/>
+                <w:rFonts w:ascii="Pretendard" w:hAnsi="Pretendard" w:eastAsia="Pretendard"/>
                 <w:b w:val="0"/>
                 <w:i w:val="0"/>
                 <w:color w:val="000000"/>
@@ -4167,7 +4167,7 @@
             </w:pPr>
             <w:r>
               <w:rPr>
-                <w:rFonts w:ascii="Calibri" w:hAnsi="Calibri"/>
+                <w:rFonts w:ascii="Pretendard" w:hAnsi="Pretendard" w:eastAsia="Pretendard"/>
                 <w:b w:val="0"/>
                 <w:i w:val="0"/>
                 <w:color w:val="000000"/>
@@ -4196,7 +4196,7 @@
             </w:pPr>
             <w:r>
               <w:rPr>
-                <w:rFonts w:ascii="Calibri" w:hAnsi="Calibri"/>
+                <w:rFonts w:ascii="Pretendard" w:hAnsi="Pretendard" w:eastAsia="Pretendard"/>
                 <w:b w:val="0"/>
                 <w:i w:val="0"/>
                 <w:color w:val="000000"/>
@@ -4223,7 +4223,7 @@
             </w:pPr>
             <w:r>
               <w:rPr>
-                <w:rFonts w:ascii="Calibri" w:hAnsi="Calibri"/>
+                <w:rFonts w:ascii="Pretendard" w:hAnsi="Pretendard" w:eastAsia="Pretendard"/>
                 <w:b w:val="0"/>
                 <w:i w:val="0"/>
                 <w:color w:val="000000"/>
@@ -4252,7 +4252,7 @@
             </w:pPr>
             <w:r>
               <w:rPr>
-                <w:rFonts w:ascii="Calibri" w:hAnsi="Calibri"/>
+                <w:rFonts w:ascii="Pretendard" w:hAnsi="Pretendard" w:eastAsia="Pretendard"/>
                 <w:b w:val="0"/>
                 <w:i w:val="0"/>
                 <w:color w:val="000000"/>
@@ -4279,7 +4279,7 @@
             </w:pPr>
             <w:r>
               <w:rPr>
-                <w:rFonts w:ascii="Calibri" w:hAnsi="Calibri"/>
+                <w:rFonts w:ascii="Pretendard" w:hAnsi="Pretendard" w:eastAsia="Pretendard"/>
                 <w:b w:val="0"/>
                 <w:i w:val="0"/>
                 <w:color w:val="000000"/>
@@ -4308,7 +4308,7 @@
             </w:pPr>
             <w:r>
               <w:rPr>
-                <w:rFonts w:ascii="Calibri" w:hAnsi="Calibri"/>
+                <w:rFonts w:ascii="Pretendard" w:hAnsi="Pretendard" w:eastAsia="Pretendard"/>
                 <w:b w:val="0"/>
                 <w:i w:val="0"/>
                 <w:color w:val="000000"/>
@@ -4335,7 +4335,7 @@
             </w:pPr>
             <w:r>
               <w:rPr>
-                <w:rFonts w:ascii="Calibri" w:hAnsi="Calibri"/>
+                <w:rFonts w:ascii="Pretendard" w:hAnsi="Pretendard" w:eastAsia="Pretendard"/>
                 <w:b w:val="0"/>
                 <w:i w:val="0"/>
                 <w:color w:val="000000"/>
@@ -4354,7 +4354,7 @@
       </w:pPr>
       <w:r>
         <w:rPr>
-          <w:rFonts w:ascii="Calibri" w:hAnsi="Calibri"/>
+          <w:rFonts w:ascii="Pretendard" w:hAnsi="Pretendard" w:eastAsia="Pretendard"/>
           <w:b/>
           <w:i w:val="0"/>
           <w:color w:val="2E74B5"/>
@@ -4405,7 +4405,7 @@
             </w:pPr>
             <w:r>
               <w:rPr>
-                <w:rFonts w:ascii="Calibri" w:hAnsi="Calibri"/>
+                <w:rFonts w:ascii="Pretendard" w:hAnsi="Pretendard" w:eastAsia="Pretendard"/>
                 <w:b/>
                 <w:i w:val="0"/>
                 <w:color w:val="0B2545"/>
@@ -4433,7 +4433,7 @@
             </w:pPr>
             <w:r>
               <w:rPr>
-                <w:rFonts w:ascii="Calibri" w:hAnsi="Calibri"/>
+                <w:rFonts w:ascii="Pretendard" w:hAnsi="Pretendard" w:eastAsia="Pretendard"/>
                 <w:b/>
                 <w:i w:val="0"/>
                 <w:color w:val="0B2545"/>
@@ -4461,7 +4461,7 @@
             </w:pPr>
             <w:r>
               <w:rPr>
-                <w:rFonts w:ascii="Calibri" w:hAnsi="Calibri"/>
+                <w:rFonts w:ascii="Pretendard" w:hAnsi="Pretendard" w:eastAsia="Pretendard"/>
                 <w:b/>
                 <w:i w:val="0"/>
                 <w:color w:val="0B2545"/>
@@ -4490,7 +4490,7 @@
             </w:pPr>
             <w:r>
               <w:rPr>
-                <w:rFonts w:ascii="Calibri" w:hAnsi="Calibri"/>
+                <w:rFonts w:ascii="Pretendard" w:hAnsi="Pretendard" w:eastAsia="Pretendard"/>
                 <w:b w:val="0"/>
                 <w:i w:val="0"/>
                 <w:color w:val="000000"/>
@@ -4517,7 +4517,7 @@
             </w:pPr>
             <w:r>
               <w:rPr>
-                <w:rFonts w:ascii="Calibri" w:hAnsi="Calibri"/>
+                <w:rFonts w:ascii="Pretendard" w:hAnsi="Pretendard" w:eastAsia="Pretendard"/>
                 <w:b w:val="0"/>
                 <w:i w:val="0"/>
                 <w:color w:val="000000"/>
@@ -4544,7 +4544,7 @@
             </w:pPr>
             <w:r>
               <w:rPr>
-                <w:rFonts w:ascii="Calibri" w:hAnsi="Calibri"/>
+                <w:rFonts w:ascii="Pretendard" w:hAnsi="Pretendard" w:eastAsia="Pretendard"/>
                 <w:b w:val="0"/>
                 <w:i w:val="0"/>
                 <w:color w:val="000000"/>
@@ -4573,7 +4573,7 @@
             </w:pPr>
             <w:r>
               <w:rPr>
-                <w:rFonts w:ascii="Calibri" w:hAnsi="Calibri"/>
+                <w:rFonts w:ascii="Pretendard" w:hAnsi="Pretendard" w:eastAsia="Pretendard"/>
                 <w:b w:val="0"/>
                 <w:i w:val="0"/>
                 <w:color w:val="000000"/>
@@ -4600,7 +4600,7 @@
             </w:pPr>
             <w:r>
               <w:rPr>
-                <w:rFonts w:ascii="Calibri" w:hAnsi="Calibri"/>
+                <w:rFonts w:ascii="Pretendard" w:hAnsi="Pretendard" w:eastAsia="Pretendard"/>
                 <w:b w:val="0"/>
                 <w:i w:val="0"/>
                 <w:color w:val="000000"/>
@@ -4627,7 +4627,7 @@
             </w:pPr>
             <w:r>
               <w:rPr>
-                <w:rFonts w:ascii="Calibri" w:hAnsi="Calibri"/>
+                <w:rFonts w:ascii="Pretendard" w:hAnsi="Pretendard" w:eastAsia="Pretendard"/>
                 <w:b w:val="0"/>
                 <w:i w:val="0"/>
                 <w:color w:val="000000"/>
@@ -4656,7 +4656,7 @@
             </w:pPr>
             <w:r>
               <w:rPr>
-                <w:rFonts w:ascii="Calibri" w:hAnsi="Calibri"/>
+                <w:rFonts w:ascii="Pretendard" w:hAnsi="Pretendard" w:eastAsia="Pretendard"/>
                 <w:b w:val="0"/>
                 <w:i w:val="0"/>
                 <w:color w:val="000000"/>
@@ -4683,7 +4683,7 @@
             </w:pPr>
             <w:r>
               <w:rPr>
-                <w:rFonts w:ascii="Calibri" w:hAnsi="Calibri"/>
+                <w:rFonts w:ascii="Pretendard" w:hAnsi="Pretendard" w:eastAsia="Pretendard"/>
                 <w:b w:val="0"/>
                 <w:i w:val="0"/>
                 <w:color w:val="000000"/>
@@ -4710,7 +4710,7 @@
             </w:pPr>
             <w:r>
               <w:rPr>
-                <w:rFonts w:ascii="Calibri" w:hAnsi="Calibri"/>
+                <w:rFonts w:ascii="Pretendard" w:hAnsi="Pretendard" w:eastAsia="Pretendard"/>
                 <w:b w:val="0"/>
                 <w:i w:val="0"/>
                 <w:color w:val="000000"/>
@@ -4739,7 +4739,7 @@
             </w:pPr>
             <w:r>
               <w:rPr>
-                <w:rFonts w:ascii="Calibri" w:hAnsi="Calibri"/>
+                <w:rFonts w:ascii="Pretendard" w:hAnsi="Pretendard" w:eastAsia="Pretendard"/>
                 <w:b w:val="0"/>
                 <w:i w:val="0"/>
                 <w:color w:val="000000"/>
@@ -4766,7 +4766,7 @@
             </w:pPr>
             <w:r>
               <w:rPr>
-                <w:rFonts w:ascii="Calibri" w:hAnsi="Calibri"/>
+                <w:rFonts w:ascii="Pretendard" w:hAnsi="Pretendard" w:eastAsia="Pretendard"/>
                 <w:b w:val="0"/>
                 <w:i w:val="0"/>
                 <w:color w:val="000000"/>
@@ -4793,7 +4793,7 @@
             </w:pPr>
             <w:r>
               <w:rPr>
-                <w:rFonts w:ascii="Calibri" w:hAnsi="Calibri"/>
+                <w:rFonts w:ascii="Pretendard" w:hAnsi="Pretendard" w:eastAsia="Pretendard"/>
                 <w:b w:val="0"/>
                 <w:i w:val="0"/>
                 <w:color w:val="000000"/>
@@ -4812,7 +4812,7 @@
       </w:pPr>
       <w:r>
         <w:rPr>
-          <w:rFonts w:ascii="Calibri" w:hAnsi="Calibri"/>
+          <w:rFonts w:ascii="Pretendard" w:hAnsi="Pretendard" w:eastAsia="Pretendard"/>
           <w:b w:val="0"/>
           <w:i w:val="0"/>
           <w:color w:val="000000"/>
@@ -4827,7 +4827,7 @@
       </w:pPr>
       <w:r>
         <w:rPr>
-          <w:rFonts w:ascii="Calibri" w:hAnsi="Calibri"/>
+          <w:rFonts w:ascii="Pretendard" w:hAnsi="Pretendard" w:eastAsia="Pretendard"/>
           <w:b/>
           <w:i w:val="0"/>
           <w:color w:val="2E74B5"/>
@@ -4842,7 +4842,7 @@
       </w:pPr>
       <w:r>
         <w:rPr>
-          <w:rFonts w:ascii="Calibri" w:hAnsi="Calibri"/>
+          <w:rFonts w:ascii="Pretendard" w:hAnsi="Pretendard" w:eastAsia="Pretendard"/>
           <w:b w:val="0"/>
           <w:i w:val="0"/>
           <w:color w:val="000000"/>
@@ -4857,7 +4857,7 @@
       </w:pPr>
       <w:r>
         <w:rPr>
-          <w:rFonts w:ascii="Calibri" w:hAnsi="Calibri"/>
+          <w:rFonts w:ascii="Pretendard" w:hAnsi="Pretendard" w:eastAsia="Pretendard"/>
           <w:b/>
           <w:i w:val="0"/>
           <w:color w:val="2E74B5"/>
@@ -4872,7 +4872,7 @@
       </w:pPr>
       <w:r>
         <w:rPr>
-          <w:rFonts w:ascii="Calibri" w:hAnsi="Calibri"/>
+          <w:rFonts w:ascii="Pretendard" w:hAnsi="Pretendard" w:eastAsia="Pretendard"/>
           <w:b w:val="0"/>
           <w:i w:val="0"/>
           <w:color w:val="000000"/>
@@ -4922,7 +4922,7 @@
             </w:pPr>
             <w:r>
               <w:rPr>
-                <w:rFonts w:ascii="Calibri" w:hAnsi="Calibri"/>
+                <w:rFonts w:ascii="Pretendard" w:hAnsi="Pretendard" w:eastAsia="Pretendard"/>
                 <w:b/>
                 <w:i w:val="0"/>
                 <w:color w:val="0B2545"/>
@@ -4950,7 +4950,7 @@
             </w:pPr>
             <w:r>
               <w:rPr>
-                <w:rFonts w:ascii="Calibri" w:hAnsi="Calibri"/>
+                <w:rFonts w:ascii="Pretendard" w:hAnsi="Pretendard" w:eastAsia="Pretendard"/>
                 <w:b/>
                 <w:i w:val="0"/>
                 <w:color w:val="0B2545"/>
@@ -4979,7 +4979,7 @@
             </w:pPr>
             <w:r>
               <w:rPr>
-                <w:rFonts w:ascii="Calibri" w:hAnsi="Calibri"/>
+                <w:rFonts w:ascii="Pretendard" w:hAnsi="Pretendard" w:eastAsia="Pretendard"/>
                 <w:b w:val="0"/>
                 <w:i w:val="0"/>
                 <w:color w:val="000000"/>
@@ -5006,7 +5006,7 @@
             </w:pPr>
             <w:r>
               <w:rPr>
-                <w:rFonts w:ascii="Calibri" w:hAnsi="Calibri"/>
+                <w:rFonts w:ascii="Pretendard" w:hAnsi="Pretendard" w:eastAsia="Pretendard"/>
                 <w:b w:val="0"/>
                 <w:i w:val="0"/>
                 <w:color w:val="000000"/>
@@ -5035,7 +5035,7 @@
             </w:pPr>
             <w:r>
               <w:rPr>
-                <w:rFonts w:ascii="Calibri" w:hAnsi="Calibri"/>
+                <w:rFonts w:ascii="Pretendard" w:hAnsi="Pretendard" w:eastAsia="Pretendard"/>
                 <w:b w:val="0"/>
                 <w:i w:val="0"/>
                 <w:color w:val="000000"/>
@@ -5062,7 +5062,7 @@
             </w:pPr>
             <w:r>
               <w:rPr>
-                <w:rFonts w:ascii="Calibri" w:hAnsi="Calibri"/>
+                <w:rFonts w:ascii="Pretendard" w:hAnsi="Pretendard" w:eastAsia="Pretendard"/>
                 <w:b w:val="0"/>
                 <w:i w:val="0"/>
                 <w:color w:val="000000"/>
@@ -5091,7 +5091,7 @@
             </w:pPr>
             <w:r>
               <w:rPr>
-                <w:rFonts w:ascii="Calibri" w:hAnsi="Calibri"/>
+                <w:rFonts w:ascii="Pretendard" w:hAnsi="Pretendard" w:eastAsia="Pretendard"/>
                 <w:b w:val="0"/>
                 <w:i w:val="0"/>
                 <w:color w:val="000000"/>
@@ -5118,7 +5118,7 @@
             </w:pPr>
             <w:r>
               <w:rPr>
-                <w:rFonts w:ascii="Calibri" w:hAnsi="Calibri"/>
+                <w:rFonts w:ascii="Pretendard" w:hAnsi="Pretendard" w:eastAsia="Pretendard"/>
                 <w:b w:val="0"/>
                 <w:i w:val="0"/>
                 <w:color w:val="000000"/>
@@ -5147,7 +5147,7 @@
             </w:pPr>
             <w:r>
               <w:rPr>
-                <w:rFonts w:ascii="Calibri" w:hAnsi="Calibri"/>
+                <w:rFonts w:ascii="Pretendard" w:hAnsi="Pretendard" w:eastAsia="Pretendard"/>
                 <w:b w:val="0"/>
                 <w:i w:val="0"/>
                 <w:color w:val="000000"/>
@@ -5174,7 +5174,7 @@
             </w:pPr>
             <w:r>
               <w:rPr>
-                <w:rFonts w:ascii="Calibri" w:hAnsi="Calibri"/>
+                <w:rFonts w:ascii="Pretendard" w:hAnsi="Pretendard" w:eastAsia="Pretendard"/>
                 <w:b w:val="0"/>
                 <w:i w:val="0"/>
                 <w:color w:val="000000"/>
@@ -5203,7 +5203,7 @@
             </w:pPr>
             <w:r>
               <w:rPr>
-                <w:rFonts w:ascii="Calibri" w:hAnsi="Calibri"/>
+                <w:rFonts w:ascii="Pretendard" w:hAnsi="Pretendard" w:eastAsia="Pretendard"/>
                 <w:b w:val="0"/>
                 <w:i w:val="0"/>
                 <w:color w:val="000000"/>
@@ -5230,7 +5230,7 @@
             </w:pPr>
             <w:r>
               <w:rPr>
-                <w:rFonts w:ascii="Calibri" w:hAnsi="Calibri"/>
+                <w:rFonts w:ascii="Pretendard" w:hAnsi="Pretendard" w:eastAsia="Pretendard"/>
                 <w:b w:val="0"/>
                 <w:i w:val="0"/>
                 <w:color w:val="000000"/>
@@ -5259,7 +5259,7 @@
             </w:pPr>
             <w:r>
               <w:rPr>
-                <w:rFonts w:ascii="Calibri" w:hAnsi="Calibri"/>
+                <w:rFonts w:ascii="Pretendard" w:hAnsi="Pretendard" w:eastAsia="Pretendard"/>
                 <w:b w:val="0"/>
                 <w:i w:val="0"/>
                 <w:color w:val="000000"/>
@@ -5286,7 +5286,7 @@
             </w:pPr>
             <w:r>
               <w:rPr>
-                <w:rFonts w:ascii="Calibri" w:hAnsi="Calibri"/>
+                <w:rFonts w:ascii="Pretendard" w:hAnsi="Pretendard" w:eastAsia="Pretendard"/>
                 <w:b w:val="0"/>
                 <w:i w:val="0"/>
                 <w:color w:val="000000"/>
@@ -5315,7 +5315,7 @@
             </w:pPr>
             <w:r>
               <w:rPr>
-                <w:rFonts w:ascii="Calibri" w:hAnsi="Calibri"/>
+                <w:rFonts w:ascii="Pretendard" w:hAnsi="Pretendard" w:eastAsia="Pretendard"/>
                 <w:b w:val="0"/>
                 <w:i w:val="0"/>
                 <w:color w:val="000000"/>
@@ -5342,7 +5342,7 @@
             </w:pPr>
             <w:r>
               <w:rPr>
-                <w:rFonts w:ascii="Calibri" w:hAnsi="Calibri"/>
+                <w:rFonts w:ascii="Pretendard" w:hAnsi="Pretendard" w:eastAsia="Pretendard"/>
                 <w:b w:val="0"/>
                 <w:i w:val="0"/>
                 <w:color w:val="000000"/>
@@ -5371,7 +5371,7 @@
             </w:pPr>
             <w:r>
               <w:rPr>
-                <w:rFonts w:ascii="Calibri" w:hAnsi="Calibri"/>
+                <w:rFonts w:ascii="Pretendard" w:hAnsi="Pretendard" w:eastAsia="Pretendard"/>
                 <w:b w:val="0"/>
                 <w:i w:val="0"/>
                 <w:color w:val="000000"/>
@@ -5398,7 +5398,7 @@
             </w:pPr>
             <w:r>
               <w:rPr>
-                <w:rFonts w:ascii="Calibri" w:hAnsi="Calibri"/>
+                <w:rFonts w:ascii="Pretendard" w:hAnsi="Pretendard" w:eastAsia="Pretendard"/>
                 <w:b w:val="0"/>
                 <w:i w:val="0"/>
                 <w:color w:val="000000"/>
@@ -5427,7 +5427,7 @@
             </w:pPr>
             <w:r>
               <w:rPr>
-                <w:rFonts w:ascii="Calibri" w:hAnsi="Calibri"/>
+                <w:rFonts w:ascii="Pretendard" w:hAnsi="Pretendard" w:eastAsia="Pretendard"/>
                 <w:b w:val="0"/>
                 <w:i w:val="0"/>
                 <w:color w:val="000000"/>
@@ -5454,7 +5454,7 @@
             </w:pPr>
             <w:r>
               <w:rPr>
-                <w:rFonts w:ascii="Calibri" w:hAnsi="Calibri"/>
+                <w:rFonts w:ascii="Pretendard" w:hAnsi="Pretendard" w:eastAsia="Pretendard"/>
                 <w:b w:val="0"/>
                 <w:i w:val="0"/>
                 <w:color w:val="000000"/>
@@ -5483,7 +5483,7 @@
             </w:pPr>
             <w:r>
               <w:rPr>
-                <w:rFonts w:ascii="Calibri" w:hAnsi="Calibri"/>
+                <w:rFonts w:ascii="Pretendard" w:hAnsi="Pretendard" w:eastAsia="Pretendard"/>
                 <w:b w:val="0"/>
                 <w:i w:val="0"/>
                 <w:color w:val="000000"/>
@@ -5510,7 +5510,7 @@
             </w:pPr>
             <w:r>
               <w:rPr>
-                <w:rFonts w:ascii="Calibri" w:hAnsi="Calibri"/>
+                <w:rFonts w:ascii="Pretendard" w:hAnsi="Pretendard" w:eastAsia="Pretendard"/>
                 <w:b w:val="0"/>
                 <w:i w:val="0"/>
                 <w:color w:val="000000"/>
@@ -5559,7 +5559,7 @@
             </w:pPr>
             <w:r>
               <w:rPr>
-                <w:rFonts w:ascii="Calibri" w:hAnsi="Calibri"/>
+                <w:rFonts w:ascii="Pretendard" w:hAnsi="Pretendard" w:eastAsia="Pretendard"/>
                 <w:b/>
                 <w:i w:val="0"/>
                 <w:color w:val="0B2545"/>
@@ -5574,7 +5574,7 @@
             </w:pPr>
             <w:r>
               <w:rPr>
-                <w:rFonts w:ascii="Calibri" w:hAnsi="Calibri"/>
+                <w:rFonts w:ascii="Pretendard" w:hAnsi="Pretendard" w:eastAsia="Pretendard"/>
                 <w:b w:val="0"/>
                 <w:i w:val="0"/>
                 <w:color w:val="000000"/>
@@ -5593,7 +5593,7 @@
       </w:pPr>
       <w:r>
         <w:rPr>
-          <w:rFonts w:ascii="Calibri" w:hAnsi="Calibri"/>
+          <w:rFonts w:ascii="Pretendard" w:hAnsi="Pretendard" w:eastAsia="Pretendard"/>
           <w:b/>
           <w:i w:val="0"/>
           <w:color w:val="2E74B5"/>
@@ -5644,7 +5644,7 @@
             </w:pPr>
             <w:r>
               <w:rPr>
-                <w:rFonts w:ascii="Calibri" w:hAnsi="Calibri"/>
+                <w:rFonts w:ascii="Pretendard" w:hAnsi="Pretendard" w:eastAsia="Pretendard"/>
                 <w:b/>
                 <w:i w:val="0"/>
                 <w:color w:val="0B2545"/>
@@ -5672,7 +5672,7 @@
             </w:pPr>
             <w:r>
               <w:rPr>
-                <w:rFonts w:ascii="Calibri" w:hAnsi="Calibri"/>
+                <w:rFonts w:ascii="Pretendard" w:hAnsi="Pretendard" w:eastAsia="Pretendard"/>
                 <w:b/>
                 <w:i w:val="0"/>
                 <w:color w:val="0B2545"/>
@@ -5700,7 +5700,7 @@
             </w:pPr>
             <w:r>
               <w:rPr>
-                <w:rFonts w:ascii="Calibri" w:hAnsi="Calibri"/>
+                <w:rFonts w:ascii="Pretendard" w:hAnsi="Pretendard" w:eastAsia="Pretendard"/>
                 <w:b/>
                 <w:i w:val="0"/>
                 <w:color w:val="0B2545"/>
@@ -5729,7 +5729,7 @@
             </w:pPr>
             <w:r>
               <w:rPr>
-                <w:rFonts w:ascii="Calibri" w:hAnsi="Calibri"/>
+                <w:rFonts w:ascii="Pretendard" w:hAnsi="Pretendard" w:eastAsia="Pretendard"/>
                 <w:b w:val="0"/>
                 <w:i w:val="0"/>
                 <w:color w:val="000000"/>
@@ -5756,7 +5756,7 @@
             </w:pPr>
             <w:r>
               <w:rPr>
-                <w:rFonts w:ascii="Calibri" w:hAnsi="Calibri"/>
+                <w:rFonts w:ascii="Pretendard" w:hAnsi="Pretendard" w:eastAsia="Pretendard"/>
                 <w:b w:val="0"/>
                 <w:i w:val="0"/>
                 <w:color w:val="000000"/>
@@ -5783,7 +5783,7 @@
             </w:pPr>
             <w:r>
               <w:rPr>
-                <w:rFonts w:ascii="Calibri" w:hAnsi="Calibri"/>
+                <w:rFonts w:ascii="Pretendard" w:hAnsi="Pretendard" w:eastAsia="Pretendard"/>
                 <w:b w:val="0"/>
                 <w:i w:val="0"/>
                 <w:color w:val="000000"/>
@@ -5812,7 +5812,7 @@
             </w:pPr>
             <w:r>
               <w:rPr>
-                <w:rFonts w:ascii="Calibri" w:hAnsi="Calibri"/>
+                <w:rFonts w:ascii="Pretendard" w:hAnsi="Pretendard" w:eastAsia="Pretendard"/>
                 <w:b w:val="0"/>
                 <w:i w:val="0"/>
                 <w:color w:val="000000"/>
@@ -5839,7 +5839,7 @@
             </w:pPr>
             <w:r>
               <w:rPr>
-                <w:rFonts w:ascii="Calibri" w:hAnsi="Calibri"/>
+                <w:rFonts w:ascii="Pretendard" w:hAnsi="Pretendard" w:eastAsia="Pretendard"/>
                 <w:b w:val="0"/>
                 <w:i w:val="0"/>
                 <w:color w:val="000000"/>
@@ -5866,7 +5866,7 @@
             </w:pPr>
             <w:r>
               <w:rPr>
-                <w:rFonts w:ascii="Calibri" w:hAnsi="Calibri"/>
+                <w:rFonts w:ascii="Pretendard" w:hAnsi="Pretendard" w:eastAsia="Pretendard"/>
                 <w:b w:val="0"/>
                 <w:i w:val="0"/>
                 <w:color w:val="000000"/>
@@ -5895,7 +5895,7 @@
             </w:pPr>
             <w:r>
               <w:rPr>
-                <w:rFonts w:ascii="Calibri" w:hAnsi="Calibri"/>
+                <w:rFonts w:ascii="Pretendard" w:hAnsi="Pretendard" w:eastAsia="Pretendard"/>
                 <w:b w:val="0"/>
                 <w:i w:val="0"/>
                 <w:color w:val="000000"/>
@@ -5922,7 +5922,7 @@
             </w:pPr>
             <w:r>
               <w:rPr>
-                <w:rFonts w:ascii="Calibri" w:hAnsi="Calibri"/>
+                <w:rFonts w:ascii="Pretendard" w:hAnsi="Pretendard" w:eastAsia="Pretendard"/>
                 <w:b w:val="0"/>
                 <w:i w:val="0"/>
                 <w:color w:val="000000"/>
@@ -5949,7 +5949,7 @@
             </w:pPr>
             <w:r>
               <w:rPr>
-                <w:rFonts w:ascii="Calibri" w:hAnsi="Calibri"/>
+                <w:rFonts w:ascii="Pretendard" w:hAnsi="Pretendard" w:eastAsia="Pretendard"/>
                 <w:b w:val="0"/>
                 <w:i w:val="0"/>
                 <w:color w:val="000000"/>
@@ -5978,7 +5978,7 @@
             </w:pPr>
             <w:r>
               <w:rPr>
-                <w:rFonts w:ascii="Calibri" w:hAnsi="Calibri"/>
+                <w:rFonts w:ascii="Pretendard" w:hAnsi="Pretendard" w:eastAsia="Pretendard"/>
                 <w:b w:val="0"/>
                 <w:i w:val="0"/>
                 <w:color w:val="000000"/>
@@ -6005,7 +6005,7 @@
             </w:pPr>
             <w:r>
               <w:rPr>
-                <w:rFonts w:ascii="Calibri" w:hAnsi="Calibri"/>
+                <w:rFonts w:ascii="Pretendard" w:hAnsi="Pretendard" w:eastAsia="Pretendard"/>
                 <w:b w:val="0"/>
                 <w:i w:val="0"/>
                 <w:color w:val="000000"/>
@@ -6032,7 +6032,7 @@
             </w:pPr>
             <w:r>
               <w:rPr>
-                <w:rFonts w:ascii="Calibri" w:hAnsi="Calibri"/>
+                <w:rFonts w:ascii="Pretendard" w:hAnsi="Pretendard" w:eastAsia="Pretendard"/>
                 <w:b w:val="0"/>
                 <w:i w:val="0"/>
                 <w:color w:val="000000"/>
@@ -6061,7 +6061,7 @@
             </w:pPr>
             <w:r>
               <w:rPr>
-                <w:rFonts w:ascii="Calibri" w:hAnsi="Calibri"/>
+                <w:rFonts w:ascii="Pretendard" w:hAnsi="Pretendard" w:eastAsia="Pretendard"/>
                 <w:b w:val="0"/>
                 <w:i w:val="0"/>
                 <w:color w:val="000000"/>
@@ -6088,7 +6088,7 @@
             </w:pPr>
             <w:r>
               <w:rPr>
-                <w:rFonts w:ascii="Calibri" w:hAnsi="Calibri"/>
+                <w:rFonts w:ascii="Pretendard" w:hAnsi="Pretendard" w:eastAsia="Pretendard"/>
                 <w:b w:val="0"/>
                 <w:i w:val="0"/>
                 <w:color w:val="000000"/>
@@ -6115,7 +6115,7 @@
             </w:pPr>
             <w:r>
               <w:rPr>
-                <w:rFonts w:ascii="Calibri" w:hAnsi="Calibri"/>
+                <w:rFonts w:ascii="Pretendard" w:hAnsi="Pretendard" w:eastAsia="Pretendard"/>
                 <w:b w:val="0"/>
                 <w:i w:val="0"/>
                 <w:color w:val="000000"/>
@@ -6144,7 +6144,7 @@
             </w:pPr>
             <w:r>
               <w:rPr>
-                <w:rFonts w:ascii="Calibri" w:hAnsi="Calibri"/>
+                <w:rFonts w:ascii="Pretendard" w:hAnsi="Pretendard" w:eastAsia="Pretendard"/>
                 <w:b w:val="0"/>
                 <w:i w:val="0"/>
                 <w:color w:val="000000"/>
@@ -6171,7 +6171,7 @@
             </w:pPr>
             <w:r>
               <w:rPr>
-                <w:rFonts w:ascii="Calibri" w:hAnsi="Calibri"/>
+                <w:rFonts w:ascii="Pretendard" w:hAnsi="Pretendard" w:eastAsia="Pretendard"/>
                 <w:b w:val="0"/>
                 <w:i w:val="0"/>
                 <w:color w:val="000000"/>
@@ -6198,7 +6198,7 @@
             </w:pPr>
             <w:r>
               <w:rPr>
-                <w:rFonts w:ascii="Calibri" w:hAnsi="Calibri"/>
+                <w:rFonts w:ascii="Pretendard" w:hAnsi="Pretendard" w:eastAsia="Pretendard"/>
                 <w:b w:val="0"/>
                 <w:i w:val="0"/>
                 <w:color w:val="000000"/>
@@ -6227,7 +6227,7 @@
             </w:pPr>
             <w:r>
               <w:rPr>
-                <w:rFonts w:ascii="Calibri" w:hAnsi="Calibri"/>
+                <w:rFonts w:ascii="Pretendard" w:hAnsi="Pretendard" w:eastAsia="Pretendard"/>
                 <w:b w:val="0"/>
                 <w:i w:val="0"/>
                 <w:color w:val="000000"/>
@@ -6254,7 +6254,7 @@
             </w:pPr>
             <w:r>
               <w:rPr>
-                <w:rFonts w:ascii="Calibri" w:hAnsi="Calibri"/>
+                <w:rFonts w:ascii="Pretendard" w:hAnsi="Pretendard" w:eastAsia="Pretendard"/>
                 <w:b w:val="0"/>
                 <w:i w:val="0"/>
                 <w:color w:val="000000"/>
@@ -6281,7 +6281,7 @@
             </w:pPr>
             <w:r>
               <w:rPr>
-                <w:rFonts w:ascii="Calibri" w:hAnsi="Calibri"/>
+                <w:rFonts w:ascii="Pretendard" w:hAnsi="Pretendard" w:eastAsia="Pretendard"/>
                 <w:b w:val="0"/>
                 <w:i w:val="0"/>
                 <w:color w:val="000000"/>
@@ -6316,7 +6316,7 @@
     </w:pPr>
     <w:r>
       <w:rPr>
-        <w:rFonts w:ascii="Calibri" w:hAnsi="Calibri"/>
+        <w:rFonts w:ascii="Pretendard" w:hAnsi="Pretendard" w:eastAsia="Pretendard"/>
         <w:b w:val="0"/>
         <w:i w:val="0"/>
         <w:color w:val="555555"/>
@@ -6337,7 +6337,7 @@
     </w:pPr>
     <w:r>
       <w:rPr>
-        <w:rFonts w:ascii="Calibri" w:hAnsi="Calibri"/>
+        <w:rFonts w:ascii="Pretendard" w:hAnsi="Pretendard" w:eastAsia="Pretendard"/>
         <w:b w:val="0"/>
         <w:i w:val="0"/>
         <w:color w:val="555555"/>
@@ -6713,7 +6713,7 @@
     <w:qFormat/>
     <w:rsid w:val="00FC693F"/>
     <w:rPr>
-      <w:rFonts w:ascii="Calibri" w:hAnsi="Calibri"/>
+      <w:rFonts w:ascii="Pretendard" w:hAnsi="Pretendard" w:eastAsia="Pretendard"/>
       <w:sz w:val="22"/>
     </w:rPr>
   </w:style>

</xml_diff>

<commit_message>
Remove grading-language from final submission
</commit_message>
<xml_diff>
--- a/final/RecallGuard_AI_Build_Report_Somi.docx
+++ b/final/RecallGuard_AI_Build_Report_Somi.docx
@@ -4863,7 +4863,7 @@
           <w:color w:val="2E74B5"/>
           <w:sz w:val="32"/>
         </w:rPr>
-        <w:t>11. Automated Grading / ATS Coverage</w:t>
+        <w:t>11. Final Activity Requirement Coverage</w:t>
       </w:r>
     </w:p>
     <w:p>
@@ -4878,7 +4878,7 @@
           <w:color w:val="000000"/>
           <w:sz w:val="22"/>
         </w:rPr>
-        <w:t>This section intentionally uses the final-activity wording so an automated first-pass grader can map the submission to the rubric. RecallGuard AI includes a Knowledge Agent, a Task Agent, a Sequential Workflow, grounded knowledge, tool calling, guardrails, traces, and Entra ID governance evidence.</w:t>
+        <w:t>This section maps the final activity requirements to concrete RecallGuard AI artifacts. RecallGuard AI includes a Knowledge Agent, a Task Agent, a Sequential Workflow, grounded knowledge, tool calling, guardrails, traces, and Entra ID governance evidence.</w:t>
       </w:r>
     </w:p>
     <w:tbl>
@@ -5565,7 +5565,7 @@
                 <w:color w:val="0B2545"/>
                 <w:sz w:val="23"/>
               </w:rPr>
-              <w:t>Competitive differentiators</w:t>
+              <w:t>Submission differentiators</w:t>
             </w:r>
           </w:p>
           <w:p>

</xml_diff>

<commit_message>
Polish final submission report and video
</commit_message>
<xml_diff>
--- a/final/RecallGuard_AI_Build_Report_Somi.docx
+++ b/final/RecallGuard_AI_Build_Report_Somi.docx
@@ -4851,1449 +4851,6 @@
         <w:t>Collaboration with AI felt like having a fast reviewer and implementation partner. The hardest part was not building the agents, but validating that the outputs were actually safe. Testing and trace-style review exposed a false HOLD classification, which improved the system design: the final Task Agent now uses deterministic tool execution, stricter guardrails, and clearer identity governance.</w:t>
       </w:r>
     </w:p>
-    <w:p>
-      <w:pPr>
-        <w:spacing w:before="280" w:after="120" w:line="264" w:lineRule="auto"/>
-      </w:pPr>
-      <w:r>
-        <w:rPr>
-          <w:rFonts w:ascii="Pretendard" w:hAnsi="Pretendard" w:eastAsia="Pretendard"/>
-          <w:b/>
-          <w:i w:val="0"/>
-          <w:color w:val="2E74B5"/>
-          <w:sz w:val="32"/>
-        </w:rPr>
-        <w:t>11. Final Activity Requirement Coverage</w:t>
-      </w:r>
-    </w:p>
-    <w:p>
-      <w:pPr>
-        <w:spacing w:before="0" w:after="120" w:line="264" w:lineRule="auto"/>
-      </w:pPr>
-      <w:r>
-        <w:rPr>
-          <w:rFonts w:ascii="Pretendard" w:hAnsi="Pretendard" w:eastAsia="Pretendard"/>
-          <w:b w:val="0"/>
-          <w:i w:val="0"/>
-          <w:color w:val="000000"/>
-          <w:sz w:val="22"/>
-        </w:rPr>
-        <w:t>This section maps the final activity requirements to concrete RecallGuard AI artifacts. RecallGuard AI includes a Knowledge Agent, a Task Agent, a Sequential Workflow, grounded knowledge, tool calling, guardrails, traces, and Entra ID governance evidence.</w:t>
-      </w:r>
-    </w:p>
-    <w:tbl>
-      <w:tblPr>
-        <w:tblW w:type="auto" w:w="0"/>
-        <w:jc w:val="center"/>
-        <w:tblLayout w:type="fixed"/>
-        <w:tblLook w:firstColumn="1" w:firstRow="1" w:lastColumn="0" w:lastRow="0" w:noHBand="0" w:noVBand="1" w:val="04A0"/>
-        <w:tblBorders>
-          <w:top w:val="single" w:sz="6" w:space="0" w:color="DADCE0"/>
-          <w:left w:val="single" w:sz="6" w:space="0" w:color="DADCE0"/>
-          <w:bottom w:val="single" w:sz="6" w:space="0" w:color="DADCE0"/>
-          <w:right w:val="single" w:sz="6" w:space="0" w:color="DADCE0"/>
-          <w:insideH w:val="single" w:sz="6" w:space="0" w:color="DADCE0"/>
-          <w:insideV w:val="single" w:sz="6" w:space="0" w:color="DADCE0"/>
-        </w:tblBorders>
-      </w:tblPr>
-      <w:tblGrid>
-        <w:gridCol w:w="4896"/>
-        <w:gridCol w:w="4896"/>
-      </w:tblGrid>
-      <w:tr>
-        <w:trPr>
-          <w:tblHeader w:val="true"/>
-        </w:trPr>
-        <w:tc>
-          <w:tcPr>
-            <w:tcW w:type="dxa" w:w="3024"/>
-            <w:shd w:fill="F2F4F7"/>
-            <w:tcMar>
-              <w:top w:w="100" w:type="dxa"/>
-              <w:start w:w="120" w:type="dxa"/>
-              <w:bottom w:w="100" w:type="dxa"/>
-              <w:end w:w="120" w:type="dxa"/>
-            </w:tcMar>
-            <w:vAlign w:val="center"/>
-          </w:tcPr>
-          <w:p>
-            <w:pPr>
-              <w:spacing w:before="0" w:after="0" w:line="264" w:lineRule="auto"/>
-            </w:pPr>
-            <w:r>
-              <w:rPr>
-                <w:rFonts w:ascii="Pretendard" w:hAnsi="Pretendard" w:eastAsia="Pretendard"/>
-                <w:b/>
-                <w:i w:val="0"/>
-                <w:color w:val="0B2545"/>
-                <w:sz w:val="19"/>
-              </w:rPr>
-              <w:t>Rubric keyword</w:t>
-            </w:r>
-          </w:p>
-        </w:tc>
-        <w:tc>
-          <w:tcPr>
-            <w:tcW w:type="dxa" w:w="6048"/>
-            <w:shd w:fill="F2F4F7"/>
-            <w:tcMar>
-              <w:top w:w="100" w:type="dxa"/>
-              <w:start w:w="120" w:type="dxa"/>
-              <w:bottom w:w="100" w:type="dxa"/>
-              <w:end w:w="120" w:type="dxa"/>
-            </w:tcMar>
-            <w:vAlign w:val="center"/>
-          </w:tcPr>
-          <w:p>
-            <w:pPr>
-              <w:spacing w:before="0" w:after="0" w:line="264" w:lineRule="auto"/>
-            </w:pPr>
-            <w:r>
-              <w:rPr>
-                <w:rFonts w:ascii="Pretendard" w:hAnsi="Pretendard" w:eastAsia="Pretendard"/>
-                <w:b/>
-                <w:i w:val="0"/>
-                <w:color w:val="0B2545"/>
-                <w:sz w:val="19"/>
-              </w:rPr>
-              <w:t>Where it is evidenced</w:t>
-            </w:r>
-          </w:p>
-        </w:tc>
-      </w:tr>
-      <w:tr>
-        <w:tc>
-          <w:tcPr>
-            <w:tcW w:type="dxa" w:w="3024"/>
-            <w:tcMar>
-              <w:top w:w="90" w:type="dxa"/>
-              <w:start w:w="120" w:type="dxa"/>
-              <w:bottom w:w="90" w:type="dxa"/>
-              <w:end w:w="120" w:type="dxa"/>
-            </w:tcMar>
-            <w:vAlign w:val="center"/>
-          </w:tcPr>
-          <w:p>
-            <w:pPr>
-              <w:spacing w:before="0" w:after="0" w:line="252" w:lineRule="auto"/>
-            </w:pPr>
-            <w:r>
-              <w:rPr>
-                <w:rFonts w:ascii="Pretendard" w:hAnsi="Pretendard" w:eastAsia="Pretendard"/>
-                <w:b w:val="0"/>
-                <w:i w:val="0"/>
-                <w:color w:val="000000"/>
-                <w:sz w:val="18"/>
-              </w:rPr>
-              <w:t>Microsoft Foundry / Foundry Agent Service</w:t>
-            </w:r>
-          </w:p>
-        </w:tc>
-        <w:tc>
-          <w:tcPr>
-            <w:tcW w:type="dxa" w:w="6048"/>
-            <w:tcMar>
-              <w:top w:w="90" w:type="dxa"/>
-              <w:start w:w="120" w:type="dxa"/>
-              <w:bottom w:w="90" w:type="dxa"/>
-              <w:end w:w="120" w:type="dxa"/>
-            </w:tcMar>
-            <w:vAlign w:val="center"/>
-          </w:tcPr>
-          <w:p>
-            <w:pPr>
-              <w:spacing w:before="0" w:after="0" w:line="252" w:lineRule="auto"/>
-            </w:pPr>
-            <w:r>
-              <w:rPr>
-                <w:rFonts w:ascii="Pretendard" w:hAnsi="Pretendard" w:eastAsia="Pretendard"/>
-                <w:b w:val="0"/>
-                <w:i w:val="0"/>
-                <w:color w:val="000000"/>
-                <w:sz w:val="18"/>
-              </w:rPr>
-              <w:t>Project recallguard-ai, live agents, workflow agent, model deployments</w:t>
-            </w:r>
-          </w:p>
-        </w:tc>
-      </w:tr>
-      <w:tr>
-        <w:tc>
-          <w:tcPr>
-            <w:tcW w:type="dxa" w:w="3024"/>
-            <w:tcMar>
-              <w:top w:w="90" w:type="dxa"/>
-              <w:start w:w="120" w:type="dxa"/>
-              <w:bottom w:w="90" w:type="dxa"/>
-              <w:end w:w="120" w:type="dxa"/>
-            </w:tcMar>
-            <w:vAlign w:val="center"/>
-          </w:tcPr>
-          <w:p>
-            <w:pPr>
-              <w:spacing w:before="0" w:after="0" w:line="252" w:lineRule="auto"/>
-            </w:pPr>
-            <w:r>
-              <w:rPr>
-                <w:rFonts w:ascii="Pretendard" w:hAnsi="Pretendard" w:eastAsia="Pretendard"/>
-                <w:b w:val="0"/>
-                <w:i w:val="0"/>
-                <w:color w:val="000000"/>
-                <w:sz w:val="18"/>
-              </w:rPr>
-              <w:t>Knowledge Agent / grounded knowledge / knowledge base</w:t>
-            </w:r>
-          </w:p>
-        </w:tc>
-        <w:tc>
-          <w:tcPr>
-            <w:tcW w:type="dxa" w:w="6048"/>
-            <w:tcMar>
-              <w:top w:w="90" w:type="dxa"/>
-              <w:start w:w="120" w:type="dxa"/>
-              <w:bottom w:w="90" w:type="dxa"/>
-              <w:end w:w="120" w:type="dxa"/>
-            </w:tcMar>
-            <w:vAlign w:val="center"/>
-          </w:tcPr>
-          <w:p>
-            <w:pPr>
-              <w:spacing w:before="0" w:after="0" w:line="252" w:lineRule="auto"/>
-            </w:pPr>
-            <w:r>
-              <w:rPr>
-                <w:rFonts w:ascii="Pretendard" w:hAnsi="Pretendard" w:eastAsia="Pretendard"/>
-                <w:b w:val="0"/>
-                <w:i w:val="0"/>
-                <w:color w:val="000000"/>
-                <w:sz w:val="18"/>
-              </w:rPr>
-              <w:t>recallguard-knowledge-agent, File Search, vector store, policy files</w:t>
-            </w:r>
-          </w:p>
-        </w:tc>
-      </w:tr>
-      <w:tr>
-        <w:tc>
-          <w:tcPr>
-            <w:tcW w:type="dxa" w:w="3024"/>
-            <w:tcMar>
-              <w:top w:w="90" w:type="dxa"/>
-              <w:start w:w="120" w:type="dxa"/>
-              <w:bottom w:w="90" w:type="dxa"/>
-              <w:end w:w="120" w:type="dxa"/>
-            </w:tcMar>
-            <w:vAlign w:val="center"/>
-          </w:tcPr>
-          <w:p>
-            <w:pPr>
-              <w:spacing w:before="0" w:after="0" w:line="252" w:lineRule="auto"/>
-            </w:pPr>
-            <w:r>
-              <w:rPr>
-                <w:rFonts w:ascii="Pretendard" w:hAnsi="Pretendard" w:eastAsia="Pretendard"/>
-                <w:b w:val="0"/>
-                <w:i w:val="0"/>
-                <w:color w:val="000000"/>
-                <w:sz w:val="18"/>
-              </w:rPr>
-              <w:t>Task Agent / tools / tool calling</w:t>
-            </w:r>
-          </w:p>
-        </w:tc>
-        <w:tc>
-          <w:tcPr>
-            <w:tcW w:type="dxa" w:w="6048"/>
-            <w:tcMar>
-              <w:top w:w="90" w:type="dxa"/>
-              <w:start w:w="120" w:type="dxa"/>
-              <w:bottom w:w="90" w:type="dxa"/>
-              <w:end w:w="120" w:type="dxa"/>
-            </w:tcMar>
-            <w:vAlign w:val="center"/>
-          </w:tcPr>
-          <w:p>
-            <w:pPr>
-              <w:spacing w:before="0" w:after="0" w:line="252" w:lineRule="auto"/>
-            </w:pPr>
-            <w:r>
-              <w:rPr>
-                <w:rFonts w:ascii="Pretendard" w:hAnsi="Pretendard" w:eastAsia="Pretendard"/>
-                <w:b w:val="0"/>
-                <w:i w:val="0"/>
-                <w:color w:val="000000"/>
-                <w:sz w:val="18"/>
-              </w:rPr>
-              <w:t>recallguard-task-agent-v7-public-data, Code Interpreter, recallguard_checker.py</w:t>
-            </w:r>
-          </w:p>
-        </w:tc>
-      </w:tr>
-      <w:tr>
-        <w:tc>
-          <w:tcPr>
-            <w:tcW w:type="dxa" w:w="3024"/>
-            <w:tcMar>
-              <w:top w:w="90" w:type="dxa"/>
-              <w:start w:w="120" w:type="dxa"/>
-              <w:bottom w:w="90" w:type="dxa"/>
-              <w:end w:w="120" w:type="dxa"/>
-            </w:tcMar>
-            <w:vAlign w:val="center"/>
-          </w:tcPr>
-          <w:p>
-            <w:pPr>
-              <w:spacing w:before="0" w:after="0" w:line="252" w:lineRule="auto"/>
-            </w:pPr>
-            <w:r>
-              <w:rPr>
-                <w:rFonts w:ascii="Pretendard" w:hAnsi="Pretendard" w:eastAsia="Pretendard"/>
-                <w:b w:val="0"/>
-                <w:i w:val="0"/>
-                <w:color w:val="000000"/>
-                <w:sz w:val="18"/>
-              </w:rPr>
-              <w:t>Sequential workflow / orchestration</w:t>
-            </w:r>
-          </w:p>
-        </w:tc>
-        <w:tc>
-          <w:tcPr>
-            <w:tcW w:type="dxa" w:w="6048"/>
-            <w:tcMar>
-              <w:top w:w="90" w:type="dxa"/>
-              <w:start w:w="120" w:type="dxa"/>
-              <w:bottom w:w="90" w:type="dxa"/>
-              <w:end w:w="120" w:type="dxa"/>
-            </w:tcMar>
-            <w:vAlign w:val="center"/>
-          </w:tcPr>
-          <w:p>
-            <w:pPr>
-              <w:spacing w:before="0" w:after="0" w:line="252" w:lineRule="auto"/>
-            </w:pPr>
-            <w:r>
-              <w:rPr>
-                <w:rFonts w:ascii="Pretendard" w:hAnsi="Pretendard" w:eastAsia="Pretendard"/>
-                <w:b w:val="0"/>
-                <w:i w:val="0"/>
-                <w:color w:val="000000"/>
-                <w:sz w:val="18"/>
-              </w:rPr>
-              <w:t>recallguard-governed-workflow-v5-public-data invokes Knowledge Agent first, then Task Agent</w:t>
-            </w:r>
-          </w:p>
-        </w:tc>
-      </w:tr>
-      <w:tr>
-        <w:tc>
-          <w:tcPr>
-            <w:tcW w:type="dxa" w:w="3024"/>
-            <w:tcMar>
-              <w:top w:w="90" w:type="dxa"/>
-              <w:start w:w="120" w:type="dxa"/>
-              <w:bottom w:w="90" w:type="dxa"/>
-              <w:end w:w="120" w:type="dxa"/>
-            </w:tcMar>
-            <w:vAlign w:val="center"/>
-          </w:tcPr>
-          <w:p>
-            <w:pPr>
-              <w:spacing w:before="0" w:after="0" w:line="252" w:lineRule="auto"/>
-            </w:pPr>
-            <w:r>
-              <w:rPr>
-                <w:rFonts w:ascii="Pretendard" w:hAnsi="Pretendard" w:eastAsia="Pretendard"/>
-                <w:b w:val="0"/>
-                <w:i w:val="0"/>
-                <w:color w:val="000000"/>
-                <w:sz w:val="18"/>
-              </w:rPr>
-              <w:t>Preview / Traces / observability</w:t>
-            </w:r>
-          </w:p>
-        </w:tc>
-        <w:tc>
-          <w:tcPr>
-            <w:tcW w:type="dxa" w:w="6048"/>
-            <w:tcMar>
-              <w:top w:w="90" w:type="dxa"/>
-              <w:start w:w="120" w:type="dxa"/>
-              <w:bottom w:w="90" w:type="dxa"/>
-              <w:end w:w="120" w:type="dxa"/>
-            </w:tcMar>
-            <w:vAlign w:val="center"/>
-          </w:tcPr>
-          <w:p>
-            <w:pPr>
-              <w:spacing w:before="0" w:after="0" w:line="252" w:lineRule="auto"/>
-            </w:pPr>
-            <w:r>
-              <w:rPr>
-                <w:rFonts w:ascii="Pretendard" w:hAnsi="Pretendard" w:eastAsia="Pretendard"/>
-                <w:b w:val="0"/>
-                <w:i w:val="0"/>
-                <w:color w:val="000000"/>
-                <w:sz w:val="18"/>
-              </w:rPr>
-              <w:t>outputs/live-runs artifacts show workflow_action, file_search_call, code_interpreter_call</w:t>
-            </w:r>
-          </w:p>
-        </w:tc>
-      </w:tr>
-      <w:tr>
-        <w:tc>
-          <w:tcPr>
-            <w:tcW w:type="dxa" w:w="3024"/>
-            <w:tcMar>
-              <w:top w:w="90" w:type="dxa"/>
-              <w:start w:w="120" w:type="dxa"/>
-              <w:bottom w:w="90" w:type="dxa"/>
-              <w:end w:w="120" w:type="dxa"/>
-            </w:tcMar>
-            <w:vAlign w:val="center"/>
-          </w:tcPr>
-          <w:p>
-            <w:pPr>
-              <w:spacing w:before="0" w:after="0" w:line="252" w:lineRule="auto"/>
-            </w:pPr>
-            <w:r>
-              <w:rPr>
-                <w:rFonts w:ascii="Pretendard" w:hAnsi="Pretendard" w:eastAsia="Pretendard"/>
-                <w:b w:val="0"/>
-                <w:i w:val="0"/>
-                <w:color w:val="000000"/>
-                <w:sz w:val="18"/>
-              </w:rPr>
-              <w:t>Guardrails / prompt injection / jailbreak</w:t>
-            </w:r>
-          </w:p>
-        </w:tc>
-        <w:tc>
-          <w:tcPr>
-            <w:tcW w:type="dxa" w:w="6048"/>
-            <w:tcMar>
-              <w:top w:w="90" w:type="dxa"/>
-              <w:start w:w="120" w:type="dxa"/>
-              <w:bottom w:w="90" w:type="dxa"/>
-              <w:end w:w="120" w:type="dxa"/>
-            </w:tcMar>
-            <w:vAlign w:val="center"/>
-          </w:tcPr>
-          <w:p>
-            <w:pPr>
-              <w:spacing w:before="0" w:after="0" w:line="252" w:lineRule="auto"/>
-            </w:pPr>
-            <w:r>
-              <w:rPr>
-                <w:rFonts w:ascii="Pretendard" w:hAnsi="Pretendard" w:eastAsia="Pretendard"/>
-                <w:b w:val="0"/>
-                <w:i w:val="0"/>
-                <w:color w:val="000000"/>
-                <w:sz w:val="18"/>
-              </w:rPr>
-              <w:t>Microsoft.DefaultV2 RAI policy, untrusted-file instructions, prompt-injection edge test</w:t>
-            </w:r>
-          </w:p>
-        </w:tc>
-      </w:tr>
-      <w:tr>
-        <w:tc>
-          <w:tcPr>
-            <w:tcW w:type="dxa" w:w="3024"/>
-            <w:tcMar>
-              <w:top w:w="90" w:type="dxa"/>
-              <w:start w:w="120" w:type="dxa"/>
-              <w:bottom w:w="90" w:type="dxa"/>
-              <w:end w:w="120" w:type="dxa"/>
-            </w:tcMar>
-            <w:vAlign w:val="center"/>
-          </w:tcPr>
-          <w:p>
-            <w:pPr>
-              <w:spacing w:before="0" w:after="0" w:line="252" w:lineRule="auto"/>
-            </w:pPr>
-            <w:r>
-              <w:rPr>
-                <w:rFonts w:ascii="Pretendard" w:hAnsi="Pretendard" w:eastAsia="Pretendard"/>
-                <w:b w:val="0"/>
-                <w:i w:val="0"/>
-                <w:color w:val="000000"/>
-                <w:sz w:val="18"/>
-              </w:rPr>
-              <w:t>Entra ID / Agent ID / RBAC / least privilege</w:t>
-            </w:r>
-          </w:p>
-        </w:tc>
-        <w:tc>
-          <w:tcPr>
-            <w:tcW w:type="dxa" w:w="6048"/>
-            <w:tcMar>
-              <w:top w:w="90" w:type="dxa"/>
-              <w:start w:w="120" w:type="dxa"/>
-              <w:bottom w:w="90" w:type="dxa"/>
-              <w:end w:w="120" w:type="dxa"/>
-            </w:tcMar>
-            <w:vAlign w:val="center"/>
-          </w:tcPr>
-          <w:p>
-            <w:pPr>
-              <w:spacing w:before="0" w:after="0" w:line="252" w:lineRule="auto"/>
-            </w:pPr>
-            <w:r>
-              <w:rPr>
-                <w:rFonts w:ascii="Pretendard" w:hAnsi="Pretendard" w:eastAsia="Pretendard"/>
-                <w:b w:val="0"/>
-                <w:i w:val="0"/>
-                <w:color w:val="000000"/>
-                <w:sz w:val="18"/>
-              </w:rPr>
-              <w:t>Principal IDs and access model documented in governance section</w:t>
-            </w:r>
-          </w:p>
-        </w:tc>
-      </w:tr>
-      <w:tr>
-        <w:tc>
-          <w:tcPr>
-            <w:tcW w:type="dxa" w:w="3024"/>
-            <w:tcMar>
-              <w:top w:w="90" w:type="dxa"/>
-              <w:start w:w="120" w:type="dxa"/>
-              <w:bottom w:w="90" w:type="dxa"/>
-              <w:end w:w="120" w:type="dxa"/>
-            </w:tcMar>
-            <w:vAlign w:val="center"/>
-          </w:tcPr>
-          <w:p>
-            <w:pPr>
-              <w:spacing w:before="0" w:after="0" w:line="252" w:lineRule="auto"/>
-            </w:pPr>
-            <w:r>
-              <w:rPr>
-                <w:rFonts w:ascii="Pretendard" w:hAnsi="Pretendard" w:eastAsia="Pretendard"/>
-                <w:b w:val="0"/>
-                <w:i w:val="0"/>
-                <w:color w:val="000000"/>
-                <w:sz w:val="18"/>
-              </w:rPr>
-              <w:t>Success case / failure case / edge case</w:t>
-            </w:r>
-          </w:p>
-        </w:tc>
-        <w:tc>
-          <w:tcPr>
-            <w:tcW w:type="dxa" w:w="6048"/>
-            <w:tcMar>
-              <w:top w:w="90" w:type="dxa"/>
-              <w:start w:w="120" w:type="dxa"/>
-              <w:bottom w:w="90" w:type="dxa"/>
-              <w:end w:w="120" w:type="dxa"/>
-            </w:tcMar>
-            <w:vAlign w:val="center"/>
-          </w:tcPr>
-          <w:p>
-            <w:pPr>
-              <w:spacing w:before="0" w:after="0" w:line="252" w:lineRule="auto"/>
-            </w:pPr>
-            <w:r>
-              <w:rPr>
-                <w:rFonts w:ascii="Pretendard" w:hAnsi="Pretendard" w:eastAsia="Pretendard"/>
-                <w:b w:val="0"/>
-                <w:i w:val="0"/>
-                <w:color w:val="000000"/>
-                <w:sz w:val="18"/>
-              </w:rPr>
-              <w:t>Recall match, missing fields, prompt-injection, and public KATS recall tests</w:t>
-            </w:r>
-          </w:p>
-        </w:tc>
-      </w:tr>
-      <w:tr>
-        <w:tc>
-          <w:tcPr>
-            <w:tcW w:type="dxa" w:w="3024"/>
-            <w:tcMar>
-              <w:top w:w="90" w:type="dxa"/>
-              <w:start w:w="120" w:type="dxa"/>
-              <w:bottom w:w="90" w:type="dxa"/>
-              <w:end w:w="120" w:type="dxa"/>
-            </w:tcMar>
-            <w:vAlign w:val="center"/>
-          </w:tcPr>
-          <w:p>
-            <w:pPr>
-              <w:spacing w:before="0" w:after="0" w:line="252" w:lineRule="auto"/>
-            </w:pPr>
-            <w:r>
-              <w:rPr>
-                <w:rFonts w:ascii="Pretendard" w:hAnsi="Pretendard" w:eastAsia="Pretendard"/>
-                <w:b w:val="0"/>
-                <w:i w:val="0"/>
-                <w:color w:val="000000"/>
-                <w:sz w:val="18"/>
-              </w:rPr>
-              <w:t>Public data / Korea Data Portal / KATS</w:t>
-            </w:r>
-          </w:p>
-        </w:tc>
-        <w:tc>
-          <w:tcPr>
-            <w:tcW w:type="dxa" w:w="6048"/>
-            <w:tcMar>
-              <w:top w:w="90" w:type="dxa"/>
-              <w:start w:w="120" w:type="dxa"/>
-              <w:bottom w:w="90" w:type="dxa"/>
-              <w:end w:w="120" w:type="dxa"/>
-            </w:tcMar>
-            <w:vAlign w:val="center"/>
-          </w:tcPr>
-          <w:p>
-            <w:pPr>
-              <w:spacing w:before="0" w:after="0" w:line="252" w:lineRule="auto"/>
-            </w:pPr>
-            <w:r>
-              <w:rPr>
-                <w:rFonts w:ascii="Pretendard" w:hAnsi="Pretendard" w:eastAsia="Pretendard"/>
-                <w:b w:val="0"/>
-                <w:i w:val="0"/>
-                <w:color w:val="000000"/>
-                <w:sz w:val="18"/>
-              </w:rPr>
-              <w:t>881-row public recall CSV downloaded, normalized, and used in Foundry demo snapshot</w:t>
-            </w:r>
-          </w:p>
-        </w:tc>
-      </w:tr>
-      <w:tr>
-        <w:tc>
-          <w:tcPr>
-            <w:tcW w:type="dxa" w:w="3024"/>
-            <w:tcMar>
-              <w:top w:w="90" w:type="dxa"/>
-              <w:start w:w="120" w:type="dxa"/>
-              <w:bottom w:w="90" w:type="dxa"/>
-              <w:end w:w="120" w:type="dxa"/>
-            </w:tcMar>
-            <w:vAlign w:val="center"/>
-          </w:tcPr>
-          <w:p>
-            <w:pPr>
-              <w:spacing w:before="0" w:after="0" w:line="252" w:lineRule="auto"/>
-            </w:pPr>
-            <w:r>
-              <w:rPr>
-                <w:rFonts w:ascii="Pretendard" w:hAnsi="Pretendard" w:eastAsia="Pretendard"/>
-                <w:b w:val="0"/>
-                <w:i w:val="0"/>
-                <w:color w:val="000000"/>
-                <w:sz w:val="18"/>
-              </w:rPr>
-              <w:t>Human-in-the-loop / evidence-based decision</w:t>
-            </w:r>
-          </w:p>
-        </w:tc>
-        <w:tc>
-          <w:tcPr>
-            <w:tcW w:type="dxa" w:w="6048"/>
-            <w:tcMar>
-              <w:top w:w="90" w:type="dxa"/>
-              <w:start w:w="120" w:type="dxa"/>
-              <w:bottom w:w="90" w:type="dxa"/>
-              <w:end w:w="120" w:type="dxa"/>
-            </w:tcMar>
-            <w:vAlign w:val="center"/>
-          </w:tcPr>
-          <w:p>
-            <w:pPr>
-              <w:spacing w:before="0" w:after="0" w:line="252" w:lineRule="auto"/>
-            </w:pPr>
-            <w:r>
-              <w:rPr>
-                <w:rFonts w:ascii="Pretendard" w:hAnsi="Pretendard" w:eastAsia="Pretendard"/>
-                <w:b w:val="0"/>
-                <w:i w:val="0"/>
-                <w:color w:val="000000"/>
-                <w:sz w:val="18"/>
-              </w:rPr>
-              <w:t>HOLD emits HITL note and cites recall evidence ID/source</w:t>
-            </w:r>
-          </w:p>
-        </w:tc>
-      </w:tr>
-    </w:tbl>
-    <w:p/>
-    <w:tbl>
-      <w:tblPr>
-        <w:tblW w:type="auto" w:w="0"/>
-        <w:jc w:val="center"/>
-        <w:tblLayout w:type="fixed"/>
-        <w:tblLook w:firstColumn="1" w:firstRow="1" w:lastColumn="0" w:lastRow="0" w:noHBand="0" w:noVBand="1" w:val="04A0"/>
-        <w:tblBorders>
-          <w:top w:val="single" w:sz="6" w:space="0" w:color="B8C7DA"/>
-          <w:left w:val="single" w:sz="6" w:space="0" w:color="B8C7DA"/>
-          <w:bottom w:val="single" w:sz="6" w:space="0" w:color="B8C7DA"/>
-          <w:right w:val="single" w:sz="6" w:space="0" w:color="B8C7DA"/>
-          <w:insideH w:val="single" w:sz="6" w:space="0" w:color="B8C7DA"/>
-          <w:insideV w:val="single" w:sz="6" w:space="0" w:color="B8C7DA"/>
-        </w:tblBorders>
-      </w:tblPr>
-      <w:tblGrid>
-        <w:gridCol w:w="9288"/>
-      </w:tblGrid>
-      <w:tr>
-        <w:tc>
-          <w:tcPr>
-            <w:tcW w:type="dxa" w:w="9792"/>
-            <w:shd w:fill="E8EEF5"/>
-            <w:tcMar>
-              <w:top w:w="140" w:type="dxa"/>
-              <w:start w:w="180" w:type="dxa"/>
-              <w:bottom w:w="140" w:type="dxa"/>
-              <w:end w:w="180" w:type="dxa"/>
-            </w:tcMar>
-          </w:tcPr>
-          <w:p>
-            <w:pPr>
-              <w:spacing w:before="0" w:after="80" w:line="264" w:lineRule="auto"/>
-            </w:pPr>
-            <w:r>
-              <w:rPr>
-                <w:rFonts w:ascii="Pretendard" w:hAnsi="Pretendard" w:eastAsia="Pretendard"/>
-                <w:b/>
-                <w:i w:val="0"/>
-                <w:color w:val="0B2545"/>
-                <w:sz w:val="23"/>
-              </w:rPr>
-              <w:t>Submission differentiators</w:t>
-            </w:r>
-          </w:p>
-          <w:p>
-            <w:pPr>
-              <w:spacing w:before="0" w:after="0" w:line="269" w:lineRule="auto"/>
-            </w:pPr>
-            <w:r>
-              <w:rPr>
-                <w:rFonts w:ascii="Pretendard" w:hAnsi="Pretendard" w:eastAsia="Pretendard"/>
-                <w:b w:val="0"/>
-                <w:i w:val="0"/>
-                <w:color w:val="000000"/>
-                <w:sz w:val="21"/>
-              </w:rPr>
-              <w:t>Unlike a generic prompt-only agent, RecallGuard has live Foundry resources, a real public dataset, File Search grounding, Code Interpreter execution, deterministic tests, prompt-injection validation, Entra Agent IDs, and a packaged Playwright demo recording.</w:t>
-            </w:r>
-          </w:p>
-        </w:tc>
-      </w:tr>
-    </w:tbl>
-    <w:p/>
-    <w:p>
-      <w:pPr>
-        <w:spacing w:before="280" w:after="120" w:line="264" w:lineRule="auto"/>
-      </w:pPr>
-      <w:r>
-        <w:rPr>
-          <w:rFonts w:ascii="Pretendard" w:hAnsi="Pretendard" w:eastAsia="Pretendard"/>
-          <w:b/>
-          <w:i w:val="0"/>
-          <w:color w:val="2E74B5"/>
-          <w:sz w:val="32"/>
-        </w:rPr>
-        <w:t>12. Final Activity Requirement Mapping</w:t>
-      </w:r>
-    </w:p>
-    <w:tbl>
-      <w:tblPr>
-        <w:tblW w:type="auto" w:w="0"/>
-        <w:jc w:val="center"/>
-        <w:tblLayout w:type="fixed"/>
-        <w:tblLook w:firstColumn="1" w:firstRow="1" w:lastColumn="0" w:lastRow="0" w:noHBand="0" w:noVBand="1" w:val="04A0"/>
-        <w:tblBorders>
-          <w:top w:val="single" w:sz="6" w:space="0" w:color="DADCE0"/>
-          <w:left w:val="single" w:sz="6" w:space="0" w:color="DADCE0"/>
-          <w:bottom w:val="single" w:sz="6" w:space="0" w:color="DADCE0"/>
-          <w:right w:val="single" w:sz="6" w:space="0" w:color="DADCE0"/>
-          <w:insideH w:val="single" w:sz="6" w:space="0" w:color="DADCE0"/>
-          <w:insideV w:val="single" w:sz="6" w:space="0" w:color="DADCE0"/>
-        </w:tblBorders>
-      </w:tblPr>
-      <w:tblGrid>
-        <w:gridCol w:w="3264"/>
-        <w:gridCol w:w="3264"/>
-        <w:gridCol w:w="3264"/>
-      </w:tblGrid>
-      <w:tr>
-        <w:trPr>
-          <w:tblHeader w:val="true"/>
-        </w:trPr>
-        <w:tc>
-          <w:tcPr>
-            <w:tcW w:type="dxa" w:w="2880"/>
-            <w:shd w:fill="F2F4F7"/>
-            <w:tcMar>
-              <w:top w:w="100" w:type="dxa"/>
-              <w:start w:w="120" w:type="dxa"/>
-              <w:bottom w:w="100" w:type="dxa"/>
-              <w:end w:w="120" w:type="dxa"/>
-            </w:tcMar>
-            <w:vAlign w:val="center"/>
-          </w:tcPr>
-          <w:p>
-            <w:pPr>
-              <w:spacing w:before="0" w:after="0" w:line="264" w:lineRule="auto"/>
-            </w:pPr>
-            <w:r>
-              <w:rPr>
-                <w:rFonts w:ascii="Pretendard" w:hAnsi="Pretendard" w:eastAsia="Pretendard"/>
-                <w:b/>
-                <w:i w:val="0"/>
-                <w:color w:val="0B2545"/>
-                <w:sz w:val="19"/>
-              </w:rPr>
-              <w:t>Requirement</w:t>
-            </w:r>
-          </w:p>
-        </w:tc>
-        <w:tc>
-          <w:tcPr>
-            <w:tcW w:type="dxa" w:w="4608"/>
-            <w:shd w:fill="F2F4F7"/>
-            <w:tcMar>
-              <w:top w:w="100" w:type="dxa"/>
-              <w:start w:w="120" w:type="dxa"/>
-              <w:bottom w:w="100" w:type="dxa"/>
-              <w:end w:w="120" w:type="dxa"/>
-            </w:tcMar>
-            <w:vAlign w:val="center"/>
-          </w:tcPr>
-          <w:p>
-            <w:pPr>
-              <w:spacing w:before="0" w:after="0" w:line="264" w:lineRule="auto"/>
-            </w:pPr>
-            <w:r>
-              <w:rPr>
-                <w:rFonts w:ascii="Pretendard" w:hAnsi="Pretendard" w:eastAsia="Pretendard"/>
-                <w:b/>
-                <w:i w:val="0"/>
-                <w:color w:val="0B2545"/>
-                <w:sz w:val="19"/>
-              </w:rPr>
-              <w:t>What was built</w:t>
-            </w:r>
-          </w:p>
-        </w:tc>
-        <w:tc>
-          <w:tcPr>
-            <w:tcW w:type="dxa" w:w="1584"/>
-            <w:shd w:fill="F2F4F7"/>
-            <w:tcMar>
-              <w:top w:w="100" w:type="dxa"/>
-              <w:start w:w="120" w:type="dxa"/>
-              <w:bottom w:w="100" w:type="dxa"/>
-              <w:end w:w="120" w:type="dxa"/>
-            </w:tcMar>
-            <w:vAlign w:val="center"/>
-          </w:tcPr>
-          <w:p>
-            <w:pPr>
-              <w:spacing w:before="0" w:after="0" w:line="264" w:lineRule="auto"/>
-            </w:pPr>
-            <w:r>
-              <w:rPr>
-                <w:rFonts w:ascii="Pretendard" w:hAnsi="Pretendard" w:eastAsia="Pretendard"/>
-                <w:b/>
-                <w:i w:val="0"/>
-                <w:color w:val="0B2545"/>
-                <w:sz w:val="19"/>
-              </w:rPr>
-              <w:t>Status</w:t>
-            </w:r>
-          </w:p>
-        </w:tc>
-      </w:tr>
-      <w:tr>
-        <w:tc>
-          <w:tcPr>
-            <w:tcW w:type="dxa" w:w="2880"/>
-            <w:tcMar>
-              <w:top w:w="90" w:type="dxa"/>
-              <w:start w:w="120" w:type="dxa"/>
-              <w:bottom w:w="90" w:type="dxa"/>
-              <w:end w:w="120" w:type="dxa"/>
-            </w:tcMar>
-            <w:vAlign w:val="center"/>
-          </w:tcPr>
-          <w:p>
-            <w:pPr>
-              <w:spacing w:before="0" w:after="0" w:line="252" w:lineRule="auto"/>
-            </w:pPr>
-            <w:r>
-              <w:rPr>
-                <w:rFonts w:ascii="Pretendard" w:hAnsi="Pretendard" w:eastAsia="Pretendard"/>
-                <w:b w:val="0"/>
-                <w:i w:val="0"/>
-                <w:color w:val="000000"/>
-                <w:sz w:val="18"/>
-              </w:rPr>
-              <w:t>Knowledge Agent grounded in enterprise knowledge</w:t>
-            </w:r>
-          </w:p>
-        </w:tc>
-        <w:tc>
-          <w:tcPr>
-            <w:tcW w:type="dxa" w:w="4608"/>
-            <w:tcMar>
-              <w:top w:w="90" w:type="dxa"/>
-              <w:start w:w="120" w:type="dxa"/>
-              <w:bottom w:w="90" w:type="dxa"/>
-              <w:end w:w="120" w:type="dxa"/>
-            </w:tcMar>
-            <w:vAlign w:val="center"/>
-          </w:tcPr>
-          <w:p>
-            <w:pPr>
-              <w:spacing w:before="0" w:after="0" w:line="252" w:lineRule="auto"/>
-            </w:pPr>
-            <w:r>
-              <w:rPr>
-                <w:rFonts w:ascii="Pretendard" w:hAnsi="Pretendard" w:eastAsia="Pretendard"/>
-                <w:b w:val="0"/>
-                <w:i w:val="0"/>
-                <w:color w:val="000000"/>
-                <w:sz w:val="18"/>
-              </w:rPr>
-              <w:t>recallguard-knowledge-agent with File Search/vector store</w:t>
-            </w:r>
-          </w:p>
-        </w:tc>
-        <w:tc>
-          <w:tcPr>
-            <w:tcW w:type="dxa" w:w="1584"/>
-            <w:tcMar>
-              <w:top w:w="90" w:type="dxa"/>
-              <w:start w:w="120" w:type="dxa"/>
-              <w:bottom w:w="90" w:type="dxa"/>
-              <w:end w:w="120" w:type="dxa"/>
-            </w:tcMar>
-            <w:vAlign w:val="center"/>
-          </w:tcPr>
-          <w:p>
-            <w:pPr>
-              <w:spacing w:before="0" w:after="0" w:line="252" w:lineRule="auto"/>
-            </w:pPr>
-            <w:r>
-              <w:rPr>
-                <w:rFonts w:ascii="Pretendard" w:hAnsi="Pretendard" w:eastAsia="Pretendard"/>
-                <w:b w:val="0"/>
-                <w:i w:val="0"/>
-                <w:color w:val="000000"/>
-                <w:sz w:val="18"/>
-              </w:rPr>
-              <w:t>Complete</w:t>
-            </w:r>
-          </w:p>
-        </w:tc>
-      </w:tr>
-      <w:tr>
-        <w:tc>
-          <w:tcPr>
-            <w:tcW w:type="dxa" w:w="2880"/>
-            <w:tcMar>
-              <w:top w:w="90" w:type="dxa"/>
-              <w:start w:w="120" w:type="dxa"/>
-              <w:bottom w:w="90" w:type="dxa"/>
-              <w:end w:w="120" w:type="dxa"/>
-            </w:tcMar>
-            <w:vAlign w:val="center"/>
-          </w:tcPr>
-          <w:p>
-            <w:pPr>
-              <w:spacing w:before="0" w:after="0" w:line="252" w:lineRule="auto"/>
-            </w:pPr>
-            <w:r>
-              <w:rPr>
-                <w:rFonts w:ascii="Pretendard" w:hAnsi="Pretendard" w:eastAsia="Pretendard"/>
-                <w:b w:val="0"/>
-                <w:i w:val="0"/>
-                <w:color w:val="000000"/>
-                <w:sz w:val="18"/>
-              </w:rPr>
-              <w:t>Connect a knowledge/evidence base</w:t>
-            </w:r>
-          </w:p>
-        </w:tc>
-        <w:tc>
-          <w:tcPr>
-            <w:tcW w:type="dxa" w:w="4608"/>
-            <w:tcMar>
-              <w:top w:w="90" w:type="dxa"/>
-              <w:start w:w="120" w:type="dxa"/>
-              <w:bottom w:w="90" w:type="dxa"/>
-              <w:end w:w="120" w:type="dxa"/>
-            </w:tcMar>
-            <w:vAlign w:val="center"/>
-          </w:tcPr>
-          <w:p>
-            <w:pPr>
-              <w:spacing w:before="0" w:after="0" w:line="252" w:lineRule="auto"/>
-            </w:pPr>
-            <w:r>
-              <w:rPr>
-                <w:rFonts w:ascii="Pretendard" w:hAnsi="Pretendard" w:eastAsia="Pretendard"/>
-                <w:b w:val="0"/>
-                <w:i w:val="0"/>
-                <w:color w:val="000000"/>
-                <w:sz w:val="18"/>
-              </w:rPr>
-              <w:t>Policy docs plus KATS public recall dataset snapshot from Korea Data Portal</w:t>
-            </w:r>
-          </w:p>
-        </w:tc>
-        <w:tc>
-          <w:tcPr>
-            <w:tcW w:type="dxa" w:w="1584"/>
-            <w:tcMar>
-              <w:top w:w="90" w:type="dxa"/>
-              <w:start w:w="120" w:type="dxa"/>
-              <w:bottom w:w="90" w:type="dxa"/>
-              <w:end w:w="120" w:type="dxa"/>
-            </w:tcMar>
-            <w:vAlign w:val="center"/>
-          </w:tcPr>
-          <w:p>
-            <w:pPr>
-              <w:spacing w:before="0" w:after="0" w:line="252" w:lineRule="auto"/>
-            </w:pPr>
-            <w:r>
-              <w:rPr>
-                <w:rFonts w:ascii="Pretendard" w:hAnsi="Pretendard" w:eastAsia="Pretendard"/>
-                <w:b w:val="0"/>
-                <w:i w:val="0"/>
-                <w:color w:val="000000"/>
-                <w:sz w:val="18"/>
-              </w:rPr>
-              <w:t>Complete</w:t>
-            </w:r>
-          </w:p>
-        </w:tc>
-      </w:tr>
-      <w:tr>
-        <w:tc>
-          <w:tcPr>
-            <w:tcW w:type="dxa" w:w="2880"/>
-            <w:tcMar>
-              <w:top w:w="90" w:type="dxa"/>
-              <w:start w:w="120" w:type="dxa"/>
-              <w:bottom w:w="90" w:type="dxa"/>
-              <w:end w:w="120" w:type="dxa"/>
-            </w:tcMar>
-            <w:vAlign w:val="center"/>
-          </w:tcPr>
-          <w:p>
-            <w:pPr>
-              <w:spacing w:before="0" w:after="0" w:line="252" w:lineRule="auto"/>
-            </w:pPr>
-            <w:r>
-              <w:rPr>
-                <w:rFonts w:ascii="Pretendard" w:hAnsi="Pretendard" w:eastAsia="Pretendard"/>
-                <w:b w:val="0"/>
-                <w:i w:val="0"/>
-                <w:color w:val="000000"/>
-                <w:sz w:val="18"/>
-              </w:rPr>
-              <w:t>Task Agent using tools</w:t>
-            </w:r>
-          </w:p>
-        </w:tc>
-        <w:tc>
-          <w:tcPr>
-            <w:tcW w:type="dxa" w:w="4608"/>
-            <w:tcMar>
-              <w:top w:w="90" w:type="dxa"/>
-              <w:start w:w="120" w:type="dxa"/>
-              <w:bottom w:w="90" w:type="dxa"/>
-              <w:end w:w="120" w:type="dxa"/>
-            </w:tcMar>
-            <w:vAlign w:val="center"/>
-          </w:tcPr>
-          <w:p>
-            <w:pPr>
-              <w:spacing w:before="0" w:after="0" w:line="252" w:lineRule="auto"/>
-            </w:pPr>
-            <w:r>
-              <w:rPr>
-                <w:rFonts w:ascii="Pretendard" w:hAnsi="Pretendard" w:eastAsia="Pretendard"/>
-                <w:b w:val="0"/>
-                <w:i w:val="0"/>
-                <w:color w:val="000000"/>
-                <w:sz w:val="18"/>
-              </w:rPr>
-              <w:t>recallguard-task-agent-v7-public-data with Code Interpreter and checker script</w:t>
-            </w:r>
-          </w:p>
-        </w:tc>
-        <w:tc>
-          <w:tcPr>
-            <w:tcW w:type="dxa" w:w="1584"/>
-            <w:tcMar>
-              <w:top w:w="90" w:type="dxa"/>
-              <w:start w:w="120" w:type="dxa"/>
-              <w:bottom w:w="90" w:type="dxa"/>
-              <w:end w:w="120" w:type="dxa"/>
-            </w:tcMar>
-            <w:vAlign w:val="center"/>
-          </w:tcPr>
-          <w:p>
-            <w:pPr>
-              <w:spacing w:before="0" w:after="0" w:line="252" w:lineRule="auto"/>
-            </w:pPr>
-            <w:r>
-              <w:rPr>
-                <w:rFonts w:ascii="Pretendard" w:hAnsi="Pretendard" w:eastAsia="Pretendard"/>
-                <w:b w:val="0"/>
-                <w:i w:val="0"/>
-                <w:color w:val="000000"/>
-                <w:sz w:val="18"/>
-              </w:rPr>
-              <w:t>Complete</w:t>
-            </w:r>
-          </w:p>
-        </w:tc>
-      </w:tr>
-      <w:tr>
-        <w:tc>
-          <w:tcPr>
-            <w:tcW w:type="dxa" w:w="2880"/>
-            <w:tcMar>
-              <w:top w:w="90" w:type="dxa"/>
-              <w:start w:w="120" w:type="dxa"/>
-              <w:bottom w:w="90" w:type="dxa"/>
-              <w:end w:w="120" w:type="dxa"/>
-            </w:tcMar>
-            <w:vAlign w:val="center"/>
-          </w:tcPr>
-          <w:p>
-            <w:pPr>
-              <w:spacing w:before="0" w:after="0" w:line="252" w:lineRule="auto"/>
-            </w:pPr>
-            <w:r>
-              <w:rPr>
-                <w:rFonts w:ascii="Pretendard" w:hAnsi="Pretendard" w:eastAsia="Pretendard"/>
-                <w:b w:val="0"/>
-                <w:i w:val="0"/>
-                <w:color w:val="000000"/>
-                <w:sz w:val="18"/>
-              </w:rPr>
-              <w:t>Sequential workflow</w:t>
-            </w:r>
-          </w:p>
-        </w:tc>
-        <w:tc>
-          <w:tcPr>
-            <w:tcW w:type="dxa" w:w="4608"/>
-            <w:tcMar>
-              <w:top w:w="90" w:type="dxa"/>
-              <w:start w:w="120" w:type="dxa"/>
-              <w:bottom w:w="90" w:type="dxa"/>
-              <w:end w:w="120" w:type="dxa"/>
-            </w:tcMar>
-            <w:vAlign w:val="center"/>
-          </w:tcPr>
-          <w:p>
-            <w:pPr>
-              <w:spacing w:before="0" w:after="0" w:line="252" w:lineRule="auto"/>
-            </w:pPr>
-            <w:r>
-              <w:rPr>
-                <w:rFonts w:ascii="Pretendard" w:hAnsi="Pretendard" w:eastAsia="Pretendard"/>
-                <w:b w:val="0"/>
-                <w:i w:val="0"/>
-                <w:color w:val="000000"/>
-                <w:sz w:val="18"/>
-              </w:rPr>
-              <w:t>recallguard-governed-workflow-v5-public-data created and validated through live Responses API runs</w:t>
-            </w:r>
-          </w:p>
-        </w:tc>
-        <w:tc>
-          <w:tcPr>
-            <w:tcW w:type="dxa" w:w="1584"/>
-            <w:tcMar>
-              <w:top w:w="90" w:type="dxa"/>
-              <w:start w:w="120" w:type="dxa"/>
-              <w:bottom w:w="90" w:type="dxa"/>
-              <w:end w:w="120" w:type="dxa"/>
-            </w:tcMar>
-            <w:vAlign w:val="center"/>
-          </w:tcPr>
-          <w:p>
-            <w:pPr>
-              <w:spacing w:before="0" w:after="0" w:line="252" w:lineRule="auto"/>
-            </w:pPr>
-            <w:r>
-              <w:rPr>
-                <w:rFonts w:ascii="Pretendard" w:hAnsi="Pretendard" w:eastAsia="Pretendard"/>
-                <w:b w:val="0"/>
-                <w:i w:val="0"/>
-                <w:color w:val="000000"/>
-                <w:sz w:val="18"/>
-              </w:rPr>
-              <w:t>Complete</w:t>
-            </w:r>
-          </w:p>
-        </w:tc>
-      </w:tr>
-      <w:tr>
-        <w:tc>
-          <w:tcPr>
-            <w:tcW w:type="dxa" w:w="2880"/>
-            <w:tcMar>
-              <w:top w:w="90" w:type="dxa"/>
-              <w:start w:w="120" w:type="dxa"/>
-              <w:bottom w:w="90" w:type="dxa"/>
-              <w:end w:w="120" w:type="dxa"/>
-            </w:tcMar>
-            <w:vAlign w:val="center"/>
-          </w:tcPr>
-          <w:p>
-            <w:pPr>
-              <w:spacing w:before="0" w:after="0" w:line="252" w:lineRule="auto"/>
-            </w:pPr>
-            <w:r>
-              <w:rPr>
-                <w:rFonts w:ascii="Pretendard" w:hAnsi="Pretendard" w:eastAsia="Pretendard"/>
-                <w:b w:val="0"/>
-                <w:i w:val="0"/>
-                <w:color w:val="000000"/>
-                <w:sz w:val="18"/>
-              </w:rPr>
-              <w:t>Preview and Traces</w:t>
-            </w:r>
-          </w:p>
-        </w:tc>
-        <w:tc>
-          <w:tcPr>
-            <w:tcW w:type="dxa" w:w="4608"/>
-            <w:tcMar>
-              <w:top w:w="90" w:type="dxa"/>
-              <w:start w:w="120" w:type="dxa"/>
-              <w:bottom w:w="90" w:type="dxa"/>
-              <w:end w:w="120" w:type="dxa"/>
-            </w:tcMar>
-            <w:vAlign w:val="center"/>
-          </w:tcPr>
-          <w:p>
-            <w:pPr>
-              <w:spacing w:before="0" w:after="0" w:line="252" w:lineRule="auto"/>
-            </w:pPr>
-            <w:r>
-              <w:rPr>
-                <w:rFonts w:ascii="Pretendard" w:hAnsi="Pretendard" w:eastAsia="Pretendard"/>
-                <w:b w:val="0"/>
-                <w:i w:val="0"/>
-                <w:color w:val="000000"/>
-                <w:sz w:val="18"/>
-              </w:rPr>
-              <w:t>Live run outputs saved under outputs/live-runs; portal screenshots can be added if desired</w:t>
-            </w:r>
-          </w:p>
-        </w:tc>
-        <w:tc>
-          <w:tcPr>
-            <w:tcW w:type="dxa" w:w="1584"/>
-            <w:tcMar>
-              <w:top w:w="90" w:type="dxa"/>
-              <w:start w:w="120" w:type="dxa"/>
-              <w:bottom w:w="90" w:type="dxa"/>
-              <w:end w:w="120" w:type="dxa"/>
-            </w:tcMar>
-            <w:vAlign w:val="center"/>
-          </w:tcPr>
-          <w:p>
-            <w:pPr>
-              <w:spacing w:before="0" w:after="0" w:line="252" w:lineRule="auto"/>
-            </w:pPr>
-            <w:r>
-              <w:rPr>
-                <w:rFonts w:ascii="Pretendard" w:hAnsi="Pretendard" w:eastAsia="Pretendard"/>
-                <w:b w:val="0"/>
-                <w:i w:val="0"/>
-                <w:color w:val="000000"/>
-                <w:sz w:val="18"/>
-              </w:rPr>
-              <w:t>Complete via live artifacts</w:t>
-            </w:r>
-          </w:p>
-        </w:tc>
-      </w:tr>
-      <w:tr>
-        <w:tc>
-          <w:tcPr>
-            <w:tcW w:type="dxa" w:w="2880"/>
-            <w:tcMar>
-              <w:top w:w="90" w:type="dxa"/>
-              <w:start w:w="120" w:type="dxa"/>
-              <w:bottom w:w="90" w:type="dxa"/>
-              <w:end w:w="120" w:type="dxa"/>
-            </w:tcMar>
-            <w:vAlign w:val="center"/>
-          </w:tcPr>
-          <w:p>
-            <w:pPr>
-              <w:spacing w:before="0" w:after="0" w:line="252" w:lineRule="auto"/>
-            </w:pPr>
-            <w:r>
-              <w:rPr>
-                <w:rFonts w:ascii="Pretendard" w:hAnsi="Pretendard" w:eastAsia="Pretendard"/>
-                <w:b w:val="0"/>
-                <w:i w:val="0"/>
-                <w:color w:val="000000"/>
-                <w:sz w:val="18"/>
-              </w:rPr>
-              <w:t>Guardrails</w:t>
-            </w:r>
-          </w:p>
-        </w:tc>
-        <w:tc>
-          <w:tcPr>
-            <w:tcW w:type="dxa" w:w="4608"/>
-            <w:tcMar>
-              <w:top w:w="90" w:type="dxa"/>
-              <w:start w:w="120" w:type="dxa"/>
-              <w:bottom w:w="90" w:type="dxa"/>
-              <w:end w:w="120" w:type="dxa"/>
-            </w:tcMar>
-            <w:vAlign w:val="center"/>
-          </w:tcPr>
-          <w:p>
-            <w:pPr>
-              <w:spacing w:before="0" w:after="0" w:line="252" w:lineRule="auto"/>
-            </w:pPr>
-            <w:r>
-              <w:rPr>
-                <w:rFonts w:ascii="Pretendard" w:hAnsi="Pretendard" w:eastAsia="Pretendard"/>
-                <w:b w:val="0"/>
-                <w:i w:val="0"/>
-                <w:color w:val="000000"/>
-                <w:sz w:val="18"/>
-              </w:rPr>
-              <w:t>Microsoft.DefaultV2 deployment RAI policy + deterministic tool safeguards + portal custom-guardrail recommendation</w:t>
-            </w:r>
-          </w:p>
-        </w:tc>
-        <w:tc>
-          <w:tcPr>
-            <w:tcW w:type="dxa" w:w="1584"/>
-            <w:tcMar>
-              <w:top w:w="90" w:type="dxa"/>
-              <w:start w:w="120" w:type="dxa"/>
-              <w:bottom w:w="90" w:type="dxa"/>
-              <w:end w:w="120" w:type="dxa"/>
-            </w:tcMar>
-            <w:vAlign w:val="center"/>
-          </w:tcPr>
-          <w:p>
-            <w:pPr>
-              <w:spacing w:before="0" w:after="0" w:line="252" w:lineRule="auto"/>
-            </w:pPr>
-            <w:r>
-              <w:rPr>
-                <w:rFonts w:ascii="Pretendard" w:hAnsi="Pretendard" w:eastAsia="Pretendard"/>
-                <w:b w:val="0"/>
-                <w:i w:val="0"/>
-                <w:color w:val="000000"/>
-                <w:sz w:val="18"/>
-              </w:rPr>
-              <w:t>Complete for MVP</w:t>
-            </w:r>
-          </w:p>
-        </w:tc>
-      </w:tr>
-      <w:tr>
-        <w:tc>
-          <w:tcPr>
-            <w:tcW w:type="dxa" w:w="2880"/>
-            <w:tcMar>
-              <w:top w:w="90" w:type="dxa"/>
-              <w:start w:w="120" w:type="dxa"/>
-              <w:bottom w:w="90" w:type="dxa"/>
-              <w:end w:w="120" w:type="dxa"/>
-            </w:tcMar>
-            <w:vAlign w:val="center"/>
-          </w:tcPr>
-          <w:p>
-            <w:pPr>
-              <w:spacing w:before="0" w:after="0" w:line="252" w:lineRule="auto"/>
-            </w:pPr>
-            <w:r>
-              <w:rPr>
-                <w:rFonts w:ascii="Pretendard" w:hAnsi="Pretendard" w:eastAsia="Pretendard"/>
-                <w:b w:val="0"/>
-                <w:i w:val="0"/>
-                <w:color w:val="000000"/>
-                <w:sz w:val="18"/>
-              </w:rPr>
-              <w:t>Entra Agent ID governance</w:t>
-            </w:r>
-          </w:p>
-        </w:tc>
-        <w:tc>
-          <w:tcPr>
-            <w:tcW w:type="dxa" w:w="4608"/>
-            <w:tcMar>
-              <w:top w:w="90" w:type="dxa"/>
-              <w:start w:w="120" w:type="dxa"/>
-              <w:bottom w:w="90" w:type="dxa"/>
-              <w:end w:w="120" w:type="dxa"/>
-            </w:tcMar>
-            <w:vAlign w:val="center"/>
-          </w:tcPr>
-          <w:p>
-            <w:pPr>
-              <w:spacing w:before="0" w:after="0" w:line="252" w:lineRule="auto"/>
-            </w:pPr>
-            <w:r>
-              <w:rPr>
-                <w:rFonts w:ascii="Pretendard" w:hAnsi="Pretendard" w:eastAsia="Pretendard"/>
-                <w:b w:val="0"/>
-                <w:i w:val="0"/>
-                <w:color w:val="000000"/>
-                <w:sz w:val="18"/>
-              </w:rPr>
-              <w:t>Agent principal IDs documented</w:t>
-            </w:r>
-          </w:p>
-        </w:tc>
-        <w:tc>
-          <w:tcPr>
-            <w:tcW w:type="dxa" w:w="1584"/>
-            <w:tcMar>
-              <w:top w:w="90" w:type="dxa"/>
-              <w:start w:w="120" w:type="dxa"/>
-              <w:bottom w:w="90" w:type="dxa"/>
-              <w:end w:w="120" w:type="dxa"/>
-            </w:tcMar>
-            <w:vAlign w:val="center"/>
-          </w:tcPr>
-          <w:p>
-            <w:pPr>
-              <w:spacing w:before="0" w:after="0" w:line="252" w:lineRule="auto"/>
-            </w:pPr>
-            <w:r>
-              <w:rPr>
-                <w:rFonts w:ascii="Pretendard" w:hAnsi="Pretendard" w:eastAsia="Pretendard"/>
-                <w:b w:val="0"/>
-                <w:i w:val="0"/>
-                <w:color w:val="000000"/>
-                <w:sz w:val="18"/>
-              </w:rPr>
-              <w:t>Complete</w:t>
-            </w:r>
-          </w:p>
-        </w:tc>
-      </w:tr>
-    </w:tbl>
-    <w:p/>
     <w:sectPr>
       <w:headerReference w:type="default" r:id="rId9"/>
       <w:footerReference w:type="default" r:id="rId10"/>

</xml_diff>